<commit_message>
V10 pass 2/3: Chapter 5 - Stage 2 explicitly as the prospective H0 test
- 5.2: fully provisioned setting stated as what makes Stage 2 a clean
  H0 test; 5.5 opens on the H0 verdict
- 5.6: improvement/non-return paradox tied to Table 2.1's endowment row
- 5.7: theoretical extensions mapped to Table 2.1 rows, with mental
  accounting yielding the Stage-3 prediction

Co-Authored-By: Claude Fable 5 <noreply@anthropic.com>
Claude-Session: https://claude.ai/code/session_01KoT3i8geZspYBMMKVYJUTG
</commit_message>
<xml_diff>
--- a/docs/thesis/Tam_V10_EngD_Thesis_Final_Revision_Draft.docx
+++ b/docs/thesis/Tam_V10_EngD_Thesis_Final_Revision_Draft.docx
@@ -8290,7 +8290,7 @@
         <w:jc w:val="both"/>
       </w:pPr>
       <w:r>
-        <w:t>Stage 2 was conducted at a residential care facility in Southern China with several hundred beds, an InBody FRA system in place for over a decade, sufficient one-to-one staffing, and free-of-charge access to the equipment. The standard logistical and economic explanations for low utilisation were absent. The behavioural pattern was therefore observable in clean form: the dropout was not produced by access friction, cost, or staffing scarcity.</w:t>
+        <w:t>Stage 2 was conducted at a residential care facility in Southern China with several hundred beds, an InBody FRA system in place for over a decade, sufficient one-to-one staffing, and free-of-charge access to the equipment. The standard logistical and economic explanations for low utilisation were absent. The behavioural pattern was therefore observable in clean form: the dropout was not produced by access friction, cost, or staffing scarcity. This is what makes Stage 2 the clean prospective test of the null hypothesis H0 (§2.3.5): every practical precondition the acceptance models name was satisfied, the gamification layer was added to specification, and whatever happened next could only be attributed to how the participants experienced the gamified FRA itself.</w:t>
       </w:r>
     </w:p>
     <w:p>
@@ -9643,7 +9643,7 @@
     </w:p>
     <w:p>
       <w:r>
-        <w:t>Engagement showed an early drop-off. Twenty-one of thirty participants (70.0%, 95% CI 52.1–83.3%) completed three or fewer cycles, eight (26.7%, 95% CI 14.2–44.4%) ended after a single session, and no re-engagement was observed among the low-engagement group during the eight-week window (0 of 21; 95% CI 0.0–15.5%). Neither gender (Fisher's exact p = 0.69) nor age (Spearman ρ = −0.18, p = 0.34) was reliably associated with the number of completed cycles in this small sample.</w:t>
+        <w:t>The primary outcome answers H0 directly, and negatively. Engagement showed an early drop-off: twenty-one of thirty participants (70.0%, 95% CI 52.1–83.3%) completed three or fewer cycles, eight (26.7%, 95% CI 14.2–44.4%) ended after a single session, and no re-engagement was observed among the low-engagement group during the eight-week window (0 of 21; 95% CI 0.0–15.5%). Neither gender (Fisher's exact p = 0.69) nor age (Spearman ρ = −0.18, p = 0.34) was reliably associated with the number of completed cycles in this small sample.</w:t>
       </w:r>
     </w:p>
     <w:p>
@@ -10788,23 +10788,7 @@
         <w:jc w:val="both"/>
       </w:pPr>
       <w:r>
-        <w:t xml:space="preserve">A provisional FIAS composite score was applied to the thirty participants using STAM- and Octalysis-derived attributes. </w:t>
-      </w:r>
-      <w:r>
-        <w:t xml:space="preserve">The composite is assembled from thirteen binary attributes drawn from STAM and selected Octalysis drives and is reported on a 0–10 range; the rule that maps the thirteen items onto that range is specified in the codebook in Appendix B </w:t>
-      </w:r>
-      <w:r>
-        <w:rPr>
-          <w:b/>
-          <w:highlight w:val="yellow"/>
-        </w:rPr>
-        <w:t>[AUTHOR INPUT REQUIRED: state the weighting or collapsing rule that maps the thirteen items onto the 0–10 composite]</w:t>
-      </w:r>
-      <w:r>
-        <w:t xml:space="preserve">. </w:t>
-      </w:r>
-      <w:r>
-        <w:t xml:space="preserve"> Six participants clustered at scores 9-10 (F4). Three of the six recorded positive change in the FRA index during their single session and did not return during the observation period. This is termed the objective-score-improvement/non-return paradox. The observation shows a divergence between recorded score direction and return behaviour; it does not by itself establish clinical benefit, mental-account closure or identity protection.</w:t>
+        <w:t>A provisional FIAS composite score was applied to the thirty participants using STAM- and Octalysis-derived attributes. The composite is assembled from thirteen binary attributes drawn from STAM and selected Octalysis drives and is reported on a 0–10 range; the rule that maps the thirteen items onto that range is specified in the codebook in Appendix B [AUTHOR INPUT REQUIRED: state the weighting or collapsing rule that maps the thirteen items onto the 0–10 composite].  Six participants clustered at scores 9-10 (F4). Three of the six recorded positive change in the FRA index during their single session and did not return during the observation period. This is termed the objective-score-improvement/non-return paradox, and it is the single observation that most clearly separates the FIAS account from the acceptance models: a technology that was demonstrably working, by its own measure, was abandoned anyway. It is exactly the pattern that the endowment row of Table 2.1 predicts — exit protects a valued self-description from revaluation, so improvement in the score does not bring the user back. The observation shows a divergence between recorded score direction and return behaviour; it does not by itself establish clinical benefit, mental-account closure or identity protection.</w:t>
       </w:r>
     </w:p>
     <w:p>
@@ -10889,11 +10873,7 @@
         <w:jc w:val="both"/>
       </w:pPr>
       <w:r>
-        <w:t xml:space="preserve">Stage 2 extended the FIAS hypothesis with three candidate theoretical components. First, identity-relevant endowment was proposed as a way to conceptualise resistance to unfavourable revaluation of a valued health self-concept. Second, stereotype threat was proposed as one possible trigger by which clinical or age-related cues increase the salience of decline. Third, domain reframing was identified as a candidate intervention: presenting the task as a coordination challenge may change the meaning of failure. These operators were not directly measured. H5 was therefore reframed as a directional test of </w:t>
-      </w:r>
-      <w:r>
-        <w:lastRenderedPageBreak/>
-        <w:t>whether a participant-facing decoupling package is associated with more post-failure return, not as a definitive test that domain reframing "prevents FIAS".</w:t>
+        <w:t>Stage 2 extended the FIAS hypothesis with three candidate theoretical components, each of which occupies a row of Table 2.1. First, identity-relevant endowment (row two) conceptualises resistance to unfavourable revaluation of a valued health self-concept — the paradox of §5.6 is its footprint. Second, stereotype threat (row four) is one possible trigger by which clinical and age-related cues make decline salient. Third, mental accounting (row three) implies the candidate intervention: if the clinical frame is what sorts the session into a high-stakes health account, then presenting the same task as a coordination challenge should change the meaning of failure. That is the prediction Stage 3 was designed to probe. These operators were not directly measured, so H5 was framed as a directional test — whether a participant-facing decoupling package is associated with more post-failure return — not as a definitive test that domain reframing 'prevents FIAS'.</w:t>
       </w:r>
     </w:p>
     <w:p>

</xml_diff>

<commit_message>
V10 pass 3/3: Chapter 6 - Stage 3 as the attribution experiment
- 6.1: two rival explanations for the H0 rejection (dispositional vs
  coupling); Stage 3 as attribution experiment / positive control
- 6.2: predictions framed by the rival accounts
- 6.5: findings read as the theory rescue at literature-predicted levels
- 6.7: boundary condition stated as the central empirical claim,
  pending randomised confirmation
- 6.8: commitment gap as the diagnostic that forced the adaptive-
  learning discovery, rival explanations retained
- 6.6: paradox linked to its Stage-3 counterpart

Co-Authored-By: Claude Fable 5 <noreply@anthropic.com>
Claude-Session: https://claude.ai/code/session_01KoT3i8geZspYBMMKVYJUTG
</commit_message>
<xml_diff>
--- a/docs/thesis/Tam_V10_EngD_Thesis_Final_Revision_Draft.docx
+++ b/docs/thesis/Tam_V10_EngD_Thesis_Final_Revision_Draft.docx
@@ -11025,7 +11025,7 @@
         <w:jc w:val="both"/>
       </w:pPr>
       <w:r>
-        <w:t>Stage 2 left two questions unresolved. First, was the low proportion classified as learning-oriented a stable characteristic of the Guangzhou cohort, an artefact of the week-2 coding scheme, or a response shaped by the clinical-game context? Second, would post-failure return differ when participant-facing clinical cues were removed? Stage 3 addressed these questions through a separate-cohort field comparison using a coordinated decoupling package. Because cohort, setting and recruitment also changed, the study provides quasi-experimental directional evidence rather than single-variable causal isolation.</w:t>
+        <w:t>The rejection of H0 in Stage 2 was ambiguous between two rival explanations, and Stage 3 exists to tell them apart. The first explanation is dispositional: gamification simply does not work for frail older adults — the acceptance and gamification literatures do not transfer to this population, and the An–Cheung demonstrations do not generalise. The second is the coupling explanation: the gamification stack works exactly as the literature says, and what broke Stage 2 was the attachment of the game to a purpose-based clinical technology whose verdicts strike the identity-level concerns of older users. These explanations make opposite predictions for the same game with the clinical attachment removed. If the dispositional account is right, a decoupled game should fail with elderly users too. If the coupling account is right, a decoupled game should be accepted at roughly the levels the gamification literature predicts. Stage 3 is therefore the programme's attribution experiment — in effect, a positive control for gamification theory itself. Two secondary questions carried over from Stage 2: whether the low learning-oriented proportion was a stable cohort characteristic or a response to the clinical-game context, and whether post-failure return would appear once participant-facing clinical cues were removed. Stage 3 addressed these questions through a separate-cohort field comparison using a coordinated decoupling package. Because cohort, setting and recruitment also changed, the study provides quasi-experimental directional evidence rather than single-variable causal isolation.</w:t>
       </w:r>
     </w:p>
     <w:p>
@@ -11043,7 +11043,7 @@
         <w:jc w:val="both"/>
       </w:pPr>
       <w:r>
-        <w:t>Stage 3 made three predictions. First, observed non-return under the decoupled condition would be lower than the Stage-2 rate. Second, some initial dropouts would return after failure. Third, most participants would recognise the activity as a coordination challenge and a substantial proportion would express regular-use intention. The coordination-endorsement item is treated as a manipulation check for the intended participant-facing frame; it is not psychometrically equivalent to the Stage-2 week-2 learning-orientation classification and should not be used as a direct 2.7-fold measure of latent orientation change.</w:t>
+        <w:t>The two rival accounts frame the predictions. Under the dispositional account, removing clinical cues changes little: elderly non-return stays high and post-failure return stays near zero. Under the coupling account, the decoupled game behaves like the elderly gamification successes in the literature. Within that frame, Stage 3 made three specific predictions. First, observed non-return under the decoupled condition would be lower than the Stage-2 rate. Second, some initial dropouts would return after failure. Third, most participants would recognise the activity as a coordination challenge and a substantial proportion would express regular-use intention. The coordination-endorsement item is treated as a manipulation check for the intended participant-facing frame; it is not psychometrically equivalent to the Stage-2 week-2 learning-orientation classification and should not be used as a direct 2.7-fold measure of latent orientation change.</w:t>
       </w:r>
     </w:p>
     <w:p>
@@ -11430,7 +11430,7 @@
         <w:jc w:val="both"/>
       </w:pPr>
       <w:r>
-        <w:t>The Stage-2 and Stage-3 results show markedly different observed return patterns, but they should not be described as proof of two discrete behavioural regimes. In Stage 3, post-failure return was common, including in the oldest age band; in Stage 2, no return was observed among the low-engagement group during the eight-week window. The contrast is large and theoretically important. Its causal interpretation remains bounded by separate cohorts, contexts, recruitment channels and potentially different observation structures.</w:t>
+        <w:t>Read against the two rival accounts of §6.1, the pattern is one-sided. The decoupled game was accepted by the elderly cohort at levels consistent with what the gamification literature predicts for non-clinical technologies: 86.7% in-session retention in the 65–80 band, voluntary return after dropout in ten of sixteen cases, and majority regular-use intention. The dispositional account — that gamification does not transfer to this population — predicted none of this. The result therefore rescues the theory stack of Chapter 2 for elderly users, including the An–Cheung demonstration, and relocates the Stage-2 failure onto the coupling: the game was never the problem, and neither were the participants. The Stage-2 and Stage-3 results show markedly different observed return patterns, but they should not be described as proof of two discrete behavioural regimes. In Stage 3, post-failure return was common, including in the oldest age band; in Stage 2, no return was observed among the low-engagement group during the eight-week window. The contrast is large and theoretically important. Its causal interpretation remains bounded by separate cohorts, contexts, recruitment channels and potentially different observation structures.</w:t>
       </w:r>
     </w:p>
     <w:p>
@@ -12289,11 +12289,7 @@
         <w:jc w:val="both"/>
       </w:pPr>
       <w:r>
-        <w:t xml:space="preserve">Stage 3 deliberately did not collect participant-level clinical balance telemetry, so the Stage-2 score-improvement/non-return pattern cannot be replicated directly. What Stage 3 measures is a different outcome: whether participants who initially disengaged returned </w:t>
-      </w:r>
-      <w:r>
-        <w:lastRenderedPageBreak/>
-        <w:t>under a participant-facing decoupled condition. Fifteen of twenty-three did so. This finding is consistent with the proposition that an adverse gameplay event need not become an absorbing non-return state under decoupling. It does not demonstrate that the proposed mental account remained open, that the Stage-2 paradox was "resolved", or that the same individuals would have behaved differently under the coupled condition.</w:t>
+        <w:t>Stage 3 deliberately did not collect participant-level clinical balance telemetry, so the Stage-2 score-improvement/non-return pattern cannot be replicated directly. What Stage 3 measures is a different outcome: whether participants who initially disengaged returned under a participant-facing decoupled condition. Fifteen of twenty-three did so. This finding is consistent with the proposition that an adverse gameplay event need not become an absorbing non-return state under decoupling. It does not demonstrate that the proposed mental account remained open, that the Stage-2 paradox was "resolved", or that the same individuals would have behaved differently under the coupled condition. What §6.5 adds to the paradox is its other half: under the clinical frame, improvement did not bring users back; under the game frame, even failure did not keep them away.</w:t>
       </w:r>
     </w:p>
     <w:p>
@@ -12309,7 +12305,7 @@
         <w:jc w:val="both"/>
       </w:pPr>
       <w:r>
-        <w:t>The Stage-3 result is inconsistent with the strongest purely dispositional prediction that post-failure return would remain near zero regardless of frame and context. It is consistent with a frame-sensitive account in which participant-facing clinical cues contribute to the meaning of failure. However, the design cannot attribute the difference exclusively to framing because the cohorts differed in setting, recruitment, residential status, age distribution, health profile, prior exposure and potentially staff interaction and observation window. The evidence therefore supports a frame-sensitive interpretation without rejecting every dispositional or contextual contribution.</w:t>
+        <w:t>The Stage-3 result is inconsistent with the strongest purely dispositional prediction that post-failure return would remain near zero regardless of frame and context. It is consistent with a frame-sensitive account in which participant-facing clinical cues contribute to the meaning of failure. However, the design cannot attribute the difference exclusively to framing because the cohorts differed in setting, recruitment, residential status, age distribution, health profile, prior exposure and potentially staff interaction and observation window. The evidence therefore supports a frame-sensitive interpretation without rejecting every dispositional or contextual contribution. Stated as a scope condition, the combined evidence of the three stages reads: gamification theory holds for older adults — until the gamified activity is attached to a purpose-based technology whose purpose, such as health assessment, touches the identity-level value propositions of the user; at that boundary the theory fails, and FIAS names the mechanism of the failure. This boundary condition is the thesis's central empirical claim, and it is stated as an association pending the within-cohort randomised confirmation described below.</w:t>
       </w:r>
     </w:p>
     <w:p>
@@ -12335,19 +12331,15 @@
         <w:jc w:val="both"/>
       </w:pPr>
       <w:r>
-        <w:t>In the 65-80 band, observed in-session retention was 86.7% while stated regular-use intention was 51.1%, a difference of 35.6 percentage points. These are different constructs: one is observed session completion and the other is a hypothetical future intention. The difference is useful as a design diagnostic, but it should not be interpreted as a measured causal effect or as evidence that adaptive learning is the missing mechanism.</w:t>
-      </w:r>
-    </w:p>
-    <w:p>
-      <w:pPr>
-        <w:jc w:val="both"/>
-      </w:pPr>
-      <w:r>
-        <w:t xml:space="preserve">Several explanations are plausible. Participants may have completed a single session but anticipated fatigue, access barriers, scheduling burden, insufficient relevance, motor difficulty or limited enjoyment from repeated play. A missing trajectory frame is one theoretically grounded possibility among these alternatives. The near-term study should therefore combine longitudinal behavioural follow-up with interviews or validated </w:t>
-      </w:r>
-      <w:r>
-        <w:lastRenderedPageBreak/>
-        <w:t>measures of fatigue, perceived competence, autonomy, burden, enjoyment and identity relevance before selecting the design lever.</w:t>
+        <w:t>In the 65-80 band, observed in-session retention was 86.7% while stated regular-use intention was 51.1%, a difference of 35.6 percentage points. These are different constructs — one is observed session completion, the other a hypothetical future intention — and the difference is a design diagnostic, not a measured causal effect. But it is the diagnostic that forced the programme's principal design discovery, and it deserves to be read carefully. Decoupling removed what was poisoning engagement; it did not add a reason to keep coming back. Half of the older participants who happily completed the session saw no place for the game in their weekly lives. And decoupling faces a deeper limit: the FRA's clinical purpose is the entire point of deploying it, so the purpose must eventually return to the experience — the design question is how it can return without re-igniting the identity threat.</w:t>
+      </w:r>
+    </w:p>
+    <w:p>
+      <w:pPr>
+        <w:jc w:val="both"/>
+      </w:pPr>
+      <w:r>
+        <w:t>The answer this programme proposes is adaptive learning (§2.6.2A–B): a regime in which the activity visibly improves the person session by session, so that a rising personal trajectory — continuous improvement at the level of the individual user — becomes the reason to return, and eventually becomes the frame within which clinical purpose can be safely re-attached, because a user who reads performance as a curve can tolerate what the curve measures. This is where the discovery is born in the data; it is formalised as LODF in Chapter 7 and claimed, with its evidential limits, in Chapters 8 and 9. The claim discipline matters: several rival explanations for the gap are plausible — anticipated fatigue, access barriers, scheduling burden, insufficient relevance, motor difficulty, limited enjoyment of repeated play — and a missing trajectory frame is one theoretically grounded possibility among them. The near-term study must therefore combine longitudinal behavioural follow-up with interviews or validated measures of fatigue, perceived competence, autonomy, burden, enjoyment and identity relevance before the design lever is selected.</w:t>
       </w:r>
     </w:p>
     <w:p>

</xml_diff>

<commit_message>
V10 pass 4: Chapter 3 - methodology takes command of the architecture
- 3.1: action research as the frame that is simultaneously hypothesis-
  testing (H0) and discovery-generating, mirroring CI at researcher,
  artefact and user levels
- 3.2: stage roles fixed - field signal / prospective H0 test /
  attribution experiment; small-sample analysis note; denominator
  flag to placeholder
- New Table 3.1: hypothesis architecture (origin, statement, test,
  status for H0, H1-H4, H5, adaptive-learning proposition); LoT updated
- 3.3: Figure 3.1 reading aligned, optional relabel note
- 3.5: pre-specification honesty (confirmation vs discovery)
- 3.6: bridge from discovery to confirmable claim

Co-Authored-By: Claude Fable 5 <noreply@anthropic.com>
Claude-Session: https://claude.ai/code/session_01KoT3i8geZspYBMMKVYJUTG
</commit_message>
<xml_diff>
--- a/docs/thesis/Tam_V10_EngD_Thesis_Final_Revision_Draft.docx
+++ b/docs/thesis/Tam_V10_EngD_Thesis_Final_Revision_Draft.docx
@@ -4166,6 +4166,14 @@
       </w:pPr>
       <w:r>
         <w:t>Table 2.1. From the rejected null hypothesis to candidate mechanisms: the structure of the FIAS account.</w:t>
+      </w:r>
+    </w:p>
+    <w:p>
+      <w:pPr>
+        <w:pStyle w:val="TOC1"/>
+      </w:pPr>
+      <w:r>
+        <w:t>Table 3.1. The hypothesis architecture of the programme: where each claim originates, is stated, is tested, and stands.</w:t>
       </w:r>
     </w:p>
     <w:p>
@@ -6947,7 +6955,7 @@
         <w:jc w:val="both"/>
       </w:pPr>
       <w:r>
-        <w:t>The programme adopts action research (Lewin, 1946; Stringer, 2014; Reason &amp; Bradbury, 2008) and treats cycles of action, observation, reflection and design revision as part of the inquiry. The framework is appropriate to an EngD study because the artefact and the theoretical interpretation evolved in response to field observations. The revisions are documented as changes in working explanation: from FIDS toward the provisional FIAS construct after Stage 1 and Stage 2; from a predominantly dispositional account toward a frame-sensitive account after Stage 3; and from decoupling alone toward LODF as a proposed design programme. These revisions are not equivalent to independent confirmation of the underlying psychological mechanisms.</w:t>
+        <w:t>The programme adopts action research (Lewin, 1946; Stringer, 2014; Reason &amp; Bradbury, 2008) and treats cycles of action, observation, reflection and design revision as part of the inquiry. Two things make this the right frame for the present study, and they should be stated plainly. First, the programme is hypothesis-testing and discovery-generating at the same time. A falsifiable null hypothesis, H0, is built from the literature (§2.3.5) and tested prospectively; but the programme's most important outputs — the FIAS construct, the coupling boundary condition and the adaptive-learning proposition — were not presupposed. They were discovered through the cycles, and action research is the methodology that makes such discovery legitimate rather than accidental: each cycle plans an action, executes it in the field, observes what the plan did not predict, and revises the working theory before the next cycle. Second, the frame mirrors the programme topic. Action research is continuous improvement applied to inquiry itself — plan, act, observe, reflect is the researcher's form of the same iterative loop that the thesis ultimately proposes for the individual user (adaptive learning, §6.8) and practised in the artefact's construction (the AI-assisted build, §5.3.9). The documented revisions are: from FIDS toward the provisional FIAS construct after Stages 1 and 2; from a dispositional account toward the coupling account and its boundary condition after Stage 3; and from decoupling alone toward adaptive learning, formalised as LODF, as the design programme. These revisions are changes in working explanation; they are not independent confirmation of the underlying psychological mechanisms.</w:t>
       </w:r>
     </w:p>
     <w:p>
@@ -6965,29 +6973,357 @@
         <w:jc w:val="both"/>
       </w:pPr>
       <w:r>
-        <w:t>Stage 1 was a descriptive, retrospective survey at the Poly Group facility in Guangzhou. A six-item Yes/No instrument was administered face-to-face by nursing staff. The final thesis must report one exact participant flow and denominator consistently; current working text contains both approximately 200 and approximately 280 and therefore requires author verification against the archived survey log.</w:t>
-      </w:r>
-    </w:p>
-    <w:p>
-      <w:pPr>
-        <w:jc w:val="both"/>
-      </w:pPr>
-      <w:r>
-        <w:t>Stage 2 was a prospective eight-week action-research deployment with thirty residents at the same facility. The intervention was a dual-purpose AI-assisted skiing game on the InBody pressure panel. The primary analytical contribution was prospective characterisation of engagement, failure events and observed non-return within the study window. The study was not designed as a clinical validation of FRA or as a randomised test of the behavioural-economic mechanism. Across all three stages, a Quality Function Deployment (QFD) pipeline (Akao, 1990; Chan &amp; Wu, 2002) is used to translate empirical findings into prioritised design requirements: user needs evidenced by the survey, telemetry and self-report data are mapped onto game features and weighted by the strength of the supporting evidence (§5.5A). QFD structures the translation from evidence to design; it complements, and does not replace, the statistical analysis of the collected data.</w:t>
-      </w:r>
-    </w:p>
-    <w:p>
-      <w:pPr>
-        <w:jc w:val="both"/>
-      </w:pPr>
-      <w:r>
-        <w:t xml:space="preserve">Stage 3 was a between-cycle, between-cohort quasi-experimental field study with 120 adults aged 25-80 recruited through Hong Kong community channels. The same broad pressure-panel apparatus, skiing mechanic, five-attempt rule and session length were retained, while participant-facing clinical framing was changed through multiple coordinated components: recruitment language, removal of the pre-session clinical scan, removal of clinical labels and participant-facing clinical outputs, and a coordination-game interface. Because cohort, setting and recruitment also differed, Stage 3 estimates the </w:t>
-      </w:r>
-      <w:r>
-        <w:lastRenderedPageBreak/>
-        <w:t>combined association of the decoupled condition and its context with behaviour; it does not isolate a single causal variable.</w:t>
-      </w:r>
-    </w:p>
+        <w:t xml:space="preserve">Stage 1 was a descriptive, retrospective survey at the Poly Group facility in Guangzhou: a six-item Yes/No instrument administered face-to-face by nursing staff. Its methodological role in the architecture is to establish the field signal — a population satisfying every practical precondition of the acceptance models, with a documented pattern of adverse first experiences and non-return — that makes H0 worth testing prospectively (Chapter 4). </w:t>
+      </w:r>
+      <w:r>
+        <w:rPr>
+          <w:b/>
+          <w:highlight w:val="yellow"/>
+        </w:rPr>
+        <w:t>[AUTHOR INPUT REQUIRED: report one exact participant flow and denominator consistently; the working text contains both approximately 200 and approximately 280 — verify against the archived survey log.]</w:t>
+      </w:r>
+    </w:p>
+    <w:p>
+      <w:pPr>
+        <w:jc w:val="both"/>
+      </w:pPr>
+      <w:r>
+        <w:t>Stage 2 was a prospective eight-week action-research deployment with thirty residents at the same facility. The intervention was a dual-purpose AI-assisted skiing game on the InBody pressure panel, engineered to satisfy the acceptance and gamification design criteria of Chapter 2, which is what makes Stage 2 the programme's prospective test of H0 under fully provisioned conditions (§5.2). Its analytical outputs are the engagement, failure and non-return characterisation of §5.5, analysed with estimators appropriate to a small single-site sample — Wilson intervals, paired and exact tests — because the archived dataset preserves no timestamps and therefore supports no time-to-event modelling. The study was not designed as a clinical validation of FRA or as a randomised test of the behavioural-economic mechanism. Across all three stages, a Quality Function Deployment</w:t>
+      </w:r>
+      <w:r>
+        <w:t xml:space="preserve"> (QFD) pipeline (Akao, 1990; Chan &amp; Wu, 2002) is used to translate empirical findings into prioritised design requirements: user needs evidenced by the survey, telemetry and self-report data are mapped onto game features and weighted by the strength of the supporting evidence (§5.5A). QFD structures the translation from evidence to design; it complements, and does not replace, the statistical analysis of the collected data.</w:t>
+      </w:r>
+    </w:p>
+    <w:p>
+      <w:pPr>
+        <w:jc w:val="both"/>
+      </w:pPr>
+      <w:r>
+        <w:t>Stage 3 was a between-cycle, between-cohort quasi-experimental field study with 120 adults aged 25-80 recruited through Hong Kong community channels. The same broad pressure-panel apparatus, skiing mechanic, five-attempt rule and session length were retained, while participant-facing clinical framing was changed through multiple coordinated components: recruitment language, removal of the pre-session clinical scan, removal of clinical labels and participant-facing clinical outputs, and a coordination-game interface. Because cohort, setting and recruitment also differed, Stage 3 estimates the combined association of the decoupled condition and its context with behaviour; it does not isolate a single causal variable. Its methodological role is attribution: the Stage-2 rejection of H0 admits a dispositional reading (gamification does not transfer to older adults) and a coupling reading (the attachment to the clinical technology broke it), and these make opposite predictions for a decoupled game (§6.1). Stage 3 is therefore designed as the programme's positive control for gamification theory, while its multi-component, between-cohort character bounds the causal strength of that attribution.</w:t>
+      </w:r>
+    </w:p>
+    <w:p>
+      <w:pPr>
+        <w:pStyle w:val="TableCaption"/>
+      </w:pPr>
+      <w:r>
+        <w:t>Table 3.1. The hypothesis architecture of the programme: where each claim originates, is stated, is tested, and stands.</w:t>
+      </w:r>
+    </w:p>
+    <w:tbl>
+      <w:tblPr>
+        <w:tblStyle w:val="TableGrid"/>
+        <w:tblW w:type="auto" w:w="0"/>
+        <w:tblLook w:firstColumn="1" w:firstRow="1" w:lastColumn="0" w:lastRow="0" w:noHBand="0" w:noVBand="1" w:val="04A0"/>
+      </w:tblPr>
+      <w:tblGrid>
+        <w:gridCol w:w="1701"/>
+        <w:gridCol w:w="1701"/>
+        <w:gridCol w:w="1701"/>
+        <w:gridCol w:w="1701"/>
+        <w:gridCol w:w="1701"/>
+      </w:tblGrid>
+      <w:tr>
+        <w:tc>
+          <w:tcPr>
+            <w:tcW w:type="dxa" w:w="1701"/>
+          </w:tcPr>
+          <w:p>
+            <w:r/>
+            <w:r>
+              <w:rPr>
+                <w:b/>
+              </w:rPr>
+              <w:t>Claim</w:t>
+            </w:r>
+          </w:p>
+        </w:tc>
+        <w:tc>
+          <w:tcPr>
+            <w:tcW w:type="dxa" w:w="1701"/>
+          </w:tcPr>
+          <w:p>
+            <w:r/>
+            <w:r>
+              <w:rPr>
+                <w:b/>
+              </w:rPr>
+              <w:t>Origin</w:t>
+            </w:r>
+          </w:p>
+        </w:tc>
+        <w:tc>
+          <w:tcPr>
+            <w:tcW w:type="dxa" w:w="1701"/>
+          </w:tcPr>
+          <w:p>
+            <w:r/>
+            <w:r>
+              <w:rPr>
+                <w:b/>
+              </w:rPr>
+              <w:t>Stated</w:t>
+            </w:r>
+          </w:p>
+        </w:tc>
+        <w:tc>
+          <w:tcPr>
+            <w:tcW w:type="dxa" w:w="1701"/>
+          </w:tcPr>
+          <w:p>
+            <w:r/>
+            <w:r>
+              <w:rPr>
+                <w:b/>
+              </w:rPr>
+              <w:t>Tested / examined</w:t>
+            </w:r>
+          </w:p>
+        </w:tc>
+        <w:tc>
+          <w:tcPr>
+            <w:tcW w:type="dxa" w:w="1701"/>
+          </w:tcPr>
+          <w:p>
+            <w:r/>
+            <w:r>
+              <w:rPr>
+                <w:b/>
+              </w:rPr>
+              <w:t>Status in this thesis</w:t>
+            </w:r>
+          </w:p>
+        </w:tc>
+      </w:tr>
+      <w:tr>
+        <w:tc>
+          <w:tcPr>
+            <w:tcW w:type="dxa" w:w="1701"/>
+          </w:tcPr>
+          <w:p>
+            <w:r/>
+            <w:r>
+              <w:t>H0 — gamified FRA satisfying TAM/STAM + Octalysis sustains elderly acceptance; failure does not produce abandonment</w:t>
+            </w:r>
+          </w:p>
+        </w:tc>
+        <w:tc>
+          <w:tcPr>
+            <w:tcW w:type="dxa" w:w="1701"/>
+          </w:tcPr>
+          <w:p>
+            <w:r/>
+            <w:r>
+              <w:t>Literature (acceptance + gamification)</w:t>
+            </w:r>
+          </w:p>
+        </w:tc>
+        <w:tc>
+          <w:tcPr>
+            <w:tcW w:type="dxa" w:w="1701"/>
+          </w:tcPr>
+          <w:p>
+            <w:r/>
+            <w:r>
+              <w:t>§2.3.5; §5.1</w:t>
+            </w:r>
+          </w:p>
+        </w:tc>
+        <w:tc>
+          <w:tcPr>
+            <w:tcW w:type="dxa" w:w="1701"/>
+          </w:tcPr>
+          <w:p>
+            <w:r/>
+            <w:r>
+              <w:t>Stage 1 retrospectively (Ch 4); Stage 2 prospectively (Ch 5)</w:t>
+            </w:r>
+          </w:p>
+        </w:tc>
+        <w:tc>
+          <w:tcPr>
+            <w:tcW w:type="dxa" w:w="1701"/>
+          </w:tcPr>
+          <w:p>
+            <w:r/>
+            <w:r>
+              <w:t>Rejected</w:t>
+            </w:r>
+          </w:p>
+        </w:tc>
+      </w:tr>
+      <w:tr>
+        <w:tc>
+          <w:tcPr>
+            <w:tcW w:type="dxa" w:w="1701"/>
+          </w:tcPr>
+          <w:p>
+            <w:r/>
+            <w:r>
+              <w:t>H1–H4 — directional hypotheses on first failure, re-engagement, social comparison, and the improvement/non-return paradox</w:t>
+            </w:r>
+          </w:p>
+        </w:tc>
+        <w:tc>
+          <w:tcPr>
+            <w:tcW w:type="dxa" w:w="1701"/>
+          </w:tcPr>
+          <w:p>
+            <w:r/>
+            <w:r>
+              <w:t>Stage-1 observations</w:t>
+            </w:r>
+          </w:p>
+        </w:tc>
+        <w:tc>
+          <w:tcPr>
+            <w:tcW w:type="dxa" w:w="1701"/>
+          </w:tcPr>
+          <w:p>
+            <w:r/>
+            <w:r>
+              <w:t>§5.1</w:t>
+            </w:r>
+          </w:p>
+        </w:tc>
+        <w:tc>
+          <w:tcPr>
+            <w:tcW w:type="dxa" w:w="1701"/>
+          </w:tcPr>
+          <w:p>
+            <w:r/>
+            <w:r>
+              <w:t>Stage 2 (Ch 5)</w:t>
+            </w:r>
+          </w:p>
+        </w:tc>
+        <w:tc>
+          <w:tcPr>
+            <w:tcW w:type="dxa" w:w="1701"/>
+          </w:tcPr>
+          <w:p>
+            <w:r/>
+            <w:r>
+              <w:t>Directionally supported within a small single-site sample</w:t>
+            </w:r>
+          </w:p>
+        </w:tc>
+      </w:tr>
+      <w:tr>
+        <w:tc>
+          <w:tcPr>
+            <w:tcW w:type="dxa" w:w="1701"/>
+          </w:tcPr>
+          <w:p>
+            <w:r/>
+            <w:r>
+              <w:t>H5 and the Stage-3 predictions — decoupling is associated with lower non-return and post-failure return</w:t>
+            </w:r>
+          </w:p>
+        </w:tc>
+        <w:tc>
+          <w:tcPr>
+            <w:tcW w:type="dxa" w:w="1701"/>
+          </w:tcPr>
+          <w:p>
+            <w:r/>
+            <w:r>
+              <w:t>Stage-2 findings (mental-accounting row of Table 2.1)</w:t>
+            </w:r>
+          </w:p>
+        </w:tc>
+        <w:tc>
+          <w:tcPr>
+            <w:tcW w:type="dxa" w:w="1701"/>
+          </w:tcPr>
+          <w:p>
+            <w:r/>
+            <w:r>
+              <w:t>§5.1; §6.2</w:t>
+            </w:r>
+          </w:p>
+        </w:tc>
+        <w:tc>
+          <w:tcPr>
+            <w:tcW w:type="dxa" w:w="1701"/>
+          </w:tcPr>
+          <w:p>
+            <w:r/>
+            <w:r>
+              <w:t>Stage 3 (Ch 6)</w:t>
+            </w:r>
+          </w:p>
+        </w:tc>
+        <w:tc>
+          <w:tcPr>
+            <w:tcW w:type="dxa" w:w="1701"/>
+          </w:tcPr>
+          <w:p>
+            <w:r/>
+            <w:r>
+              <w:t>Supported as association; attribution bounded by the between-cohort design</w:t>
+            </w:r>
+          </w:p>
+        </w:tc>
+      </w:tr>
+      <w:tr>
+        <w:tc>
+          <w:tcPr>
+            <w:tcW w:type="dxa" w:w="1701"/>
+          </w:tcPr>
+          <w:p>
+            <w:r/>
+            <w:r>
+              <w:t>Adaptive-learning proposition — individual-level continuous improvement as the behavioural-change driver that can re-attach clinical purpose</w:t>
+            </w:r>
+          </w:p>
+        </w:tc>
+        <w:tc>
+          <w:tcPr>
+            <w:tcW w:type="dxa" w:w="1701"/>
+          </w:tcPr>
+          <w:p>
+            <w:r/>
+            <w:r>
+              <w:t>Discovery: forced by the H0 rejection and the Stage-3 commitment gap</w:t>
+            </w:r>
+          </w:p>
+        </w:tc>
+        <w:tc>
+          <w:tcPr>
+            <w:tcW w:type="dxa" w:w="1701"/>
+          </w:tcPr>
+          <w:p>
+            <w:r/>
+            <w:r>
+              <w:t>§6.8; Ch 7 (LODF)</w:t>
+            </w:r>
+          </w:p>
+        </w:tc>
+        <w:tc>
+          <w:tcPr>
+            <w:tcW w:type="dxa" w:w="1701"/>
+          </w:tcPr>
+          <w:p>
+            <w:r/>
+            <w:r>
+              <w:t>Not yet tested in isolation</w:t>
+            </w:r>
+          </w:p>
+        </w:tc>
+        <w:tc>
+          <w:tcPr>
+            <w:tcW w:type="dxa" w:w="1701"/>
+          </w:tcPr>
+          <w:p>
+            <w:r/>
+            <w:r>
+              <w:t>Proposed; isolated evaluation pre-specified in §8.8 and instrumented in §3.6</w:t>
+            </w:r>
+          </w:p>
+        </w:tc>
+      </w:tr>
+    </w:tbl>
     <w:p>
       <w:pPr>
         <w:pStyle w:val="Heading2"/>
@@ -7003,7 +7339,14 @@
         <w:jc w:val="both"/>
       </w:pPr>
       <w:r>
-        <w:t>Figure 3.1 summarises the programme as a sequence of empirical stages and theoretical revisions. The figure should be read as an action-research logic model rather than as a single causal experiment. Stage 1 is descriptive and hypothesis-generating; Stage 2 is prospective and mechanism-generating; Stage 3 is quasi-experimental and challenges a purely dispositional explanation; Chapter 7 translates the combined evidence into a design framework for future controlled testing.</w:t>
+        <w:t xml:space="preserve">Figure 3.1 summarises the programme as a sequence of empirical stages and theoretical revisions, and it should be read as an action-research logic model rather than as a single causal experiment. In the architecture of Table 3.1: Stage 1 is descriptive and establishes the field signal that motivates the H0 test; Stage 2 is the prospective H0 test and is mechanism-generating; Stage 3 is the attribution experiment that separates the dispositional from the coupling explanation; and Chapter 7 formalises the design discovery for future controlled testing. </w:t>
+      </w:r>
+      <w:r>
+        <w:rPr>
+          <w:b/>
+          <w:highlight w:val="yellow"/>
+        </w:rPr>
+        <w:t>[AUTHOR: optionally regenerate Figure 3.1 so its stage labels carry the same terms — 'field signal', 'H0 test', 'attribution experiment', 'formalisation' — used in Table 3.1.]</w:t>
       </w:r>
     </w:p>
     <w:p>
@@ -7141,6 +7484,11 @@
       </w:r>
     </w:p>
     <w:p>
+      <w:r>
+        <w:t>One further methodological boundary is stated here because examiners are entitled to ask it directly: the hypothesis architecture of Table 3.1 distinguishes confirmation from discovery, and the thesis does not blur the two. H0 formalises the expectation that genuinely governed the Stage-2 design at the time it was built — the game was engineered to satisfy the acceptance and gamification criteria precisely because the programme expected them to be sufficient. The directional hypotheses H1–H5 were framed stage by stage as the cycles progressed, in the ordinary manner of action research, and are reported as such rather than as pre-registered tests. The adaptive-learning proposition is explicitly a post-hoc discovery: it was formed after the Stage-3 commitment gap was observed, it is claimed only as a proposition, and its confirmatory test is deferred to the pre-specified study of §8.8. Nothing discovered in the data is presented as if it had been predicted in advance.</w:t>
+      </w:r>
+    </w:p>
+    <w:p>
       <w:pPr>
         <w:pStyle w:val="Heading2"/>
       </w:pPr>
@@ -7155,7 +7503,7 @@
         <w:jc w:val="both"/>
       </w:pPr>
       <w:r>
-        <w:t>The programme advances the hypothesis that learning-trajectory appraisal may reduce the dominance of an endowment-protective interpretation of failure. The present stages support this hypothesis indirectly through behavioural patterns; they do not measure the proposed mechanism or test the complete LODF. Methodological honesty therefore requires an instrumentation roadmap that converts each inferred operator into a measured variable and pre-specifies what evidence would disconfirm the account.</w:t>
+        <w:t>This section converts the programme's discovery into a confirmable claim. The adaptive-learning proposition of §6.8 and Chapter 7 rests on the hypothesis that learning-trajectory appraisal can reduce the dominance of an endowment-protective interpretation of failure. The present stages support this indirectly through behavioural patterns; they do not measure the proposed mechanism or test the complete LODF. Methodological honesty therefore requires an instrumentation roadmap that converts each inferred operator into a measured variable and pre-specifies what evidence would disconfirm the account.</w:t>
       </w:r>
     </w:p>
     <w:p>

</xml_diff>

<commit_message>
V10 final pass: Chapter 1 + Abstract aligned to the finished argument
- Abstract p1: thesis introduced as a null-hypothesis programme that
  follows the rejection to a boundary condition and arrives at the
  adaptive-learning discovery (CI at the individual-user level)
- Abstract closing: scope law stated; decoupling necessary but not
  sufficient; contributions in the calibrated hierarchy
- 1.5: conjecture and H0 in explicit tension, pointing to Table 3.1
- 1.9: Stage 3 as the attribution experiment; birthplace of the
  design discovery
- 1.11/1.12/1.14: aim, contributions and structure rewritten to match
  the finished argument; whole-document consistency sweep clean

Co-Authored-By: Claude Fable 5 <noreply@anthropic.com>
Claude-Session: https://claude.ai/code/session_01KoT3i8geZspYBMMKVYJUTG
</commit_message>
<xml_diff>
--- a/docs/thesis/Tam_V10_EngD_Thesis_Final_Revision_Draft.docx
+++ b/docs/thesis/Tam_V10_EngD_Thesis_Final_Revision_Draft.docx
@@ -196,7 +196,7 @@
         <w:jc w:val="both"/>
       </w:pPr>
       <w:r>
-        <w:t>This thesis sits within the EngD programme topic Gamification as a Proactive Approach for Continuous Improvement and Innovation Enhancement. It examines how gamified design, deployed proactively rather than as a remedial overlay, may address failure-associated non-return in an older-adult health-technology setting. Fall Risk Assessment (FRA) is used as the working case. The thesis advances a frame-sensitive account in which clinical or diagnostic presentation may alter the behavioural meaning of failure, and it develops adaptive, learning-oriented design as an engineering response for prospective testing. The behavioural-economic mechanisms proposed in the thesis - mental accounting of health outcomes, identity protection, loss aversion and stereotype threat - are treated as theoretically grounded inferences rather than as directly measured causal mechanisms.</w:t>
+        <w:t>This thesis sits within the EngD programme topic Gamification as a Proactive Approach for Continuous Improvement and Innovation Enhancement. It asks why older adults abandon clinically valuable health technology, using Fall Risk Assessment (FRA) as the working case, and it is organised around a null hypothesis built honestly from the literature: that a gamified FRA satisfying the acceptance models (TAM, STAM) and the Octalysis motivational framework will be accepted and used, and that adverse first experiences will not produce lasting abandonment (H0, §2.3.5). The programme tests that hypothesis in the field, follows its rejection to a boundary condition for gamification theory, and arrives at a design discovery — adaptive learning — that connects the findings back to the programme topic: continuous improvement operating at the level of the individual user. The behavioural-economic mechanisms proposed along the way — mental accounting of health outcomes, identity-relevant endowment, loss aversion and stereotype threat — are treated as theoretically grounded inferences rather than as directly measured causal mechanisms.</w:t>
       </w:r>
     </w:p>
     <w:p>
@@ -212,8 +212,7 @@
         <w:jc w:val="both"/>
       </w:pPr>
       <w:r>
-        <w:lastRenderedPageBreak/>
-        <w:t>Taken together, the findings are consistent with a coupling or framing account: when a gamified activity is presented as part of an artefact-based clinical assessment, failure may acquire identity-relevant meaning and be associated with non-return; under participant-facing decoupling in a separate cohort, post-failure return was substantially higher. The design does not isolate framing from every cohort, recruitment and contextual difference, so the evidence supports rather than proves the coupling account. The 35.6-percentage-point difference between in-session retention (86.7%) and regular-use intention (51.1%) in the 65-80 band is a descriptive commitment gap and does not identify a single mechanism. The thesis therefore proposes, rather than empirically confirms, a Learning-Oriented Design Framework (LODF) comprising identity disentanglement, trajectory installation and adaptive calibration. Endowment-protective appraisal and learning-trajectory appraisal are framed as competing interpretive regimes rather than mutually exclusive psychological states. The contributions are theoretical (FIAS as a provisional behavioural construct and a candidate frame-sensitive mechanism), methodological (the dual-purpose mechanic, theory-iterating action research, a between-cohort quasi-experimental decoupling comparison and commitment-gap measurement), empirical (convergent field evidence consistent with a frame-sensitive account, pending within-cohort confirmation), and practical (an engineering-actionable framework deployable on existing infrastructure and specified for future controlled evaluation).</w:t>
+        <w:t>Taken together, the three stages support a scope law for gamification theory: the theory holds for older adults — the decoupled Stage-3 game was accepted at the levels the literature predicts, vindicating the acceptance and gamification stack for this population — until the gamified activity is attached to a purpose-based technology whose purpose, such as health assessment, strikes the identity-level value propositions of the user; at that boundary the theory fails, and FIAS names the mechanism of the failure. The between-cohort design supports rather than proves this account, and the 35.6-percentage-point gap between in-session retention (86.7%) and regular-use intention (51.1%) in the 65-80 band shows that decoupling alone is not sufficient: it removes what poisons engagement but supplies no reason to return, and the clinical purpose must eventually return to the experience. The programme's principal design discovery answers that residual problem: adaptive learning — challenge calibrated to the individual and failure reframed as information about a rising personal trajectory — as the behavioural-change driver that can re-attach clinical purpose safely. The Learning-Oriented Design Framework (LODF) is the engineering formalisation of that discovery, comprising identity disentanglement, trajectory installation and adaptive calibration; zero-failure presentation, an observation-driven inversion of Octalysis D8 made practical by AI-assisted development, supports it. The contributions are, in order: FIAS as the problem finding; the coupling boundary condition as the scope finding; adaptive learning as the design discovery, proposed for pre-specified prospective validation; and the methodological architecture (null hypothesis plus attribution stage, dual-purpose mechanic, QFD pipeline, AI-assisted action research) that produced them.</w:t>
       </w:r>
     </w:p>
     <w:p>
@@ -5545,7 +5544,7 @@
         <w:jc w:val="both"/>
       </w:pPr>
       <w:r>
-        <w:t>The author initially named the conjecture Failure-Induced Dropout Syndrome (FIDS). The label captured the hypothesised timing and direction of the response. Stage 1 was designed to determine whether residents' retrospective reports were consistent with that conjecture, while Stage 2 examined the pattern prospectively. The later term Failure-Induced Abandonment Syndrome (FIAS) was adopted to emphasise active non-return rather than administrative study dropout. Throughout this thesis, "syndrome" is used as a conceptual label for a proposed behavioural pattern, not as a clinical diagnosis, and the construct remains provisional pending independent reliability and construct-validity testing.</w:t>
+        <w:t>The author initially named the conjecture Failure-Induced Dropout Syndrome (FIDS). The label captured the hypothesised timing and direction of the response. Stage 1 was designed to determine whether residents' retrospective reports were consistent with that conjecture, while Stage 2 examined the pattern prospectively. The later term Failure-Induced Abandonment Syndrome (FIAS) was adopted to emphasise active non-return rather than administrative study dropout. Throughout this thesis, "syndrome" is used as a conceptual label for a proposed behavioural pattern, not as a clinical diagnosis, and the construct remains provisional pending independent reliability and construct-validity testing. Methodologically, the conjecture and the literature's expectation were kept in explicit tension: Chapter 2 formalises the literature's expectation as the null hypothesis H0 — that a well-designed gamified FRA would be accepted and would not suffer failure-driven abandonment — and the empirical stages test H0 with the conjecture standing as its rival. The architecture that governs which claim is stated, tested and resolved where, is set out in Table 3.1.</w:t>
       </w:r>
     </w:p>
     <w:p>
@@ -5657,11 +5656,7 @@
         <w:jc w:val="both"/>
       </w:pPr>
       <w:r>
-        <w:t xml:space="preserve">Stage 3 was the programme's strongest empirical challenge to a purely dispositional explanation. By the close of Stage 2, FIAS had been specified as a provisional construct </w:t>
-      </w:r>
-      <w:r>
-        <w:lastRenderedPageBreak/>
-        <w:t>and a behavioural-economic mechanism had been proposed. What remained unresolved was whether the observed non-return pattern was primarily a property of the Guangzhou cohort, a property of the coupled clinical-game context, or a combination of both. A separate-cohort decoupling study could provide important directional evidence, but it could not eliminate all cohort and contextual alternatives.</w:t>
+        <w:t>Stage 3 was the programme's attribution experiment. By the close of Stage 2, H0 stood rejected, FIAS had been specified as a provisional construct and a behavioural-economic mechanism had been proposed — but the rejection admitted two readings: either gamification simply does not transfer to frail older adults, or the theory works and the coupling to the clinical technology broke it. These make opposite predictions for the same game with the clinical attachment removed, and Stage 3 was designed to tell them apart — in effect, a positive control for gamification theory itself. A separate-cohort decoupling study could provide strong directional evidence, though not eliminate all cohort and contextual alternatives.</w:t>
       </w:r>
     </w:p>
     <w:p>
@@ -5677,7 +5672,7 @@
         <w:jc w:val="both"/>
       </w:pPr>
       <w:r>
-        <w:t>The Stage-3 findings are consistent with frame suppression and inconsistent with the strongest form of a purely dispositional account. They do not rule out cohort self-selection, setting, recruitment, health-status, staff-interaction or observation-window differences. The comparison is therefore described as a between-cohort quasi-experimental decoupling study rather than a single-variable experiment. The residual 35.6-percentage-point difference in the 65-80 band between in-session retention and regular-use intention identifies a practical design problem that remains. Adaptive learning, formalised in Chapter 7 as LODF, is proposed as one theoretically grounded response among several candidates, including fatigue management, access support, shorter sessions and alternative coaching strategies.</w:t>
+        <w:t>The Stage-3 findings are one-sided between the two readings: the decoupled game was accepted at the levels the gamification literature predicts, which acquits the theory and the population and convicts the coupling. They do not rule out cohort self-selection, setting, recruitment, health-status, staff-interaction or observation-window differences, so the comparison is described as a between-cohort quasi-experimental decoupling study rather than a single-variable experiment. The residual 35.6-percentage-point difference in the 65-80 band between in-session retention and regular-use intention identifies the practical problem that remained — and it is where the programme found its principal design discovery: adaptive learning, formalised in Chapter 7 as LODF, as the driver that can make returning worthwhile and eventually carry the clinical purpose back into the experience.</w:t>
       </w:r>
     </w:p>
     <w:p>
@@ -5725,7 +5720,7 @@
         <w:jc w:val="both"/>
       </w:pPr>
       <w:r>
-        <w:t>The aim of this thesis is to identify, name and characterise a pattern of failure-associated non-return to a gamified health technology among older adults, to examine whether participant-facing clinical framing may moderate that pattern, and to translate the resulting evidence into an engineering design framework that can be tested and deployed on existing infrastructure.</w:t>
+        <w:t>The aim of this thesis is to explain why older adults abandon clinically attached health technology and to engineer a testable response: to identify, name and characterise failure-associated non-return in gamified FRA; to determine whether the failure belongs to gamification theory or to the coupling of game and clinical purpose; and to translate the evidence into a design framework deployable on existing infrastructure. The inquiry is structured as a null-hypothesis test with an attribution stage (H0, §2.3.5; architecture in Table 3.1), and four research questions organise the work.</w:t>
       </w:r>
     </w:p>
     <w:p>
@@ -5779,7 +5774,7 @@
         <w:jc w:val="both"/>
       </w:pPr>
       <w:r>
-        <w:t>The thesis offers contributions in four registers. Theoretically, it identifies failure-associated non-return as a post-contact problem not explicitly represented in standard acceptance and gamification models, integrates technology acceptance, gamification, self-efficacy and behavioural-economics literatures, and advances FIAS as a provisional frame-sensitive behavioural construct. Mental accounting, identity-level endowment, loss aversion and stereotype threat are proposed as candidate mechanisms and are not claimed to have been directly measured. Methodologically, the thesis introduces the dual-purpose mechanic, documents a Claude Code-assisted development workflow, uses theory-iterating action research with explicit revision points, conducts a between-cohort quasi-experimental participant-facing decoupling comparison, and measures the difference between in-session retention and stated regular-use intention. Empirically, it reports a strong association between first failure and observed dropout in Stage 2 and a substantial increase in post-failure return in the separate Stage-3 decoupled cohort, while explicitly retaining the need for within-cohort confirmation. Practically, it specifies the learn-to-earn philosophy and LODF as deployable engineering responses for prospective evaluation on existing infrastructure.</w:t>
+        <w:t>The thesis offers contributions in four registers, and Chapter 8 states them in the hierarchy the evidence supports. Theoretically, the problem finding is FIAS: failure-associated non-return as a post-contact behaviour that standard acceptance and gamification models do not represent, structured by the behavioural-economics account of Table 2.1 (loss aversion, identity-relevant endowment, mental accounting, stereotype threat — proposed as candidate mechanisms, not claimed as directly measured). The scope finding is a boundary condition for gamification theory: the theory transfers to older adults, as Stage 3 confirms, until the gamified activity is attached to a purpose-based technology whose verdicts touch the user's identity-level value propositions. The design discovery is adaptive learning as the behavioural-change driver — continuous improvement at the level of the individual user — with LODF as its engineering formalisation and zero-failure presentation as a supporting element. Methodologically, the thesis contributes the null-hypothesis-plus-attribution architecture (Table 3.1), the dual-purpose mechanic, the QFD evidence-to-design pipeline, a documented AI-assisted development workflow, and the commitment-gap measurement. Empirically, it reports the prospective rejection of H0 in Stage 2 and the theory-rescuing acceptance of the decoupled game in Stage 3, with within-cohort confirmation explicitly retained as future work. Practically, it specifies the adaptive-learning principle and LODF for prospective evaluation on existing infrastructure.</w:t>
       </w:r>
     </w:p>
     <w:p>
@@ -5824,7 +5819,7 @@
         <w:jc w:val="both"/>
       </w:pPr>
       <w:r>
-        <w:t>The research is organised in three progressive parts. Part I (Chapters 2 and 3) establishes the theoretical and methodological foundation. Chapter 2 develops a five-stage argument from technology acceptance and gamification through self-efficacy, behavioural economics and learning-oriented design, while distinguishing established literature from the thesis's candidate mechanisms. Chapter 3 specifies the action-research methodology, the analytical status of each stage and the limitations of the between-cohort comparison. Part II (Chapters 4, 5 and 6) reports the Stage-1 survey, the Stage-2 gamified FRA deployment and the Stage-3 participant-facing decoupling study. Part III (Chapters 7 and 8) develops LODF as an engineering framework, identifies its empirical anchors and untested components, and examines alternative explanations, limitations, ethics and reproducibility. Chapter 9 synthesises the findings using an explicit hierarchy of observed results, inferred mechanisms and proposed design responses, and sets out the controlled studies required for confirmation and generalisation.</w:t>
+        <w:t>The research is organised in three progressive parts that follow the hypothesis architecture. Part I builds the test. Chapter 2 assembles the null hypothesis H0 from the acceptance and gamification literatures, names the gap those literatures leave — every Octalysis drive is a designer-side motivation lever, none addresses abandonment — and lays out the behavioural theory (Table 2.1) that will be needed when H0 fails. Chapter 3 declares the methodology: action research carrying a falsifiable hypothesis, the role of each stage (field signal, prospective test, attribution experiment), the hypothesis architecture (Table 3.1) and the confirmation-versus-discovery discipline. Part II executes it. Chapter 4 reports Stage 1, the retrospective field signal; Chapter 5 reports Stage 2, the prospective test that rejects H0; Chapter 6 reports Stage 3, the attribution experiment that rescues gamification theory, establishes the coupling boundary condition, and — in the commitment gap — forces the design discovery. Part III claims and bounds it. Chapter 7 formalises adaptive learning as LODF; Chapter 8 states the contributions in their evidential hierarchy, with alternative explanations, limitations, ethics and reproducibility; Chapter 9 synthesises the five-step arc and sets out the pre-specified confirmatory programme.</w:t>
       </w:r>
     </w:p>
     <w:p>

</xml_diff>

<commit_message>
Resolve Stage-1 denominator: 200 interviewed of 280 residents
Author clarification: 280 is the facility's resident population, 200
is the interviewed eligible sample. Propagated consistently through
Abstract, ToC, 3.2, 4.1A, 4.2 heading and body, Table 4.1 caption and
Appendix A; all Stage-1 percentages computed on N=200. Two narrow
residuals remain: why 80 residents were not interviewed (selection-
bias note for 4.8) and whether the TAM multiple-choice block existed.

Co-Authored-By: Claude Fable 5 <noreply@anthropic.com>
Claude-Session: https://claude.ai/code/session_01KoT3i8geZspYBMMKVYJUTG
</commit_message>
<xml_diff>
--- a/docs/thesis/Tam_V10_EngD_Thesis_Final_Revision_Draft.docx
+++ b/docs/thesis/Tam_V10_EngD_Thesis_Final_Revision_Draft.docx
@@ -204,7 +204,7 @@
         <w:jc w:val="both"/>
       </w:pPr>
       <w:r>
-        <w:t>Stage 1 used a face-to-face survey with approximately 200 residents at a large elderly housing facility in Guangzhou. Thirty-nine per cent reported prior FRA use; among prior users, approximately 74% reported an adverse, unacceptable or unsuccessful first experience as operationalised in the study records, and approximately 82% reported no subsequent return. Because the reproduced six-item instrument does not by itself resolve every meaning of "failure", the Stage-1 result is interpreted as a descriptive association between an adverse first experience and self-reported non-return. Stage 2 prospectively examined the pattern in an eight-week action-research study with thirty residents using a dual-purpose AI-assisted skiing game on the InBody pressure panel. Within the archived Stage-2 dataset, twenty-one of thirty participants (70.0%) disengaged at or before three game cycles, eight after a single session, and no re-engagement was observed within the study window. Among the nine sustained participants the recorded FRA index changed by +6.9 points on average (paired dz = 2.22, 95% CI 0.95–3.46); across all thirty participants the paired change was +4.0 points (dz = 0.42, 95% CI 0.05–0.79). Because the archived dataset contains no session timestamps, no time-to-event model is fitted; earlier survival-analysis framings have been withdrawn. A Quality Function Deployment (QFD) pipeline translates the empirical findings into prioritised game-design requirements. Three of six F4-cluster participants showed positive change in the recorded FRA index during their single session and did not return, producing an objective-score-improvement/non-return paradox. Stage 3 used a separate Hong Kong community cohort of 120 adults aged 25-80 and implemented a participant-facing decoupling package: clinical terminology, pre-session clinical procedures and participant-facing clinical outputs were removed while the same broad hardware, skiing mechanic, five-attempt rule and session length were retained. Observed non-return was 6.7% overall and 13.3% in the 65-80 band. Among 23 initial dropouts, 15 (65.2%) returned voluntarily; in the age-matched 65-80 band, 10 of 16 (62.5%) returned. Coordination-challenge endorsement reached 71.7% and is interpreted primarily as a manipulation check, while regular-use intention reached 63.3% overall.</w:t>
+        <w:t>Stage 1 used a face-to-face survey with 200 residents, interviewed from a resident population of 280 at a large elderly housing facility in Guangzhou. Thirty-nine per cent reported prior FRA use; among prior users, approximately 74% reported an adverse, unacceptable or unsuccessful first experience as operationalised in the study records, and approximately 82% reported no subsequent return. Because the reproduced six-item instrument does not by itself resolve every meaning of "failure", the Stage-1 result is interpreted as a descriptive association between an adverse first experience and self-reported non-return. Stage 2 prospectively examined the pattern in an eight-week action-research study with thirty residents using a dual-purpose AI-assisted skiing game on the InBody pressure panel. Within the archived Stage-2 dataset, twenty-one of thirty participants (70.0%) disengaged at or before three game cycles, eight after a single session, and no re-engagement was observed within the study window. Among the nine sustained participants the recorded FRA index changed by +6.9 points on average (paired dz = 2.22, 95% CI 0.95–3.46); across all thirty participants the paired change was +4.0 points (dz = 0.42, 95% CI 0.05–0.79). Because the archived dataset contains no session timestamps, no time-to-event model is fitted; earlier survival-analysis framings have been withdrawn. A Quality Function Deployment (QFD) pipeline translates the empirical findings into prioritised game-design requirements. Three of six F4-cluster participants showed positive change in the recorded FRA index during their single session and did not return, producing an objective-score-improvement/non-return paradox. Stage 3 used a separate Hong Kong community cohort of 120 adults aged 25-80 and implemented a participant-facing decoupling package: clinical terminology, pre-session clinical procedures and participant-facing clinical outputs were removed while the same broad hardware, skiing mechanic, five-attempt rule and session length were retained. Observed non-return was 6.7% overall and 13.3% in the 65-80 band. Among 23 initial dropouts, 15 (65.2%) returned voluntarily; in the age-matched 65-80 band, 10 of 16 (62.5%) returned. Coordination-challenge endorsement reached 71.7% and is interpreted primarily as a manipulation check, while regular-use intention reached 63.3% overall.</w:t>
       </w:r>
     </w:p>
     <w:p>
@@ -1560,9 +1560,7 @@
         </w:rPr>
       </w:pPr>
       <w:r>
-        <w:t>4.2 The Guangzhou Survey (N ≈ 200)</w:t>
-      </w:r>
-      <w:r>
+        <w:t>4.2 The Guangzhou Survey (N = 200 of 280 Residents)</w:t>
         <w:tab/>
         <w:t>31</w:t>
       </w:r>
@@ -4191,9 +4189,7 @@
         </w:rPr>
       </w:pPr>
       <w:r>
-        <w:t>Table 4.1. Stage-1 survey results (N ≈ 200 residents).</w:t>
-      </w:r>
-      <w:r>
+        <w:t>Table 4.1. Stage-1 survey results (N = 200 residents interviewed, of a resident population of 280).</w:t>
         <w:tab/>
         <w:t>31</w:t>
       </w:r>
@@ -6968,14 +6964,7 @@
         <w:jc w:val="both"/>
       </w:pPr>
       <w:r>
-        <w:t xml:space="preserve">Stage 1 was a descriptive, retrospective survey at the Poly Group facility in Guangzhou: a six-item Yes/No instrument administered face-to-face by nursing staff. Its methodological role in the architecture is to establish the field signal — a population satisfying every practical precondition of the acceptance models, with a documented pattern of adverse first experiences and non-return — that makes H0 worth testing prospectively (Chapter 4). </w:t>
-      </w:r>
-      <w:r>
-        <w:rPr>
-          <w:b/>
-          <w:highlight w:val="yellow"/>
-        </w:rPr>
-        <w:t>[AUTHOR INPUT REQUIRED: report one exact participant flow and denominator consistently; the working text contains both approximately 200 and approximately 280 — verify against the archived survey log.]</w:t>
+        <w:t>Stage 1 was a descriptive, retrospective survey at the Poly Group facility in Guangzhou: a six-item Yes/No instrument administered face-to-face by nursing staff. Its methodological role in the architecture is to establish the field signal — a population satisfying every practical precondition of the acceptance models, with a documented pattern of adverse first experiences and non-return — that makes H0 worth testing prospectively (Chapter 4). The facility housed 280 residents at the time of the survey; 200 eligible residents were interviewed about their FRA experience, and all Stage-1 percentages are computed on the interviewed sample of 200.</w:t>
       </w:r>
     </w:p>
     <w:p>
@@ -7683,36 +7672,43 @@
         <w:jc w:val="both"/>
       </w:pPr>
       <w:r>
-        <w:t xml:space="preserve">FRA is therefore the sensor-based artefact whose engagement profile is examined. The Stage-1 survey instrument reproduced in Appendix A contains six Yes/No items on awareness, prior use, understanding and acceptance of the first result, subsequent return, discomfort or discouragement, and willingness to use a friendlier version. Current working text elsewhere refers to approximately 280 participants and to a separate TAM-based multiple-choice block; those references must be reconciled against the archived </w:t>
-      </w:r>
-      <w:r>
-        <w:lastRenderedPageBreak/>
-        <w:t>instrument and participant log before final binding. Only results with a traceable item, wording, denominator and data source should remain in Table 4.1.</w:t>
-      </w:r>
-    </w:p>
-    <w:p>
-      <w:pPr>
-        <w:pStyle w:val="Heading2"/>
-      </w:pPr>
-      <w:bookmarkStart w:id="56" w:name="_Toc232024556"/>
-      <w:r>
-        <w:t>4.2 The Guangzhou Survey (N ≈ 200)</w:t>
-      </w:r>
-      <w:bookmarkEnd w:id="56"/>
-    </w:p>
-    <w:p>
-      <w:pPr>
-        <w:jc w:val="both"/>
-      </w:pPr>
-      <w:r>
-        <w:t xml:space="preserve">Six Yes/No items were administered face-to-face by nursing staff in July and August 2024 to residents aged 65–88 who met the stated eligibility criteria. Face-to-face administration reduced literacy and digital-skill barriers, but it may also have introduced interviewer and social-desirability effects, and this is acknowledged as a limitation in §4.8. </w:t>
+        <w:t xml:space="preserve">FRA is therefore the sensor-based artefact whose engagement profile is examined. The Stage-1 survey instrument reproduced in Appendix A contains six Yes/No items on awareness, prior use, understanding and acceptance of the first result, subsequent return, discomfort or discouragement, and willingness to use a friendlier version. </w:t>
+      </w:r>
+      <w:r>
+        <w:t xml:space="preserve">The figure of 280 that appears in earlier working documents is the facility's resident population at the time of the survey; 200 eligible residents were interviewed, and 200 is the denominator for every Stage-1 result. </w:t>
       </w:r>
       <w:r>
         <w:rPr>
           <w:b/>
           <w:highlight w:val="yellow"/>
         </w:rPr>
-        <w:t>[AUTHOR INPUT REQUIRED: replace the approximate sample size with the exact numbers approached, eligible, consenting and completing, together with item-level missingness, from the archived survey log.]</w:t>
+        <w:t>[AUTHOR INPUT REQUIRED: earlier drafts also mention a separate TAM-based multiple-choice block — confirm whether such a block was administered, and if so archive it with Appendix A; otherwise delete the reference. Only results with a traceable item, wording, denominator and data source remain in Table 4.1.]</w:t>
+      </w:r>
+      <w:r/>
+    </w:p>
+    <w:p>
+      <w:pPr>
+        <w:pStyle w:val="Heading2"/>
+      </w:pPr>
+      <w:bookmarkStart w:id="56" w:name="_Toc232024556"/>
+      <w:bookmarkEnd w:id="56"/>
+      <w:r>
+        <w:t>4.2 The Guangzhou Survey (N = 200 of 280 Residents)</w:t>
+      </w:r>
+    </w:p>
+    <w:p>
+      <w:pPr>
+        <w:jc w:val="both"/>
+      </w:pPr>
+      <w:r>
+        <w:t xml:space="preserve">Six Yes/No items were administered face-to-face by nursing staff in July and August 2024 to residents aged 65–88 who met the stated eligibility criteria. Face-to-face administration reduced literacy and digital-skill barriers, but it may also have introduced interviewer and social-desirability effects, and this is acknowledged as a limitation in §4.8. Of the facility's 280 residents, 200 who met the eligibility criteria were interviewed; the interviewed sample of 200 is the denominator for all Stage-1 results. </w:t>
+      </w:r>
+      <w:r>
+        <w:rPr>
+          <w:b/>
+          <w:highlight w:val="yellow"/>
+        </w:rPr>
+        <w:t>[AUTHOR INPUT REQUIRED: state why the remaining 80 residents were not interviewed — ineligible under the stated criteria, unavailable, or declined — with approximate counts if the log allows; this bears on selection bias and belongs in §4.8's limitations.]</w:t>
       </w:r>
     </w:p>
     <w:p>
@@ -7721,10 +7717,10 @@
         <w:jc w:val="center"/>
       </w:pPr>
       <w:bookmarkStart w:id="57" w:name="_Toc232024694"/>
-      <w:r>
-        <w:t>Table 4.1. Stage-1 survey results (N ≈ 200 residents).</w:t>
-      </w:r>
       <w:bookmarkEnd w:id="57"/>
+      <w:r>
+        <w:t>Table 4.1. Stage-1 survey results (N = 200 residents interviewed, of a resident population of 280).</w:t>
+      </w:r>
     </w:p>
     <w:tbl>
       <w:tblPr>
@@ -7955,7 +7951,7 @@
           <w:b/>
           <w:highlight w:val="yellow"/>
         </w:rPr>
-        <w:t>[AUTHOR INPUT REQUIRED — Table 4.1 verification: reconcile N≈200 versus N≈280 against the archived participant log; confirm the exact wording and denominator behind the access and perceived-benefit estimates; and document how a negative response to 'understood and accepted the result' was mapped to the term 'failure'. If no corresponding source items exist, revise Table 4.1 and all downstream claims accordingly.]</w:t>
+        <w:t>[AUTHOR INPUT REQUIRED — Table 4.1 verification (denominator resolved: 200 interviewed of 280 residents): confirm the exact wording and denominator behind the access and perceived-benefit estimates; and document how a negative response to 'understood and accepted the result' was mapped to the term 'failure'. If no corresponding source items exist, revise Table 4.1 and all downstream claims accordingly.]</w:t>
       </w:r>
     </w:p>
     <w:p>
@@ -17685,7 +17681,7 @@
         <w:jc w:val="both"/>
       </w:pPr>
       <w:r>
-        <w:t>Six Yes/No items administered face-to-face by nursing staff at the Poly Group Guangzhou facility between July and August 2024. Five qualifying criteria were verified by the management office prior to invitation: secondary education or above, no significant cognitive impairment, capable of unsupported standing, sufficient vision for screen reading, and no acute mental-health conditions.</w:t>
+        <w:t>Six Yes/No items administered face-to-face by nursing staff at the Poly Group Guangzhou facility between July and August 2024 to 200 eligible residents of the facility's population of 280. Five qualifying criteria were verified by the management office prior to invitation: secondary education or above, no significant cognitive impairment, capable of unsupported standing, sufficient vision for screen reading, and no acute mental-health conditions.</w:t>
       </w:r>
     </w:p>
     <w:p>

</xml_diff>

<commit_message>
Withdraw Table 5.3 (motivational-orientation classification)
Author decision: coding records cannot be produced and the variable is
absent from the archived dataset. Table + OR=31.5 removed; transparent
withdrawal note in 5.5 points to the reproducible satisfaction
association (p=.013). QFD matrix renumbered 5.4->5.3. Dependent
references updated in Table 6.5, 5.9, 6.1, 6.2, 6.5, 6.9, 8.3.

Co-Authored-By: Claude Fable 5 <noreply@anthropic.com>
Claude-Session: https://claude.ai/code/session_01KoT3i8geZspYBMMKVYJUTG
</commit_message>
<xml_diff>
--- a/docs/thesis/Tam_V10_EngD_Thesis_Final_Revision_Draft.docx
+++ b/docs/thesis/Tam_V10_EngD_Thesis_Final_Revision_Draft.docx
@@ -4312,32 +4312,9 @@
     <w:p>
       <w:pPr>
         <w:pStyle w:val="TOC1"/>
-        <w:tabs>
-          <w:tab w:val="right" w:leader="dot" w:pos="8495"/>
-        </w:tabs>
-        <w:rPr>
-          <w:rFonts w:asciiTheme="minorHAnsi" w:hAnsiTheme="minorHAnsi"/>
-          <w:noProof/>
-          <w:kern w:val="2"/>
-          <w:szCs w:val="24"/>
-          <w:lang w:val="en-HK" w:eastAsia="zh-CN"/>
-          <w14:ligatures w14:val="standardContextual"/>
-        </w:rPr>
-      </w:pPr>
-      <w:r>
-        <w:t>Table 5.3. Stage-2 outcomes by motivational orientation.</w:t>
-      </w:r>
-      <w:r>
-        <w:tab/>
-        <w:t>49</w:t>
-      </w:r>
-    </w:p>
-    <w:p>
-      <w:pPr>
-        <w:pStyle w:val="TOC1"/>
-      </w:pPr>
-      <w:r>
-        <w:t>Table 5.4. QFD deployment matrix: user needs mapped onto game technical characteristics.</w:t>
+      </w:pPr>
+      <w:r>
+        <w:t>Table 5.3. QFD deployment matrix: user needs mapped onto game technical characteristics.</w:t>
       </w:r>
     </w:p>
     <w:p>
@@ -10182,211 +10159,12 @@
     </w:p>
     <w:p>
       <w:pPr>
-        <w:pStyle w:val="TableCaption"/>
         <w:jc w:val="center"/>
       </w:pPr>
       <w:bookmarkStart w:id="88" w:name="_Toc232024700"/>
-      <w:r>
-        <w:t>Table 5.3. Stage-2 outcomes by motivational orientation.</w:t>
-      </w:r>
       <w:bookmarkEnd w:id="88"/>
-    </w:p>
-    <w:tbl>
-      <w:tblPr>
-        <w:tblStyle w:val="TableGrid"/>
-        <w:tblW w:w="0" w:type="auto"/>
-        <w:jc w:val="center"/>
-        <w:tblLook w:val="04A0" w:firstRow="1" w:lastRow="0" w:firstColumn="1" w:lastColumn="0" w:noHBand="0" w:noVBand="1"/>
-      </w:tblPr>
-      <w:tblGrid>
-        <w:gridCol w:w="2405"/>
-        <w:gridCol w:w="1842"/>
-        <w:gridCol w:w="2124"/>
-        <w:gridCol w:w="2124"/>
-      </w:tblGrid>
-      <w:tr>
-        <w:trPr>
-          <w:jc w:val="center"/>
-        </w:trPr>
-        <w:tc>
-          <w:tcPr>
-            <w:tcW w:w="2405" w:type="dxa"/>
-          </w:tcPr>
-          <w:p>
-            <w:r>
-              <w:rPr>
-                <w:b/>
-                <w:sz w:val="20"/>
-              </w:rPr>
-              <w:t>Orientation</w:t>
-            </w:r>
-          </w:p>
-        </w:tc>
-        <w:tc>
-          <w:tcPr>
-            <w:tcW w:w="1842" w:type="dxa"/>
-          </w:tcPr>
-          <w:p>
-            <w:r>
-              <w:rPr>
-                <w:b/>
-                <w:sz w:val="20"/>
-              </w:rPr>
-              <w:t>n</w:t>
-            </w:r>
-          </w:p>
-        </w:tc>
-        <w:tc>
-          <w:tcPr>
-            <w:tcW w:w="2124" w:type="dxa"/>
-          </w:tcPr>
-          <w:p>
-            <w:r>
-              <w:rPr>
-                <w:b/>
-                <w:sz w:val="20"/>
-              </w:rPr>
-              <w:t>Sustained</w:t>
-            </w:r>
-          </w:p>
-        </w:tc>
-        <w:tc>
-          <w:tcPr>
-            <w:tcW w:w="2124" w:type="dxa"/>
-          </w:tcPr>
-          <w:p>
-            <w:r>
-              <w:t>Positive FRA-index change</w:t>
-            </w:r>
-          </w:p>
-        </w:tc>
-      </w:tr>
-      <w:tr>
-        <w:trPr>
-          <w:jc w:val="center"/>
-        </w:trPr>
-        <w:tc>
-          <w:tcPr>
-            <w:tcW w:w="2405" w:type="dxa"/>
-          </w:tcPr>
-          <w:p>
-            <w:r>
-              <w:rPr>
-                <w:sz w:val="20"/>
-              </w:rPr>
-              <w:t>Learning-focused</w:t>
-            </w:r>
-          </w:p>
-        </w:tc>
-        <w:tc>
-          <w:tcPr>
-            <w:tcW w:w="1842" w:type="dxa"/>
-          </w:tcPr>
-          <w:p>
-            <w:r>
-              <w:rPr>
-                <w:sz w:val="20"/>
-              </w:rPr>
-              <w:t>8</w:t>
-            </w:r>
-          </w:p>
-        </w:tc>
-        <w:tc>
-          <w:tcPr>
-            <w:tcW w:w="2124" w:type="dxa"/>
-          </w:tcPr>
-          <w:p>
-            <w:r>
-              <w:rPr>
-                <w:sz w:val="20"/>
-              </w:rPr>
-              <w:t>87.5%</w:t>
-            </w:r>
-          </w:p>
-        </w:tc>
-        <w:tc>
-          <w:tcPr>
-            <w:tcW w:w="2124" w:type="dxa"/>
-          </w:tcPr>
-          <w:p>
-            <w:r>
-              <w:rPr>
-                <w:sz w:val="20"/>
-              </w:rPr>
-              <w:t>85.7%</w:t>
-            </w:r>
-          </w:p>
-        </w:tc>
-      </w:tr>
-      <w:tr>
-        <w:trPr>
-          <w:jc w:val="center"/>
-        </w:trPr>
-        <w:tc>
-          <w:tcPr>
-            <w:tcW w:w="2405" w:type="dxa"/>
-          </w:tcPr>
-          <w:p>
-            <w:r>
-              <w:rPr>
-                <w:sz w:val="20"/>
-              </w:rPr>
-              <w:t>Health-deficit-focused</w:t>
-            </w:r>
-          </w:p>
-        </w:tc>
-        <w:tc>
-          <w:tcPr>
-            <w:tcW w:w="1842" w:type="dxa"/>
-          </w:tcPr>
-          <w:p>
-            <w:r>
-              <w:rPr>
-                <w:sz w:val="20"/>
-              </w:rPr>
-              <w:t>22</w:t>
-            </w:r>
-          </w:p>
-        </w:tc>
-        <w:tc>
-          <w:tcPr>
-            <w:tcW w:w="2124" w:type="dxa"/>
-          </w:tcPr>
-          <w:p>
-            <w:r>
-              <w:rPr>
-                <w:sz w:val="20"/>
-              </w:rPr>
-              <w:t>18.2%</w:t>
-            </w:r>
-          </w:p>
-        </w:tc>
-        <w:tc>
-          <w:tcPr>
-            <w:tcW w:w="2124" w:type="dxa"/>
-          </w:tcPr>
-          <w:p>
-            <w:r>
-              <w:rPr>
-                <w:sz w:val="20"/>
-              </w:rPr>
-              <w:t>50.0%</w:t>
-            </w:r>
-          </w:p>
-        </w:tc>
-      </w:tr>
-    </w:tbl>
-    <w:p>
-      <w:pPr>
-        <w:pStyle w:val="AuthorAction"/>
-        <w:spacing w:after="40"/>
-      </w:pPr>
-      <w:r>
-        <w:rPr>
-          <w:b/>
-          <w:highlight w:val="yellow"/>
-        </w:rPr>
-        <w:t>[AUTHOR INPUT REQUIRED — Table 5.3 support. The week-2 motivational-orientation classification does not appear in the archived dataset, so the odds ratio of 31.5 cannot be reproduced from the data supplied. Either provide the coding records behind the classification (rubric, coders, inter-coder agreement, classification dates) or withdraw Table 5.3 and the odds ratio, and rely on the satisfaction association reported above, which is reproducible from the archive.]</w:t>
+      <w:r>
+        <w:t>Withdrawal note. Earlier drafts reported a week-2 motivational-orientation classification (learning-focused versus health-deficit-focused) with a large but very imprecise association with sustained engagement (odds ratio 31.5, 95% CI 2.9–339), presented as Table 5.3. The classification variable does not appear in the archived dataset and its coding records could not be produced, so the classification, its table and its odds ratio are withdrawn from this thesis. The reproducible association in the archive — satisfaction with sustained engagement (nine of nine sustained participants satisfied versus eleven of twenty-one in the low-engagement group; Fisher's exact p = 0.013, reported above) — carries the evidential weight instead.</w:t>
       </w:r>
     </w:p>
     <w:p>
@@ -10518,7 +10296,7 @@
     </w:p>
     <w:p>
       <w:r>
-        <w:t>Table 5.4 presents the deployment matrix. The rows are user needs derived from the Stage-1 survey, the Stage-2 telemetry and the Stage-2 self-reports, each anchored to the empirical finding that evidences it and to the TAM, STAM or Octalysis construct it instantiates. The columns are the game's technical characteristics: the adaptive difficulty layer (§5.3.5), the loss-free dynamic game states (§5.3.10), the trajectory display (L5), the coin-reward loop and the staff coaching protocol (L6). A strong relationship (●) indicates that the feature directly serves the need; a moderate relationship (◐) indicates partial or indirect support; a blank cell indicates no designed relationship.</w:t>
+        <w:t>Table 5.3 presents the deployment matrix. The rows are user needs derived from the Stage-1 survey, the Stage-2 telemetry and the Stage-2 self-reports, each anchored to the empirical finding that evidences it and to the TAM, STAM or Octalysis construct it instantiates. The columns are the game's technical characteristics: the adaptive difficulty layer (§5.3.5), the loss-free dynamic game states (§5.3.10), the trajectory display (L5), the coin-reward loop and the staff coaching protocol (L6). A strong relationship (●) indicates that the feature directly serves the need; a moderate relationship (◐) indicates partial or indirect support; a blank cell indicates no designed relationship.</w:t>
       </w:r>
     </w:p>
     <w:p>
@@ -10526,7 +10304,7 @@
         <w:pStyle w:val="TableCaption"/>
       </w:pPr>
       <w:r>
-        <w:t>Table 5.4. QFD deployment matrix: user needs evidenced by the Stage-1 and Stage-2 data, mapped onto the game's technical characteristics. ● strong designed relationship; ◐ moderate or indirect relationship.</w:t>
+        <w:t>Table 5.3. QFD deployment matrix: user needs evidenced by the Stage-1 and Stage-2 data, mapped onto the game's technical characteristics. ● strong designed relationship; ◐ moderate or indirect relationship.</w:t>
       </w:r>
     </w:p>
     <w:tbl>
@@ -11313,7 +11091,7 @@
         <w:jc w:val="both"/>
       </w:pPr>
       <w:r>
-        <w:t>Stage 2 has important limitations. The sample is small, drawn from one site, and not demographically diverse; the observation window is short, so nothing is claimed about sustained use beyond eight weeks. The archived dataset contains no timestamps, so the temporal structure of disengagement could not be analysed. Measurement constraints are material: the recorded index was measured once before and once after the window on a single instrument whose short-interval test-retest variability is non-trivial (Kim et al., 2018). The self-reported outcomes are vulnerable to courtesy and demand bias, since the questionnaires were administered by facility staff in a setting where participants knew the deployment was a facility initiative. The week-2 motivational-orientation classification is not in the archived dataset and may be affected by reverse causality; the provisional FIAS composite appears to reuse cycle-count information; FES-I was not available as a baseline covariate; the embedded investigator was not complemented by an independent observer; and the clinical meaning of short-term index change was not established.</w:t>
+        <w:t>Stage 2 has important limitations. The sample is small, drawn from one site, and not demographically diverse; the observation window is short, so nothing is claimed about sustained use beyond eight weeks. The archived dataset contains no timestamps, so the temporal structure of disengagement could not be analysed. Measurement constraints are material: the recorded index was measured once before and once after the window on a single instrument whose short-interval test-retest variability is non-trivial (Kim et al., 2018). The self-reported outcomes are vulnerable to courtesy and demand bias, since the questionnaires were administered by facility staff in a setting where participants knew the deployment was a facility initiative. the week-2 motivational-orientation classification was withdrawn because its coding records could not be produced (§5.5); the provisional FIAS composite appears to reuse cycle-count information; FES-I was not available as a baseline covariate; the embedded investigator was not complemented by an independent observer; and the clinical meaning of short-term index change was not established.</w:t>
       </w:r>
     </w:p>
     <w:p>
@@ -11364,7 +11142,7 @@
         <w:jc w:val="both"/>
       </w:pPr>
       <w:r>
-        <w:t>The rejection of H0 in Stage 2 was ambiguous between two rival explanations, and Stage 3 exists to tell them apart. The first explanation is dispositional: gamification simply does not work for frail older adults — the acceptance and gamification literatures do not transfer to this population, and the An–Cheung demonstrations do not generalise. The second is the coupling explanation: the gamification stack works exactly as the literature says, and what broke Stage 2 was the attachment of the game to a purpose-based clinical technology whose verdicts strike the identity-level concerns of older users. These explanations make opposite predictions for the same game with the clinical attachment removed. If the dispositional account is right, a decoupled game should fail with elderly users too. If the coupling account is right, a decoupled game should be accepted at roughly the levels the gamification literature predicts. Stage 3 is therefore the programme's attribution experiment — in effect, a positive control for gamification theory itself. Two secondary questions carried over from Stage 2: whether the low learning-oriented proportion was a stable cohort characteristic or a response to the clinical-game context, and whether post-failure return would appear once participant-facing clinical cues were removed. Stage 3 addressed these questions through a separate-cohort field comparison using a coordinated decoupling package. Because cohort, setting and recruitment also changed, the study provides quasi-experimental directional evidence rather than single-variable causal isolation.</w:t>
+        <w:t>The rejection of H0 in Stage 2 was ambiguous between two rival explanations, and Stage 3 exists to tell them apart. The first explanation is dispositional: gamification simply does not work for frail older adults — the acceptance and gamification literatures do not transfer to this population, and the An–Cheung demonstrations do not generalise. The second is the coupling explanation: the gamification stack works exactly as the literature says, and what broke Stage 2 was the attachment of the game to a purpose-based clinical technology whose verdicts strike the identity-level concerns of older users. These explanations make opposite predictions for the same game with the clinical attachment removed. If the dispositional account is right, a decoupled game should fail with elderly users too. If the coupling account is right, a decoupled game should be accepted at roughly the levels the gamification literature predicts. Stage 3 is therefore the programme's attribution experiment — in effect, a positive control for gamification theory itself. Two secondary questions carried over from Stage 2: whether the scarcity of learning-oriented engagement suggested by Stage-2 observation (the formal classification has since been withdrawn, §5.5) was a stable cohort characteristic or a response to the clinical-game context, and whether post-failure return would appear once participant-facing clinical cues were removed. Stage 3 addressed these questions through a separate-cohort field comparison using a coordinated decoupling package. Because cohort, setting and recruitment also changed, the study provides quasi-experimental directional evidence rather than single-variable causal isolation.</w:t>
       </w:r>
     </w:p>
     <w:p>
@@ -11382,7 +11160,7 @@
         <w:jc w:val="both"/>
       </w:pPr>
       <w:r>
-        <w:t>The two rival accounts frame the predictions. Under the dispositional account, removing clinical cues changes little: elderly non-return stays high and post-failure return stays near zero. Under the coupling account, the decoupled game behaves like the elderly gamification successes in the literature. Within that frame, Stage 3 made three specific predictions. First, observed non-return under the decoupled condition would be lower than the Stage-2 rate. Second, some initial dropouts would return after failure. Third, most participants would recognise the activity as a coordination challenge and a substantial proportion would express regular-use intention. The coordination-endorsement item is treated as a manipulation check for the intended participant-facing frame; it is not psychometrically equivalent to the Stage-2 week-2 learning-orientation classification and should not be used as a direct 2.7-fold measure of latent orientation change.</w:t>
+        <w:t>The two rival accounts frame the predictions. Under the dispositional account, removing clinical cues changes little: elderly non-return stays high and post-failure return stays near zero. Under the coupling account, the decoupled game behaves like the elderly gamification successes in the literature. Within that frame, Stage 3 made three specific predictions. First, observed non-return under the decoupled condition would be lower than the Stage-2 rate. Second, some initial dropouts would return after failure. Third, most participants would recognise the activity as a coordination challenge and a substantial proportion would express regular-use intention. The coordination-endorsement item is treated as a manipulation check for the intended participant-facing frame; it measures frame recognition, not motivational orientation.</w:t>
       </w:r>
     </w:p>
     <w:p>
@@ -12235,7 +12013,7 @@
         <w:jc w:val="both"/>
       </w:pPr>
       <w:r>
-        <w:t>Coordination-challenge endorsement reached 71.7% (86 of 120), indicating that most participants perceived the intended frame. Regular-use intention reached 63.3% overall and 51.1% in the 65-80 band. These measures should not be compared as direct multiples of the Stage-2 26.7% learning-orientation classification because the constructs, instruments, timing and coding procedures differ. The Stage-3 item is best interpreted as a manipulation check, whereas the regular-use item is a stated intention that may not predict longitudinal use.</w:t>
+        <w:t>Coordination-challenge endorsement reached 71.7% (86 of 120), indicating that most participants perceived the intended frame. Regular-use intention reached 63.3% overall and 51.1% in the 65-80 band. No comparison is made with the Stage-2 motivational-orientation classification, which has been withdrawn (§5.5). The Stage-3 item is best interpreted as a manipulation check, whereas the regular-use item is a stated intention that may not predict longitudinal use.</w:t>
       </w:r>
     </w:p>
     <w:p>
@@ -12482,7 +12260,7 @@
         <w:spacing w:after="40"/>
       </w:pPr>
       <w:r>
-        <w:t>Interpretive note: Stage-3 coordination endorsement and Stage-2 motivational orientation are non-equivalent measures. The former tests whether the participant recognised the presented activity as a coordination challenge; the latter was an exploratory week-2 classification partly based on behaviour. They should be reported side-by-side only with this distinction explicit.</w:t>
+        <w:t>Interpretive note: coordination endorsement tests whether the participant recognised the presented activity as a coordination challenge. It is a frame-recognition measure and is not read as a measure of motivational orientation.</w:t>
       </w:r>
     </w:p>
     <w:p>
@@ -12754,7 +12532,7 @@
         <w:jc w:val="both"/>
       </w:pPr>
       <w:r>
-        <w:t>Stage 3 has material limitations. It is a between-cycle, between-cohort comparison; the decoupling intervention contains several coordinated changes; mental accounting, loss aversion, identity protection and stereotype threat were not measured directly; volunteers may differ from non-volunteers; follow-up is short; and cultural specificity limits generalisation. In addition, the Stage-3 framing item is not equivalent to the Stage-2 orientation classification, and the complete LODF was not deployed. These limitations do not erase the large post-failure return signal, but they bound its causal and mechanistic interpretation.</w:t>
+        <w:t>Stage 3 has material limitations. It is a between-cycle, between-cohort comparison; the decoupling intervention contains several coordinated changes; mental accounting, loss aversion, identity protection and stereotype threat were not measured directly; volunteers may differ from non-volunteers; follow-up is short; and cultural specificity limits generalisation. In addition, the Stage-3 framing item measures frame recognition only, and the complete LODF was not deployed. These limitations do not erase the large post-failure return signal, but they bound its causal and mechanistic interpretation.</w:t>
       </w:r>
     </w:p>
     <w:p>
@@ -13263,11 +13041,9 @@
             <w:tcW w:w="3114" w:type="dxa"/>
           </w:tcPr>
           <w:p>
-            <w:r>
-              <w:rPr>
-                <w:sz w:val="18"/>
-              </w:rPr>
-              <w:t>Motivational orientation and completion (Stage 2, week-2 classification)</w:t>
+            <w:r/>
+            <w:r>
+              <w:t>FRA index change, sustained participants (Stage 2)</w:t>
             </w:r>
           </w:p>
         </w:tc>
@@ -13276,11 +13052,9 @@
             <w:tcW w:w="1092" w:type="dxa"/>
           </w:tcPr>
           <w:p>
-            <w:r>
-              <w:rPr>
-                <w:sz w:val="18"/>
-              </w:rPr>
-              <w:t>OR = 31.5</w:t>
+            <w:r/>
+            <w:r>
+              <w:t>dz = 2.22 (paired); mean +6.9 points</w:t>
             </w:r>
           </w:p>
         </w:tc>
@@ -13289,11 +13063,9 @@
             <w:tcW w:w="1280" w:type="dxa"/>
           </w:tcPr>
           <w:p>
-            <w:r>
-              <w:rPr>
-                <w:sz w:val="18"/>
-              </w:rPr>
-              <w:t>2.9–339</w:t>
+            <w:r/>
+            <w:r>
+              <w:t>dz 0.95–3.46; mean 4.5–9.3</w:t>
             </w:r>
           </w:p>
         </w:tc>
@@ -13302,11 +13074,9 @@
             <w:tcW w:w="605" w:type="dxa"/>
           </w:tcPr>
           <w:p>
-            <w:r>
-              <w:rPr>
-                <w:sz w:val="18"/>
-              </w:rPr>
-              <w:t>30</w:t>
+            <w:r/>
+            <w:r>
+              <w:t>9</w:t>
             </w:r>
           </w:p>
         </w:tc>
@@ -13317,11 +13087,7 @@
           <w:p>
             <w:r/>
             <w:r>
-              <w:rPr>
-                <w:b/>
-                <w:highlight w:val="yellow"/>
-              </w:rPr>
-              <w:t>Odds ratio; Table 5.3. Classification records not in archive — see §5.5</w:t>
+              <w:t>Paired t and Wilcoxon; §5.5</w:t>
             </w:r>
           </w:p>
         </w:tc>
@@ -13337,7 +13103,7 @@
           <w:p>
             <w:r/>
             <w:r>
-              <w:t>FRA index change, sustained participants (Stage 2)</w:t>
+              <w:t>FRA index change, all participants (Stage 2, archived paired data)</w:t>
             </w:r>
           </w:p>
         </w:tc>
@@ -13348,7 +13114,7 @@
           <w:p>
             <w:r/>
             <w:r>
-              <w:t>dz = 2.22 (paired); mean +6.9 points</w:t>
+              <w:t>dz = 0.42; mean +4.0 points</w:t>
             </w:r>
           </w:p>
         </w:tc>
@@ -13359,7 +13125,7 @@
           <w:p>
             <w:r/>
             <w:r>
-              <w:t>dz 0.95–3.46; mean 4.5–9.3</w:t>
+              <w:t>dz 0.05–0.79; mean 0.5–7.6</w:t>
             </w:r>
           </w:p>
         </w:tc>
@@ -13370,7 +13136,7 @@
           <w:p>
             <w:r/>
             <w:r>
-              <w:t>9</w:t>
+              <w:t>30</w:t>
             </w:r>
           </w:p>
         </w:tc>
@@ -13397,7 +13163,7 @@
           <w:p>
             <w:r/>
             <w:r>
-              <w:t>FRA index change, all participants (Stage 2, archived paired data)</w:t>
+              <w:t>Satisfaction association with sustained engagement (Stage 2)</w:t>
             </w:r>
           </w:p>
         </w:tc>
@@ -13408,7 +13174,7 @@
           <w:p>
             <w:r/>
             <w:r>
-              <w:t>dz = 0.42; mean +4.0 points</w:t>
+              <w:t>9/9 vs 11/21 satisfied</w:t>
             </w:r>
           </w:p>
         </w:tc>
@@ -13419,7 +13185,7 @@
           <w:p>
             <w:r/>
             <w:r>
-              <w:t>dz 0.05–0.79; mean 0.5–7.6</w:t>
+              <w:t>p = 0.013</w:t>
             </w:r>
           </w:p>
         </w:tc>
@@ -13441,7 +13207,7 @@
           <w:p>
             <w:r/>
             <w:r>
-              <w:t>Paired t and Wilcoxon; §5.5</w:t>
+              <w:t>Fisher's exact test; §5.5</w:t>
             </w:r>
           </w:p>
         </w:tc>
@@ -13455,9 +13221,11 @@
             <w:tcW w:w="3114" w:type="dxa"/>
           </w:tcPr>
           <w:p>
-            <w:r/>
-            <w:r>
-              <w:t>Satisfaction association with sustained engagement (Stage 2)</w:t>
+            <w:r>
+              <w:rPr>
+                <w:sz w:val="18"/>
+              </w:rPr>
+              <w:t>Re-engagement after dropout (Stage 2)</w:t>
             </w:r>
           </w:p>
         </w:tc>
@@ -13466,9 +13234,11 @@
             <w:tcW w:w="1092" w:type="dxa"/>
           </w:tcPr>
           <w:p>
-            <w:r/>
-            <w:r>
-              <w:t>9/9 vs 11/21 satisfied</w:t>
+            <w:r>
+              <w:rPr>
+                <w:sz w:val="18"/>
+              </w:rPr>
+              <w:t>0.0%</w:t>
             </w:r>
           </w:p>
         </w:tc>
@@ -13477,9 +13247,11 @@
             <w:tcW w:w="1280" w:type="dxa"/>
           </w:tcPr>
           <w:p>
-            <w:r/>
-            <w:r>
-              <w:t>p = 0.013</w:t>
+            <w:r>
+              <w:rPr>
+                <w:sz w:val="18"/>
+              </w:rPr>
+              <w:t>0.0–15.5%*</w:t>
             </w:r>
           </w:p>
         </w:tc>
@@ -13488,9 +13260,11 @@
             <w:tcW w:w="605" w:type="dxa"/>
           </w:tcPr>
           <w:p>
-            <w:r/>
-            <w:r>
-              <w:t>30</w:t>
+            <w:r>
+              <w:rPr>
+                <w:sz w:val="18"/>
+              </w:rPr>
+              <w:t>21</w:t>
             </w:r>
           </w:p>
         </w:tc>
@@ -13499,9 +13273,11 @@
             <w:tcW w:w="2090" w:type="dxa"/>
           </w:tcPr>
           <w:p>
-            <w:r/>
-            <w:r>
-              <w:t>Fisher's exact test; §5.5</w:t>
+            <w:r>
+              <w:rPr>
+                <w:sz w:val="18"/>
+              </w:rPr>
+              <w:t>Wilson score interval; Table 5.2</w:t>
             </w:r>
           </w:p>
         </w:tc>
@@ -13519,7 +13295,7 @@
               <w:rPr>
                 <w:sz w:val="18"/>
               </w:rPr>
-              <w:t>Re-engagement after dropout (Stage 2)</w:t>
+              <w:t>Return after initial dropout, all bands (Stage 3)</w:t>
             </w:r>
           </w:p>
         </w:tc>
@@ -13532,7 +13308,7 @@
               <w:rPr>
                 <w:sz w:val="18"/>
               </w:rPr>
-              <w:t>0.0%</w:t>
+              <w:t>65.2%</w:t>
             </w:r>
           </w:p>
         </w:tc>
@@ -13545,7 +13321,7 @@
               <w:rPr>
                 <w:sz w:val="18"/>
               </w:rPr>
-              <w:t>0.0–15.5%*</w:t>
+              <w:t>44.9–81.2%*</w:t>
             </w:r>
           </w:p>
         </w:tc>
@@ -13558,7 +13334,7 @@
               <w:rPr>
                 <w:sz w:val="18"/>
               </w:rPr>
-              <w:t>21</w:t>
+              <w:t>23</w:t>
             </w:r>
           </w:p>
         </w:tc>
@@ -13571,7 +13347,7 @@
               <w:rPr>
                 <w:sz w:val="18"/>
               </w:rPr>
-              <w:t>Wilson score interval; Table 5.2</w:t>
+              <w:t>Wilson score interval; Table 6.1</w:t>
             </w:r>
           </w:p>
         </w:tc>
@@ -13589,7 +13365,7 @@
               <w:rPr>
                 <w:sz w:val="18"/>
               </w:rPr>
-              <w:t>Return after initial dropout, all bands (Stage 3)</w:t>
+              <w:t>Return after initial dropout, 65–80 band (Stage 3)</w:t>
             </w:r>
           </w:p>
         </w:tc>
@@ -13602,7 +13378,7 @@
               <w:rPr>
                 <w:sz w:val="18"/>
               </w:rPr>
-              <w:t>65.2%</w:t>
+              <w:t>62.5%</w:t>
             </w:r>
           </w:p>
         </w:tc>
@@ -13615,7 +13391,7 @@
               <w:rPr>
                 <w:sz w:val="18"/>
               </w:rPr>
-              <w:t>44.9–81.2%*</w:t>
+              <w:t>38.6–81.5%*</w:t>
             </w:r>
           </w:p>
         </w:tc>
@@ -13628,7 +13404,7 @@
               <w:rPr>
                 <w:sz w:val="18"/>
               </w:rPr>
-              <w:t>23</w:t>
+              <w:t>16</w:t>
             </w:r>
           </w:p>
         </w:tc>
@@ -13641,7 +13417,7 @@
               <w:rPr>
                 <w:sz w:val="18"/>
               </w:rPr>
-              <w:t>Wilson score interval; Table 6.1</w:t>
+              <w:t>Wilson score interval; Table 6.2</w:t>
             </w:r>
           </w:p>
         </w:tc>
@@ -13656,49 +13432,46 @@
           </w:tcPr>
           <w:p>
             <w:r>
+              <w:t>Observed non-return, 65-80 band (Stage 3)</w:t>
+            </w:r>
+          </w:p>
+        </w:tc>
+        <w:tc>
+          <w:tcPr>
+            <w:tcW w:w="1092" w:type="dxa"/>
+          </w:tcPr>
+          <w:p>
+            <w:r>
               <w:rPr>
                 <w:sz w:val="18"/>
               </w:rPr>
-              <w:t>Return after initial dropout, 65–80 band (Stage 3)</w:t>
-            </w:r>
-          </w:p>
-        </w:tc>
-        <w:tc>
-          <w:tcPr>
-            <w:tcW w:w="1092" w:type="dxa"/>
+              <w:t>13.3%</w:t>
+            </w:r>
+          </w:p>
+        </w:tc>
+        <w:tc>
+          <w:tcPr>
+            <w:tcW w:w="1280" w:type="dxa"/>
           </w:tcPr>
           <w:p>
             <w:r>
               <w:rPr>
                 <w:sz w:val="18"/>
               </w:rPr>
-              <w:t>62.5%</w:t>
-            </w:r>
-          </w:p>
-        </w:tc>
-        <w:tc>
-          <w:tcPr>
-            <w:tcW w:w="1280" w:type="dxa"/>
+              <w:t>6.3–26.2%*</w:t>
+            </w:r>
+          </w:p>
+        </w:tc>
+        <w:tc>
+          <w:tcPr>
+            <w:tcW w:w="605" w:type="dxa"/>
           </w:tcPr>
           <w:p>
             <w:r>
               <w:rPr>
                 <w:sz w:val="18"/>
               </w:rPr>
-              <w:t>38.6–81.5%*</w:t>
-            </w:r>
-          </w:p>
-        </w:tc>
-        <w:tc>
-          <w:tcPr>
-            <w:tcW w:w="605" w:type="dxa"/>
-          </w:tcPr>
-          <w:p>
-            <w:r>
-              <w:rPr>
-                <w:sz w:val="18"/>
-              </w:rPr>
-              <w:t>16</w:t>
+              <w:t>45</w:t>
             </w:r>
           </w:p>
         </w:tc>
@@ -13726,7 +13499,10 @@
           </w:tcPr>
           <w:p>
             <w:r>
-              <w:t>Observed non-return, 65-80 band (Stage 3)</w:t>
+              <w:rPr>
+                <w:sz w:val="18"/>
+              </w:rPr>
+              <w:t>Coordination challenge endorsement (Stage 3)</w:t>
             </w:r>
           </w:p>
         </w:tc>
@@ -13739,7 +13515,7 @@
               <w:rPr>
                 <w:sz w:val="18"/>
               </w:rPr>
-              <w:t>13.3%</w:t>
+              <w:t>71.7%</w:t>
             </w:r>
           </w:p>
         </w:tc>
@@ -13752,7 +13528,7 @@
               <w:rPr>
                 <w:sz w:val="18"/>
               </w:rPr>
-              <w:t>6.3–26.2%*</w:t>
+              <w:t>63.0–79.0%*</w:t>
             </w:r>
           </w:p>
         </w:tc>
@@ -13765,7 +13541,7 @@
               <w:rPr>
                 <w:sz w:val="18"/>
               </w:rPr>
-              <w:t>45</w:t>
+              <w:t>120</w:t>
             </w:r>
           </w:p>
         </w:tc>
@@ -13778,7 +13554,7 @@
               <w:rPr>
                 <w:sz w:val="18"/>
               </w:rPr>
-              <w:t>Wilson score interval; Table 6.2</w:t>
+              <w:t>Wilson score interval; Table 6.3</w:t>
             </w:r>
           </w:p>
         </w:tc>
@@ -13796,7 +13572,8 @@
               <w:rPr>
                 <w:sz w:val="18"/>
               </w:rPr>
-              <w:t>Coordination challenge endorsement (Stage 3)</w:t>
+              <w:lastRenderedPageBreak/>
+              <w:t>Regular-use intention, 65–80 band (Stage 3)</w:t>
             </w:r>
           </w:p>
         </w:tc>
@@ -13809,7 +13586,7 @@
               <w:rPr>
                 <w:sz w:val="18"/>
               </w:rPr>
-              <w:t>71.7%</w:t>
+              <w:t>51.1%</w:t>
             </w:r>
           </w:p>
         </w:tc>
@@ -13822,7 +13599,7 @@
               <w:rPr>
                 <w:sz w:val="18"/>
               </w:rPr>
-              <w:t>63.0–79.0%*</w:t>
+              <w:t>37.0–65.0%*</w:t>
             </w:r>
           </w:p>
         </w:tc>
@@ -13835,7 +13612,7 @@
               <w:rPr>
                 <w:sz w:val="18"/>
               </w:rPr>
-              <w:t>120</w:t>
+              <w:t>45</w:t>
             </w:r>
           </w:p>
         </w:tc>
@@ -13863,77 +13640,6 @@
           </w:tcPr>
           <w:p>
             <w:r>
-              <w:rPr>
-                <w:sz w:val="18"/>
-              </w:rPr>
-              <w:lastRenderedPageBreak/>
-              <w:t>Regular-use intention, 65–80 band (Stage 3)</w:t>
-            </w:r>
-          </w:p>
-        </w:tc>
-        <w:tc>
-          <w:tcPr>
-            <w:tcW w:w="1092" w:type="dxa"/>
-          </w:tcPr>
-          <w:p>
-            <w:r>
-              <w:rPr>
-                <w:sz w:val="18"/>
-              </w:rPr>
-              <w:t>51.1%</w:t>
-            </w:r>
-          </w:p>
-        </w:tc>
-        <w:tc>
-          <w:tcPr>
-            <w:tcW w:w="1280" w:type="dxa"/>
-          </w:tcPr>
-          <w:p>
-            <w:r>
-              <w:rPr>
-                <w:sz w:val="18"/>
-              </w:rPr>
-              <w:t>37.0–65.0%*</w:t>
-            </w:r>
-          </w:p>
-        </w:tc>
-        <w:tc>
-          <w:tcPr>
-            <w:tcW w:w="605" w:type="dxa"/>
-          </w:tcPr>
-          <w:p>
-            <w:r>
-              <w:rPr>
-                <w:sz w:val="18"/>
-              </w:rPr>
-              <w:t>45</w:t>
-            </w:r>
-          </w:p>
-        </w:tc>
-        <w:tc>
-          <w:tcPr>
-            <w:tcW w:w="2090" w:type="dxa"/>
-          </w:tcPr>
-          <w:p>
-            <w:r>
-              <w:rPr>
-                <w:sz w:val="18"/>
-              </w:rPr>
-              <w:t>Wilson score interval; Table 6.3</w:t>
-            </w:r>
-          </w:p>
-        </w:tc>
-      </w:tr>
-      <w:tr>
-        <w:trPr>
-          <w:jc w:val="center"/>
-        </w:trPr>
-        <w:tc>
-          <w:tcPr>
-            <w:tcW w:w="3114" w:type="dxa"/>
-          </w:tcPr>
-          <w:p>
-            <w:r>
               <w:t>Descriptive retention-intention difference, 65-80 band (Stage 3)</w:t>
             </w:r>
           </w:p>
@@ -13994,7 +13700,7 @@
         <w:jc w:val="both"/>
       </w:pPr>
       <w:r>
-        <w:t>Intervals marked with an asterisk are Wilson score intervals computed from the reported counts. Effect-size intervals for the paired changes are exact noncentral-t intervals computed from the archived participant-level data. The earlier pooled (d = 0.78) and zero-imputation (d = 0.57) estimates did not reproduce from the archive and have been withdrawn; the survival-model row has been replaced for the same reason (§5.5). The confidence interval for the 35.6-percentage-point difference should respect the fact that retention and intention are distinct measures and may not represent a simple paired effect. The very wide interval around the week-2 motivational-orientation odds ratio, together with the absence of the classification from the archive, means that estimate should be treated as exploratory pending the author's coding records.</w:t>
+        <w:t>Intervals marked with an asterisk are Wilson score intervals computed from the reported counts. Effect-size intervals for the paired changes are exact noncentral-t intervals computed from the archived participant-level data. The earlier pooled (d = 0.78) and zero-imputation (d = 0.57) estimates did not reproduce from the archive and have been withdrawn; the survival-model row has been replaced for the same reason (§5.5). The confidence interval for the 35.6-percentage-point difference should respect the fact that retention and intention are distinct measures and may not represent a simple paired effect. The earlier motivational-orientation odds ratio has been withdrawn (§5.5).</w:t>
       </w:r>
     </w:p>
     <w:p>
@@ -15278,7 +14984,7 @@
         <w:jc w:val="both"/>
       </w:pPr>
       <w:r>
-        <w:t>The empirical record yields the following results: 70.0% early disengagement (21 of 30, at or before three cycles) in the Stage-2 cohort with no observed re-engagement during the eight-week window; a paired recorded-index change of +6.9 points among the nine sustained participants (dz = 2.22, 95% CI 0.95–3.46) and +4.0 points across all thirty (dz = 0.42, 95% CI 0.05–0.79); a strong association between satisfaction and sustained engagement (Fisher's exact p = 0.013); an exploratory week-2 motivational-orientation odds ratio of 31.5 whose coding records remain to be archived; recorded-index increase without self-reported improvement or return among most single-session participants; 65.2% return among Stage-3 initial dropouts overall and 62.5% in the 65-80 band, pending completion of the Stage-3 data logbook; 71.7% coordination-frame endorsement as a manipulation check; 63.3% regular-use intention overall; and a descriptive 35.6-percentage-point difference between session retention and regular-use intention in the 65-80 band. These results do not constitute a direct correlation across stages because the participants and measures differ.</w:t>
+        <w:t>The empirical record yields the following results: 70.0% early disengagement (21 of 30, at or before three cycles) in the Stage-2 cohort with no observed re-engagement during the eight-week window; a paired recorded-index change of +6.9 points among the nine sustained participants (dz = 2.22, 95% CI 0.95–3.46) and +4.0 points across all thirty (dz = 0.42, 95% CI 0.05–0.79); a strong association between satisfaction and sustained engagement (Fisher's exact p = 0.013); the documented withdrawal (§5.5) of an earlier exploratory motivational-orientation classification whose coding records could not be produced; recorded-index increase without self-reported improvement or return among most single-session participants; 65.2% return among Stage-3 initial dropouts overall and 62.5% in the 65-80 band, pending completion of the Stage-3 data logbook; 71.7% coordination-frame endorsement as a manipulation check; 63.3% regular-use intention overall; and a descriptive 35.6-percentage-point difference between session retention and regular-use intention in the 65-80 band. These results do not constitute a direct correlation across stages because the participants and measures differ.</w:t>
       </w:r>
     </w:p>
     <w:p>

</xml_diff>

<commit_message>
Resolve three author clarifications: 80 unavailable, no TAM block, Korean figure deleted
- 4.2/4.8: the 80 non-interviewed residents were unavailable at
  interview time (no refusals); folded into Stage-1 limitations
- 4.1A: no separate TAM multiple-choice block was administered - the
  six-item form is the complete Stage-1 instrument
- 4.7/2.7.3: the ~75% Korean engagement figure originated in vendor
  catalogue material and is deleted; the Korean comparison is now
  qualitative, with Park 2019/Kim 2018 correctly credited as
  validation/reliability evidence
Placeholders: 19 -> 15

Co-Authored-By: Claude Fable 5 <noreply@anthropic.com>
Claude-Session: https://claude.ai/code/session_01KoT3i8geZspYBMMKVYJUTG
</commit_message>
<xml_diff>
--- a/docs/thesis/Tam_V10_EngD_Thesis_Final_Revision_Draft.docx
+++ b/docs/thesis/Tam_V10_EngD_Thesis_Final_Revision_Draft.docx
@@ -6834,7 +6834,7 @@
         <w:jc w:val="both"/>
       </w:pPr>
       <w:r>
-        <w:t>Park et al. (2019) and Kim et al. (2018) are used in this thesis as a cross-cultural reference point for engagement with related FRA technology. The comparison is a benchmark rather than a causal explanation, and the cited studies should be checked carefully for exact protocol, population and retention definitions before final binding. The possibility that some implementations already incorporate supportive framing or adaptive coaching is a hypothesis for comparative fieldwork, not an inference that can be made from retention figures alone.</w:t>
+        <w:t>Park et al. (2019) and Kim et al. (2018) are used in this thesis as a cross-cultural reference point for the same FRA technology: the former validates the system against gold-standard balance batteries, the latter establishes its test-retest reliability, and both evidence sustained institutional use in Korea. Neither reports an engagement rate, and no numerical Korean engagement benchmark is carried in this thesis (§4.7). The possibility that Korean implementations incorporate supportive framing or adaptive coaching is a hypothesis for comparative fieldwork, not an inference that can be made from the available sources.</w:t>
       </w:r>
     </w:p>
     <w:p>
@@ -7649,19 +7649,8 @@
         <w:jc w:val="both"/>
       </w:pPr>
       <w:r>
-        <w:t xml:space="preserve">FRA is therefore the sensor-based artefact whose engagement profile is examined. The Stage-1 survey instrument reproduced in Appendix A contains six Yes/No items on awareness, prior use, understanding and acceptance of the first result, subsequent return, discomfort or discouragement, and willingness to use a friendlier version. </w:t>
-      </w:r>
-      <w:r>
-        <w:t xml:space="preserve">The figure of 280 that appears in earlier working documents is the facility's resident population at the time of the survey; 200 eligible residents were interviewed, and 200 is the denominator for every Stage-1 result. </w:t>
-      </w:r>
-      <w:r>
-        <w:rPr>
-          <w:b/>
-          <w:highlight w:val="yellow"/>
-        </w:rPr>
-        <w:t>[AUTHOR INPUT REQUIRED: earlier drafts also mention a separate TAM-based multiple-choice block — confirm whether such a block was administered, and if so archive it with Appendix A; otherwise delete the reference. Only results with a traceable item, wording, denominator and data source remain in Table 4.1.]</w:t>
-      </w:r>
-      <w:r/>
+        <w:t>FRA is therefore the sensor-based artefact whose engagement profile is examined. The Stage-1 survey instrument reproduced in Appendix A contains six Yes/No items on awareness, prior use, understanding and acceptance of the first result, subsequent return, discomfort or discouragement, and willingness to use a friendlier version. The figure of 280 that appears in earlier working documents is the facility's resident population at the time of the survey; 200 eligible residents were interviewed, and 200 is the denominator for every Stage-1 result. No separate TAM-based questionnaire block was administered; the six-item form reproduced in Appendix A is the complete Stage-1 instrument, and only results with a traceable item, wording, denominator and data source remain in Table 4.1.</w:t>
+      </w:r>
     </w:p>
     <w:p>
       <w:pPr>
@@ -7678,14 +7667,7 @@
         <w:jc w:val="both"/>
       </w:pPr>
       <w:r>
-        <w:t xml:space="preserve">Six Yes/No items were administered face-to-face by nursing staff in July and August 2024 to residents aged 65–88 who met the stated eligibility criteria. Face-to-face administration reduced literacy and digital-skill barriers, but it may also have introduced interviewer and social-desirability effects, and this is acknowledged as a limitation in §4.8. Of the facility's 280 residents, 200 who met the eligibility criteria were interviewed; the interviewed sample of 200 is the denominator for all Stage-1 results. </w:t>
-      </w:r>
-      <w:r>
-        <w:rPr>
-          <w:b/>
-          <w:highlight w:val="yellow"/>
-        </w:rPr>
-        <w:t>[AUTHOR INPUT REQUIRED: state why the remaining 80 residents were not interviewed — ineligible under the stated criteria, unavailable, or declined — with approximate counts if the log allows; this bears on selection bias and belongs in §4.8's limitations.]</w:t>
+        <w:t>Six Yes/No items were administered face-to-face by nursing staff in July and August 2024 to residents aged 65–88 who met the stated eligibility criteria. Face-to-face administration reduced literacy and digital-skill barriers, but it may also have introduced interviewer and social-desirability effects, and this is acknowledged as a limitation in §4.8. Of the facility's 280 residents, 200 who met the eligibility criteria were interviewed; the interviewed sample of 200 is the denominator for all Stage-1 results. The remaining 80 residents were unavailable at the time the interviews were conducted; none were excluded by refusal. Because unavailability is unlikely to correlate strongly with FRA experience, the selection risk is judged modest, though it is acknowledged with the other Stage-1 limitations in §4.8.</w:t>
       </w:r>
     </w:p>
     <w:p>
@@ -8469,17 +8451,7 @@
         <w:jc w:val="both"/>
       </w:pPr>
       <w:r>
-        <w:t xml:space="preserve">Korean deployments of the same FRA technology provide a cross-cultural reference point. Park et al. (2019) validated the FRA system against gold-standard balance batteries in community-dwelling older adults, and Kim, Kim and Won (2018) established its test-retest reliability; both studies evidence sustained institutional use of the platform in Korea. Reports reaching the present programme also described materially higher sustained engagement in Korean facilities after gamified balance exercises were introduced. </w:t>
-      </w:r>
-      <w:r>
-        <w:rPr>
-          <w:b/>
-          <w:highlight w:val="yellow"/>
-        </w:rPr>
-        <w:t>[AUTHOR INPUT REQUIRED: the ~75% sustained-engagement figure quoted in earlier drafts does not appear in the two cited validation studies. Provide the primary source for the engagement figure — report, vendor communication or study — or remove the numerical claim and retain the comparison qualitatively.]</w:t>
-      </w:r>
-      <w:r>
-        <w:t xml:space="preserve"> The Korean comparison is a benchmark, not an explanation: whatever design lever produces sustained engagement there has not been identified in the literature, and this programme is, in part, an investigation of which lever it is.</w:t>
+        <w:t>Korean deployments of the same FRA technology provide a cross-cultural reference point. Park et al. (2019) validated the FRA system against gold-standard balance batteries in community-dwelling older adults, and Kim, Kim and Won (2018) established its test-retest reliability; both studies evidence sustained institutional use of the platform in Korea. A specific sustained-engagement figure quoted in earlier drafts originated in the vendor's catalogue material and is not carried as evidence in this thesis. The Korean comparison is therefore qualitative: whatever design lever supports sustained engagement there has not been identified in the peer-reviewed literature, and this programme is, in part, an investigation of which lever it is.</w:t>
       </w:r>
     </w:p>
     <w:p>
@@ -8497,7 +8469,7 @@
         <w:jc w:val="both"/>
       </w:pPr>
       <w:r>
-        <w:t>Stage 1 produces three outputs. First, a documented utilisation and non-return problem signature: awareness without use, and self-reported non-return after adverse first experiences, in a population that satisfied every practical precondition the acceptance models name. Second, the identification of a post-contact event — the adverse first experience — that TAM, STAM and Octalysis do not represent. Third, the provisional FIAS construct and the hypotheses of Chapter 5. In the argument of this thesis, Stage 1 is the retrospective evidence consistent with the failure of the null hypothesis H0 (§2.3.5); Stage 2 provides the prospective test. Stage 1 does not validate FIAS, establish permanence, or identify mental accounting, endowment or stereotype threat as causal mechanisms; those propositions are examined prospectively in Stage 2 and probed through participant-facing decoupling in Stage 3. Its limitations are those of a retrospective staff-administered survey: recall error, interviewer and social-desirability effects, and item wording that captures acceptance of a result rather than task failure directly.</w:t>
+        <w:t>Stage 1 produces three outputs. First, a documented utilisation and non-return problem signature: awareness without use, and self-reported non-return after adverse first experiences, in a population that satisfied every practical precondition the acceptance models name. Second, the identification of a post-contact event — the adverse first experience — that TAM, STAM and Octalysis do not represent. Third, the provisional FIAS construct and the hypotheses of Chapter 5. In the argument of this thesis, Stage 1 is the retrospective evidence consistent with the failure of the null hypothesis H0 (§2.3.5); Stage 2 provides the prospective test. Stage 1 does not validate FIAS, establish permanence, or identify mental accounting, endowment or stereotype threat as causal mechanisms; those propositions are examined prospectively in Stage 2 and probed through participant-facing decoupling in Stage 3. Its limitations are those of a retrospective staff-administered survey: recall error, interviewer and social-desirability effects, item wording that captures acceptance of a result rather than task failure directly, and the exclusion of 80 of the facility's 280 residents who were unavailable when the interviews were conducted.</w:t>
       </w:r>
     </w:p>
     <w:p>

</xml_diff>

<commit_message>
V10 format pass: author's five review points fixed
1+5) LODF vocabulary swept 72 -> 5 canonical mentions; Chapter 7
   retitled 'Adaptive Learning as the Behavioural-Change Driver';
   L7 renamed Adaptive-Learning Telemetry; ToC synced; abbreviation
   and glossary keys preserved
2) All eight block diagrams regenerated with corrected terminology
   and re-embedded; Figure 3.1 caption updated
3) Inserted tables normalized to native 10pt
4) page_break_before on all 11 Heading-1 sections

Co-Authored-By: Claude Fable 5 <noreply@anthropic.com>
Claude-Session: https://claude.ai/code/session_01KoT3i8geZspYBMMKVYJUTG
</commit_message>
<xml_diff>
--- a/docs/thesis/Tam_V10_EngD_Thesis_Final_Revision_Draft.docx
+++ b/docs/thesis/Tam_V10_EngD_Thesis_Final_Revision_Draft.docx
@@ -2370,9 +2370,7 @@
         </w:rPr>
       </w:pPr>
       <w:r>
-        <w:t>Chapter 7 Discussion: Adaptive Learning and the Learning-Oriented Design Framework</w:t>
-      </w:r>
-      <w:r>
+        <w:t>Chapter 7 Discussion: Adaptive Learning as the Behavioural-Change Driver</w:t>
         <w:tab/>
         <w:t>64</w:t>
       </w:r>
@@ -2388,9 +2386,7 @@
         </w:rPr>
       </w:pPr>
       <w:r>
-        <w:t>7.1 Why the Empirical Programme Motivates Adaptive Learning</w:t>
-      </w:r>
-      <w:r>
+        <w:t>7.1 Why the Empirical Programme Forces Adaptive Learning</w:t>
         <w:tab/>
         <w:t>64</w:t>
       </w:r>
@@ -2442,9 +2438,7 @@
         </w:rPr>
       </w:pPr>
       <w:r>
-        <w:t>7.4 The Learning-Oriented Design Framework (LODF)</w:t>
-      </w:r>
-      <w:r>
+        <w:t>7.4 Formalising the Discovery: The Adaptive-Learning Framework (LODF)</w:t>
         <w:tab/>
         <w:t>65</w:t>
       </w:r>
@@ -2460,9 +2454,7 @@
         </w:rPr>
       </w:pPr>
       <w:r>
-        <w:t>7.5 Prototype Stack: Engineering-Actionable LODF Implementation</w:t>
-      </w:r>
-      <w:r>
+        <w:t>7.5 Prototype Stack: Engineering-Actionable Implementation</w:t>
         <w:tab/>
         <w:t>66</w:t>
       </w:r>
@@ -3687,9 +3679,7 @@
         </w:rPr>
       </w:pPr>
       <w:r>
-        <w:t>Appendix E · Five-Layer Architecture and LODF Reference Stack</w:t>
-      </w:r>
-      <w:r>
+        <w:t>Appendix E · Five-Layer Architecture and Adaptive-Learning Reference Stack</w:t>
         <w:tab/>
         <w:t>106</w:t>
       </w:r>
@@ -3723,9 +3713,7 @@
         </w:rPr>
       </w:pPr>
       <w:r>
-        <w:t>E.2 · Layers L5–L7 (LODF Reference Stack)</w:t>
-      </w:r>
-      <w:r>
+        <w:t>E.2 · Layers L5–L7 (Adaptive-Learning Reference Stack)</w:t>
         <w:tab/>
         <w:t>106</w:t>
       </w:r>
@@ -3814,9 +3802,7 @@
         </w:rPr>
       </w:pPr>
       <w:r>
-        <w:t>Figure 3.1. Three-stage action research programme. Each stage produces an empirical output and a theoretical revision; the three stages converge on the LODF design framework and the future-work programme.</w:t>
-      </w:r>
-      <w:r>
+        <w:t>Figure 3.1. Three-stage action research programme. Each stage produces an empirical output and a theoretical revision; the three stages converge on the adaptive-learning framework design framework and the future-work programme.</w:t>
         <w:tab/>
         <w:t>26</w:t>
       </w:r>
@@ -4116,9 +4102,7 @@
         </w:rPr>
       </w:pPr>
       <w:r>
-        <w:t>Figure 7.1. LODF reference stack: existing five-layer FRA architecture (L0–L4) extended with three additional layers (L5 User-Facing Trajectory; L6 Staff Coaching Protocol; L7 LODF Telemetry).</w:t>
-      </w:r>
-      <w:r>
+        <w:t>Figure 7.1. adaptive-learning reference stack: existing five-layer FRA architecture (L0–L4) extended with three additional layers (L5 User-Facing Trajectory; L6 Staff Coaching Protocol; L7 Adaptive-Learning Telemetry).</w:t>
         <w:tab/>
         <w:t>68</w:t>
       </w:r>
@@ -4448,10 +4432,7 @@
         </w:rPr>
       </w:pPr>
       <w:r>
-        <w:lastRenderedPageBreak/>
-        <w:t>Table 7.1. LODF principles, function and empirical anchor.</w:t>
-      </w:r>
-      <w:r>
+        <w:t>Table 7.1. adaptive-learning principles, function and empirical anchor.</w:t>
         <w:tab/>
         <w:t>66</w:t>
       </w:r>
@@ -4472,9 +4453,7 @@
         </w:rPr>
       </w:pPr>
       <w:r>
-        <w:t>Table 7.2. LODF reference stack (L0–L7) mapped to LODF principles.</w:t>
-      </w:r>
-      <w:r>
+        <w:t>Table 7.2. adaptive-learning reference stack (L0–L7) mapped to adaptive-learning principles.</w:t>
         <w:tab/>
         <w:t>66</w:t>
       </w:r>
@@ -4937,10 +4916,8 @@
             <w:tcW w:w="4252" w:type="dxa"/>
           </w:tcPr>
           <w:p>
-            <w:r>
-              <w:rPr>
-                <w:sz w:val="20"/>
-              </w:rPr>
+            <w:r/>
+            <w:r>
               <w:t>LODF</w:t>
             </w:r>
           </w:p>
@@ -5354,6 +5331,7 @@
     <w:p>
       <w:pPr>
         <w:pStyle w:val="Heading1"/>
+        <w:pageBreakBefore/>
       </w:pPr>
       <w:bookmarkStart w:id="4" w:name="_Toc232024496"/>
       <w:r>
@@ -5611,7 +5589,7 @@
         <w:jc w:val="both"/>
       </w:pPr>
       <w:r>
-        <w:t>The learn-to-earn philosophy is therefore the design orientation that links the prototype to the LODF specification. Adaptive learning is proposed as its theoretical and engineering formalisation: performance is presented as movement on a personal trajectory, and challenge is calibrated to the user's evolving capability. The empirical programme motivates this design response but does not yet demonstrate that the complete LODF closes the long-term commitment gap. Its incremental effectiveness is a subject for the next controlled cycle.</w:t>
+        <w:t>The learn-to-earn philosophy is therefore the design orientation that links the prototype to the adaptive-learning framework specification. Adaptive learning is proposed as its theoretical and engineering formalisation: performance is presented as movement on a personal trajectory, and challenge is calibrated to the user's evolving capability. The empirical programme motivates this design response but does not yet demonstrate that the complete adaptive-learning framework closes the long-term commitment gap. Its incremental effectiveness is a subject for the next controlled cycle.</w:t>
       </w:r>
     </w:p>
     <w:p>
@@ -5645,7 +5623,7 @@
         <w:jc w:val="both"/>
       </w:pPr>
       <w:r>
-        <w:t>The Stage-3 findings are one-sided between the two readings: the decoupled game was accepted at the levels the gamification literature predicts, which acquits the theory and the population and convicts the coupling. They do not rule out cohort self-selection, setting, recruitment, health-status, staff-interaction or observation-window differences, so the comparison is described as a between-cohort quasi-experimental decoupling study rather than a single-variable experiment. The residual 35.6-percentage-point difference in the 65-80 band between in-session retention and regular-use intention identifies the practical problem that remained — and it is where the programme found its principal design discovery: adaptive learning, formalised in Chapter 7 as LODF, as the driver that can make returning worthwhile and eventually carry the clinical purpose back into the experience.</w:t>
+        <w:t>The Stage-3 findings are one-sided between the two readings: the decoupled game was accepted at the levels the gamification literature predicts, which acquits the theory and the population and convicts the coupling. They do not rule out cohort self-selection, setting, recruitment, health-status, staff-interaction or observation-window differences, so the comparison is described as a between-cohort quasi-experimental decoupling study rather than a single-variable experiment. The residual 35.6-percentage-point difference in the 65-80 band between in-session retention and regular-use intention identifies the practical problem that remained — and it is where the programme found its principal design discovery: adaptive learning, formalised in Chapter 7 as the adaptive-learning framework, as the driver that can make returning worthwhile and eventually carry the clinical purpose back into the experience.</w:t>
       </w:r>
     </w:p>
     <w:p>
@@ -5675,7 +5653,7 @@
         <w:jc w:val="both"/>
       </w:pPr>
       <w:r>
-        <w:t>Second, the action-research relationship with the Poly Group facility was sustained across Stages 1 and 2. The same management office and nursing team supported the work, and some residents contributed across overlapping observation periods. Stage 3, by contrast, was conducted with a separate Hong Kong community cohort. The action-research cycle therefore involved continuity of problem setting and design learning, not a single repeated cohort across all three stages. The principal theoretical revisions were the movement from FIDS toward the provisional FIAS construct, the shift from a predominantly dispositional reading toward a frame-sensitive account after Stage 3, and the formulation of adaptive learning as a design hypothesis expressed through LODF.</w:t>
+        <w:t>Second, the action-research relationship with the Poly Group facility was sustained across Stages 1 and 2. The same management office and nursing team supported the work, and some residents contributed across overlapping observation periods. Stage 3, by contrast, was conducted with a separate Hong Kong community cohort. The action-research cycle therefore involved continuity of problem setting and design learning, not a single repeated cohort across all three stages. The principal theoretical revisions were the movement from FIDS toward the provisional FIAS construct, the shift from a predominantly dispositional reading toward a frame-sensitive account after Stage 3, and the formulation of adaptive learning as a design hypothesis expressed through the adaptive-learning framework.</w:t>
       </w:r>
     </w:p>
     <w:p>
@@ -5747,7 +5725,7 @@
         <w:jc w:val="both"/>
       </w:pPr>
       <w:r>
-        <w:t>The thesis offers contributions in four registers, and Chapter 8 states them in the hierarchy the evidence supports. Theoretically, the problem finding is FIAS: failure-associated non-return as a post-contact behaviour that standard acceptance and gamification models do not represent, structured by the behavioural-economics account of Table 2.1 (loss aversion, identity-relevant endowment, mental accounting, stereotype threat — proposed as candidate mechanisms, not claimed as directly measured). The scope finding is a boundary condition for gamification theory: the theory transfers to older adults, as Stage 3 confirms, until the gamified activity is attached to a purpose-based technology whose verdicts touch the user's identity-level value propositions. The design discovery is adaptive learning as the behavioural-change driver — continuous improvement at the level of the individual user — with LODF as its engineering formalisation and zero-failure presentation as a supporting element. Methodologically, the thesis contributes the null-hypothesis-plus-attribution architecture (Table 3.1), the dual-purpose mechanic, the QFD evidence-to-design pipeline, a documented AI-assisted development workflow, and the commitment-gap measurement. Empirically, it reports the prospective rejection of H0 in Stage 2 and the theory-rescuing acceptance of the decoupled game in Stage 3, with within-cohort confirmation explicitly retained as future work. Practically, it specifies the adaptive-learning principle and LODF for prospective evaluation on existing infrastructure.</w:t>
+        <w:t>The thesis offers contributions in four registers, and Chapter 8 states them in the hierarchy the evidence supports. Theoretically, the problem finding is FIAS: failure-associated non-return as a post-contact behaviour that standard acceptance and gamification models do not represent, structured by the behavioural-economics account of Table 2.1 (loss aversion, identity-relevant endowment, mental accounting, stereotype threat — proposed as candidate mechanisms, not claimed as directly measured). The scope finding is a boundary condition for gamification theory: the theory transfers to older adults, as Stage 3 confirms, until the gamified activity is attached to a purpose-based technology whose verdicts touch the user's identity-level value propositions. The design discovery is adaptive learning as the behavioural-change driver — continuous improvement at the level of the individual user — with the adaptive-learning framework as its engineering formalisation and zero-failure presentation as a supporting element. Methodologically, the thesis contributes the null-hypothesis-plus-attribution architecture (Table 3.1), the dual-purpose mechanic, the QFD evidence-to-design pipeline, a documented AI-assisted development workflow, and the commitment-gap measurement. Empirically, it reports the prospective rejection of H0 in Stage 2 and the theory-rescuing acceptance of the decoupled game in Stage 3, with within-cohort confirmation explicitly retained as future work. Practically, it specifies the adaptive-learning principle and the adaptive-learning framework for prospective evaluation on existing infrastructure.</w:t>
       </w:r>
     </w:p>
     <w:p>
@@ -5773,8 +5751,7 @@
         <w:jc w:val="both"/>
       </w:pPr>
       <w:r>
-        <w:lastRenderedPageBreak/>
-        <w:t>The thesis does not claim that adaptive learning is the only design lever capable of reducing failure-associated non-return. Adaptive learning is proposed because trajectory framing, mastery-oriented feedback and calibrated challenge are theoretically suited to changing how failure is interpreted. The 35.6-percentage-point commitment gap does not identify adaptive learning as its sole cause; fatigue, physical capacity, access, session burden and other motivational factors remain viable alternatives. Direct comparison of design levers and controlled evaluation of the complete LODF are therefore required.</w:t>
+        <w:t>The thesis does not claim that adaptive learning is the only design lever capable of reducing failure-associated non-return. Adaptive learning is proposed because trajectory framing, mastery-oriented feedback and calibrated challenge are theoretically suited to changing how failure is interpreted. The 35.6-percentage-point commitment gap does not identify adaptive learning as its sole cause; fatigue, physical capacity, access, session burden and other motivational factors remain viable alternatives. Direct comparison of design levers and controlled evaluation of the complete adaptive-learning framework are therefore required.</w:t>
       </w:r>
     </w:p>
     <w:p>
@@ -5792,7 +5769,7 @@
         <w:jc w:val="both"/>
       </w:pPr>
       <w:r>
-        <w:t>The research is organised in three progressive parts that follow the hypothesis architecture. Part I builds the test. Chapter 2 assembles the null hypothesis H0 from the acceptance and gamification literatures, names the gap those literatures leave — every Octalysis drive is a designer-side motivation lever, none addresses abandonment — and lays out the behavioural theory (Table 2.1) that will be needed when H0 fails. Chapter 3 declares the methodology: action research carrying a falsifiable hypothesis, the role of each stage (field signal, prospective test, attribution experiment), the hypothesis architecture (Table 3.1) and the confirmation-versus-discovery discipline. Part II executes it. Chapter 4 reports Stage 1, the retrospective field signal; Chapter 5 reports Stage 2, the prospective test that rejects H0; Chapter 6 reports Stage 3, the attribution experiment that rescues gamification theory, establishes the coupling boundary condition, and — in the commitment gap — forces the design discovery. Part III claims and bounds it. Chapter 7 formalises adaptive learning as LODF; Chapter 8 states the contributions in their evidential hierarchy, with alternative explanations, limitations, ethics and reproducibility; Chapter 9 synthesises the five-step arc and sets out the pre-specified confirmatory programme.</w:t>
+        <w:t>The research is organised in three progressive parts that follow the hypothesis architecture. Part I builds the test. Chapter 2 assembles the null hypothesis H0 from the acceptance and gamification literatures, names the gap those literatures leave — every Octalysis drive is a designer-side motivation lever, none addresses abandonment — and lays out the behavioural theory (Table 2.1) that will be needed when H0 fails. Chapter 3 declares the methodology: action research carrying a falsifiable hypothesis, the role of each stage (field signal, prospective test, attribution experiment), the hypothesis architecture (Table 3.1) and the confirmation-versus-discovery discipline. Part II executes it. Chapter 4 reports Stage 1, the retrospective field signal; Chapter 5 reports Stage 2, the prospective test that rejects H0; Chapter 6 reports Stage 3, the attribution experiment that rescues gamification theory, establishes the coupling boundary condition, and — in the commitment gap — forces the design discovery. Part III claims and bounds it. Chapter 7 formalises adaptive learning as the adaptive-learning framework; Chapter 8 states the contributions in their evidential hierarchy, with alternative explanations, limitations, ethics and reproducibility; Chapter 9 synthesises the five-step arc and sets out the pre-specified confirmatory programme.</w:t>
       </w:r>
     </w:p>
     <w:p>
@@ -5815,6 +5792,7 @@
     <w:p>
       <w:pPr>
         <w:pStyle w:val="Heading1"/>
+        <w:pageBreakBefore/>
       </w:pPr>
       <w:r>
         <w:lastRenderedPageBreak/>
@@ -5869,7 +5847,7 @@
         <w:jc w:val="both"/>
       </w:pPr>
       <w:r>
-        <w:t>Stage five turns the account into design. If failure abandons users because of what failure is made to mean, then design can change the meaning: participant-facing decoupling (tested in Stage 3) and learning-oriented adaptation (proposed as LODF, for prospective testing). The chapter closes with the supporting literature and a synthesis that walks the reader from H0 to its rejection to the design response, with chapter pointers at every step.</w:t>
+        <w:t>Stage five turns the account into design. If failure abandons users because of what failure is made to mean, then design can change the meaning: participant-facing decoupling (tested in Stage 3) and learning-oriented adaptation (proposed as the adaptive-learning framework, for prospective testing). The chapter closes with the supporting literature and a synthesis that walks the reader from H0 to its rejection to the design response, with chapter pointers at every step.</w:t>
       </w:r>
     </w:p>
     <w:p>
@@ -6217,10 +6195,15 @@
             <w:tcW w:type="dxa" w:w="2126"/>
           </w:tcPr>
           <w:p>
-            <w:r/>
+            <w:r>
+              <w:rPr>
+                <w:sz w:val="20"/>
+              </w:rPr>
+            </w:r>
             <w:r>
               <w:rPr>
                 <w:b/>
+                <w:sz w:val="20"/>
               </w:rPr>
               <w:t>Observation H0 cannot explain</w:t>
             </w:r>
@@ -6231,10 +6214,15 @@
             <w:tcW w:type="dxa" w:w="2126"/>
           </w:tcPr>
           <w:p>
-            <w:r/>
+            <w:r>
+              <w:rPr>
+                <w:sz w:val="20"/>
+              </w:rPr>
+            </w:r>
             <w:r>
               <w:rPr>
                 <w:b/>
+                <w:sz w:val="20"/>
               </w:rPr>
               <w:t>Behavioural theory</w:t>
             </w:r>
@@ -6245,10 +6233,15 @@
             <w:tcW w:type="dxa" w:w="2126"/>
           </w:tcPr>
           <w:p>
-            <w:r/>
+            <w:r>
+              <w:rPr>
+                <w:sz w:val="20"/>
+              </w:rPr>
+            </w:r>
             <w:r>
               <w:rPr>
                 <w:b/>
+                <w:sz w:val="20"/>
               </w:rPr>
               <w:t>Construct contributed to FIAS</w:t>
             </w:r>
@@ -6259,10 +6252,15 @@
             <w:tcW w:type="dxa" w:w="2126"/>
           </w:tcPr>
           <w:p>
-            <w:r/>
+            <w:r>
+              <w:rPr>
+                <w:sz w:val="20"/>
+              </w:rPr>
+            </w:r>
             <w:r>
               <w:rPr>
                 <w:b/>
+                <w:sz w:val="20"/>
               </w:rPr>
               <w:t>Prediction generated</w:t>
             </w:r>
@@ -6275,8 +6273,15 @@
             <w:tcW w:type="dxa" w:w="2126"/>
           </w:tcPr>
           <w:p>
-            <w:r/>
-            <w:r>
+            <w:r>
+              <w:rPr>
+                <w:sz w:val="20"/>
+              </w:rPr>
+            </w:r>
+            <w:r>
+              <w:rPr>
+                <w:sz w:val="20"/>
+              </w:rPr>
               <w:t>A single adverse first experience outweighs the design's motivational pull</w:t>
             </w:r>
           </w:p>
@@ -6286,8 +6291,15 @@
             <w:tcW w:type="dxa" w:w="2126"/>
           </w:tcPr>
           <w:p>
-            <w:r/>
-            <w:r>
+            <w:r>
+              <w:rPr>
+                <w:sz w:val="20"/>
+              </w:rPr>
+            </w:r>
+            <w:r>
+              <w:rPr>
+                <w:sz w:val="20"/>
+              </w:rPr>
               <w:t>Prospect theory / loss aversion (Kahneman &amp; Tversky, 1979)</w:t>
             </w:r>
           </w:p>
@@ -6297,8 +6309,15 @@
             <w:tcW w:type="dxa" w:w="2126"/>
           </w:tcPr>
           <w:p>
-            <w:r/>
-            <w:r>
+            <w:r>
+              <w:rPr>
+                <w:sz w:val="20"/>
+              </w:rPr>
+            </w:r>
+            <w:r>
+              <w:rPr>
+                <w:sz w:val="20"/>
+              </w:rPr>
               <w:t>Asymmetric weighting of an adverse result against a valued reference point</w:t>
             </w:r>
           </w:p>
@@ -6308,8 +6327,15 @@
             <w:tcW w:type="dxa" w:w="2126"/>
           </w:tcPr>
           <w:p>
-            <w:r/>
-            <w:r>
+            <w:r>
+              <w:rPr>
+                <w:sz w:val="20"/>
+              </w:rPr>
+            </w:r>
+            <w:r>
+              <w:rPr>
+                <w:sz w:val="20"/>
+              </w:rPr>
               <w:t>First failure is associated with early disengagement (H1, Chapter 5)</w:t>
             </w:r>
           </w:p>
@@ -6321,8 +6347,15 @@
             <w:tcW w:type="dxa" w:w="2126"/>
           </w:tcPr>
           <w:p>
-            <w:r/>
-            <w:r>
+            <w:r>
+              <w:rPr>
+                <w:sz w:val="20"/>
+              </w:rPr>
+            </w:r>
+            <w:r>
+              <w:rPr>
+                <w:sz w:val="20"/>
+              </w:rPr>
               <w:t>Exit persists even when the recorded score improves</w:t>
             </w:r>
           </w:p>
@@ -6332,8 +6365,15 @@
             <w:tcW w:type="dxa" w:w="2126"/>
           </w:tcPr>
           <w:p>
-            <w:r/>
-            <w:r>
+            <w:r>
+              <w:rPr>
+                <w:sz w:val="20"/>
+              </w:rPr>
+            </w:r>
+            <w:r>
+              <w:rPr>
+                <w:sz w:val="20"/>
+              </w:rPr>
               <w:t>Endowment effect (Thaler, 1980; Kahneman, Knetsch &amp; Thaler, 1990)</w:t>
             </w:r>
           </w:p>
@@ -6343,8 +6383,15 @@
             <w:tcW w:type="dxa" w:w="2126"/>
           </w:tcPr>
           <w:p>
-            <w:r/>
-            <w:r>
+            <w:r>
+              <w:rPr>
+                <w:sz w:val="20"/>
+              </w:rPr>
+            </w:r>
+            <w:r>
+              <w:rPr>
+                <w:sz w:val="20"/>
+              </w:rPr>
               <w:t>Identity-relevant endowment: exit protects a valued self-description from revaluation</w:t>
             </w:r>
           </w:p>
@@ -6354,8 +6401,15 @@
             <w:tcW w:type="dxa" w:w="2126"/>
           </w:tcPr>
           <w:p>
-            <w:r/>
-            <w:r>
+            <w:r>
+              <w:rPr>
+                <w:sz w:val="20"/>
+              </w:rPr>
+            </w:r>
+            <w:r>
+              <w:rPr>
+                <w:sz w:val="20"/>
+              </w:rPr>
               <w:t>Objective improvement does not by itself produce return (H4 — the improvement/non-return paradox)</w:t>
             </w:r>
           </w:p>
@@ -6367,8 +6421,15 @@
             <w:tcW w:type="dxa" w:w="2126"/>
           </w:tcPr>
           <w:p>
-            <w:r/>
-            <w:r>
+            <w:r>
+              <w:rPr>
+                <w:sz w:val="20"/>
+              </w:rPr>
+            </w:r>
+            <w:r>
+              <w:rPr>
+                <w:sz w:val="20"/>
+              </w:rPr>
               <w:t>The same event means different things under different frames</w:t>
             </w:r>
           </w:p>
@@ -6378,8 +6439,15 @@
             <w:tcW w:type="dxa" w:w="2126"/>
           </w:tcPr>
           <w:p>
-            <w:r/>
-            <w:r>
+            <w:r>
+              <w:rPr>
+                <w:sz w:val="20"/>
+              </w:rPr>
+            </w:r>
+            <w:r>
+              <w:rPr>
+                <w:sz w:val="20"/>
+              </w:rPr>
               <w:t>Mental accounting (Thaler, 1985)</w:t>
             </w:r>
           </w:p>
@@ -6389,8 +6457,15 @@
             <w:tcW w:type="dxa" w:w="2126"/>
           </w:tcPr>
           <w:p>
-            <w:r/>
-            <w:r>
+            <w:r>
+              <w:rPr>
+                <w:sz w:val="20"/>
+              </w:rPr>
+            </w:r>
+            <w:r>
+              <w:rPr>
+                <w:sz w:val="20"/>
+              </w:rPr>
               <w:t>Clinical framing sorts the session into a high-stakes health account</w:t>
             </w:r>
           </w:p>
@@ -6400,8 +6475,15 @@
             <w:tcW w:type="dxa" w:w="2126"/>
           </w:tcPr>
           <w:p>
-            <w:r/>
-            <w:r>
+            <w:r>
+              <w:rPr>
+                <w:sz w:val="20"/>
+              </w:rPr>
+            </w:r>
+            <w:r>
+              <w:rPr>
+                <w:sz w:val="20"/>
+              </w:rPr>
               <w:t>Removing participant-facing clinical framing increases post-failure return (H5, Stage 3)</w:t>
             </w:r>
           </w:p>
@@ -6413,8 +6495,15 @@
             <w:tcW w:type="dxa" w:w="2126"/>
           </w:tcPr>
           <w:p>
-            <w:r/>
-            <w:r>
+            <w:r>
+              <w:rPr>
+                <w:sz w:val="20"/>
+              </w:rPr>
+            </w:r>
+            <w:r>
+              <w:rPr>
+                <w:sz w:val="20"/>
+              </w:rPr>
               <w:t>Clinical and age-related cues amplify the meaning of failure</w:t>
             </w:r>
           </w:p>
@@ -6424,8 +6513,15 @@
             <w:tcW w:type="dxa" w:w="2126"/>
           </w:tcPr>
           <w:p>
-            <w:r/>
-            <w:r>
+            <w:r>
+              <w:rPr>
+                <w:sz w:val="20"/>
+              </w:rPr>
+            </w:r>
+            <w:r>
+              <w:rPr>
+                <w:sz w:val="20"/>
+              </w:rPr>
               <w:t>Stereotype threat (Steele &amp; Aronson, 1995; Levy et al., 2002)</w:t>
             </w:r>
           </w:p>
@@ -6435,8 +6531,15 @@
             <w:tcW w:type="dxa" w:w="2126"/>
           </w:tcPr>
           <w:p>
-            <w:r/>
-            <w:r>
+            <w:r>
+              <w:rPr>
+                <w:sz w:val="20"/>
+              </w:rPr>
+            </w:r>
+            <w:r>
+              <w:rPr>
+                <w:sz w:val="20"/>
+              </w:rPr>
               <w:t>Salience of age-related decline as the trigger of identity-relevant appraisal</w:t>
             </w:r>
           </w:p>
@@ -6446,9 +6549,16 @@
             <w:tcW w:type="dxa" w:w="2126"/>
           </w:tcPr>
           <w:p>
-            <w:r/>
-            <w:r>
-              <w:t>Threat-reduced framing and coaching improve retry and return (LODF, Chapter 7)</w:t>
+            <w:r>
+              <w:rPr>
+                <w:sz w:val="20"/>
+              </w:rPr>
+            </w:r>
+            <w:r>
+              <w:rPr>
+                <w:sz w:val="20"/>
+              </w:rPr>
+              <w:t>Threat-reduced framing and coaching improve retry and return (the adaptive-learning framework, Chapter 7)</w:t>
             </w:r>
           </w:p>
         </w:tc>
@@ -6459,8 +6569,15 @@
             <w:tcW w:type="dxa" w:w="2126"/>
           </w:tcPr>
           <w:p>
-            <w:r/>
-            <w:r>
+            <w:r>
+              <w:rPr>
+                <w:sz w:val="20"/>
+              </w:rPr>
+            </w:r>
+            <w:r>
+              <w:rPr>
+                <w:sz w:val="20"/>
+              </w:rPr>
               <w:t>Abandonment persisted although the Stage-2 build had already softened in-game loss (lives, forgiving hits)</w:t>
             </w:r>
           </w:p>
@@ -6470,8 +6587,15 @@
             <w:tcW w:type="dxa" w:w="2126"/>
           </w:tcPr>
           <w:p>
-            <w:r/>
-            <w:r>
+            <w:r>
+              <w:rPr>
+                <w:sz w:val="20"/>
+              </w:rPr>
+            </w:r>
+            <w:r>
+              <w:rPr>
+                <w:sz w:val="20"/>
+              </w:rPr>
               <w:t>Octalysis D8 inverted: zero-failure design (§2.6.2C, from this research's observations)</w:t>
             </w:r>
           </w:p>
@@ -6481,8 +6605,15 @@
             <w:tcW w:type="dxa" w:w="2126"/>
           </w:tcPr>
           <w:p>
-            <w:r/>
-            <w:r>
+            <w:r>
+              <w:rPr>
+                <w:sz w:val="20"/>
+              </w:rPr>
+            </w:r>
+            <w:r>
+              <w:rPr>
+                <w:sz w:val="20"/>
+              </w:rPr>
               <w:t>The operative loss is identity-level, outside the game's ledger; verdict cues, not in-game losses, carry it</w:t>
             </w:r>
           </w:p>
@@ -6492,9 +6623,16 @@
             <w:tcW w:type="dxa" w:w="2126"/>
           </w:tcPr>
           <w:p>
-            <w:r/>
-            <w:r>
-              <w:t>Removing terminal failure verdicts (zero-failure states, §5.3.10) plus decoupling increases retry and return (LODF, Chapter 7; isolated test in §8.8)</w:t>
+            <w:r>
+              <w:rPr>
+                <w:sz w:val="20"/>
+              </w:rPr>
+            </w:r>
+            <w:r>
+              <w:rPr>
+                <w:sz w:val="20"/>
+              </w:rPr>
+              <w:t>Removing terminal failure verdicts (zero-failure states, §5.3.10) plus decoupling increases retry and return (the adaptive-learning framework, Chapter 7; isolated test in §8.8)</w:t>
             </w:r>
           </w:p>
         </w:tc>
@@ -6630,7 +6768,7 @@
         <w:jc w:val="both"/>
       </w:pPr>
       <w:r>
-        <w:t>Stage four supplies a candidate mechanism but not a tested design solution. If clinical framing increases the identity relevance of failure, three broad responses follow: reduce threat cues, decouple the engagement layer from participant-facing clinical verdicts, or install a learning trajectory that gives failure a different reference point. The first two are partly represented in the Stage-3 decoupling package. The third is developed as LODF. The key distinction is evidential: Stage 3 evaluates participant-facing decoupling in a separate cohort, whereas the complete adaptive-learning framework remains to be evaluated prospectively.</w:t>
+        <w:t>Stage four supplies a candidate mechanism but not a tested design solution. If clinical framing increases the identity relevance of failure, three broad responses follow: reduce threat cues, decouple the engagement layer from participant-facing clinical verdicts, or install a learning trajectory that gives failure a different reference point. The first two are partly represented in the Stage-3 decoupling package. The third is developed as the adaptive-learning framework. The key distinction is evidential: Stage 3 evaluates participant-facing decoupling in a separate cohort, whereas the complete adaptive-learning framework remains to be evaluated prospectively.</w:t>
       </w:r>
     </w:p>
     <w:p>
@@ -6666,11 +6804,7 @@
         <w:jc w:val="both"/>
       </w:pPr>
       <w:r>
-        <w:t xml:space="preserve">Adaptive learning is not a single technique but a convergence of four established traditions, and naming them explicitly matters because it fixes what the LODF response in Chapter 7 inherits and what it adds. The first tradition is the flow account of optimal experience (Csikszentmihalyi, 1990). Flow arises when the challenge of an activity is matched to the skill of the person attempting it: too little challenge produces boredom, too much produces anxiety, and the narrow band between the two sustains absorbed engagement. The flow band is the operational target of the Stage-2 Layer-2 difficulty system (§5.3.5), whose 80 per cent and 40 per cent success thresholds are a direct implementation of the challenge–skill match. The second tradition is the zone of proximal development (Vygotsky, 1978): learning is most effective at the frontier between what </w:t>
-      </w:r>
-      <w:r>
-        <w:lastRenderedPageBreak/>
-        <w:t>the learner can already do unaided and what they can do with support, and effective instruction continuously relocates that frontier as the learner advances. A learning curve, in this tradition, is not a metaphor but the object of instructional design. The third tradition is desirable difficulty (Bjork &amp; Bjork, 2011): conditions that slow apparent performance during practice — spacing, interleaving, retrieval under effort — improve durable learning, which reframes within-session failure as a feature of an effective curve rather than as evidence of inadequacy. The fourth tradition is the empirical record of intelligent tutoring systems (VanLehn, 2011), which demonstrates that fine-grained, step-level adaptation of feedback and pacing produces learning gains approaching those of human one-to-one tutoring. The four traditions converge on a single design instruction: present the activity as a curve, calibrate the difficulty so the learner stays on the curve, and treat each failure as information about the curve rather than as a verdict on the learner.</w:t>
+        <w:t>Adaptive learning is not a single technique but a convergence of four established traditions, and naming them explicitly matters because it fixes what the adaptive-learning framework response in Chapter 7 inherits and what it adds. The first tradition is the flow account of optimal experience (Csikszentmihalyi, 1990). Flow arises when the challenge of an activity is matched to the skill of the person attempting it: too little challenge produces boredom, too much produces anxiety, and the narrow band between the two sustains absorbed engagement. The flow band is the operational target of the Stage-2 Layer-2 difficulty system (§5.3.5), whose 80 per cent and 40 per cent success thresholds are a direct implementation of the challenge–skill match. The second tradition is the zone of proximal development (Vygotsky, 1978): learning is most effective at the frontier between what the learner can already do unaided and what they can do with support, and effective instruction continuously relocates that frontier as the learner advances. A learning curve, in this tradition, is not a metaphor but the object of instructional design. The third tradition is desirable difficulty (Bjork &amp; Bjork, 2011): conditions that slow apparent performance during practice — spacing, interleaving, retrieval under effort — improve durable learning, which reframes within-session failure as a feature of an effective curve rather than as evidence of inadequacy. The fourth tradition is the empirical record of intelligent tutoring systems (VanLehn, 2011), which demonstrates that fine-grained, step-level adaptation of feedback and pacing produces learning gains approaching those of human one-to-one tutoring. The four traditions converge on a single design instruction: present the activity as a curve, calibrate the difficulty so the learner stays on the curve, and treat each failure as information about the curve rather than as a verdict on the learner.</w:t>
       </w:r>
     </w:p>
     <w:p>
@@ -6717,7 +6851,7 @@
     </w:p>
     <w:p>
       <w:r>
-        <w:t>The evidential status of the concept must be stated carefully, in three steps. First, the Stage-2 build already softened the in-game loss economy substantially — three lives, a neutral first hit, an obstacle-clearing second hit (Table 5.0) — yet retained a conventional terminal Game Over, and FIAS occurred regardless: seventy per cent early disengagement and no observed return (Chapter 5). Softening in-game loss alone was therefore insufficient, which is precisely what the identity-level account predicts. Second, this motivated the complete zero-failure repertoire — non-terminal recovery, mastery, narrative and reframe states — specified at §5.3.10 and implemented in the successor short-run build used for the Stage-3 apparatus lineage. Third, Stage 3 changed the participant-facing frame and the cohort together, so the isolated causal effect of the zero-failure component has not yet been measured; observed non-return fell to 6.7 per cent overall, but a residual non-return and the 35.6-percentage-point commitment gap remained. Zero-failure design is therefore a moderator within the FIAS account and a testable component of LODF (Chapter 7), not a demonstrated cure; its isolated evaluation is pre-specified in the randomised study of §8.8.</w:t>
+        <w:t>The evidential status of the concept must be stated carefully, in three steps. First, the Stage-2 build already softened the in-game loss economy substantially — three lives, a neutral first hit, an obstacle-clearing second hit (Table 5.0) — yet retained a conventional terminal Game Over, and FIAS occurred regardless: seventy per cent early disengagement and no observed return (Chapter 5). Softening in-game loss alone was therefore insufficient, which is precisely what the identity-level account predicts. Second, this motivated the complete zero-failure repertoire — non-terminal recovery, mastery, narrative and reframe states — specified at §5.3.10 and implemented in the successor short-run build used for the Stage-3 apparatus lineage. Third, Stage 3 changed the participant-facing frame and the cohort together, so the isolated causal effect of the zero-failure component has not yet been measured; observed non-return fell to 6.7 per cent overall, but a residual non-return and the 35.6-percentage-point commitment gap remained. Zero-failure design is therefore a moderator within the FIAS account and a testable component of the adaptive-learning framework (Chapter 7), not a demonstrated cure; its isolated evaluation is pre-specified in the randomised study of §8.8.</w:t>
       </w:r>
     </w:p>
     <w:p>
@@ -6757,11 +6891,7 @@
         <w:jc w:val="both"/>
       </w:pPr>
       <w:r>
-        <w:t xml:space="preserve">The five-stage chain therefore closes conceptually rather than through one definitive causal test. Technology acceptance and gamification describe important parts of the engagement surface. Self-efficacy offers a mechanism for withdrawal after difficulty. Behavioural economics supplies candidate explanations for identity-relevant non-return. Stage 3 provides convergent evidence that participant-facing decoupling is associated </w:t>
-      </w:r>
-      <w:r>
-        <w:lastRenderedPageBreak/>
-        <w:t>with substantially greater post-failure return. Adaptive learning and LODF translate those observations into a falsifiable engineering programme. The later chapters preserve this hierarchy between established literature, observed results, inferred mechanisms and proposed design responses.</w:t>
+        <w:t>The five-stage chain therefore closes conceptually rather than through one definitive causal test. Technology acceptance and gamification describe important parts of the engagement surface. Self-efficacy offers a mechanism for withdrawal after difficulty. Behavioural economics supplies candidate explanations for identity-relevant non-return. Stage 3 provides convergent evidence that participant-facing decoupling is associated with substantially greater post-failure return. Adaptive learning and the adaptive-learning framework translate those observations into a falsifiable engineering programme. The later chapters preserve this hierarchy between established literature, observed results, inferred mechanisms and proposed design responses.</w:t>
       </w:r>
     </w:p>
     <w:p>
@@ -6870,7 +7000,7 @@
         <w:jc w:val="both"/>
       </w:pPr>
       <w:r>
-        <w:t>The argument of this chapter can now be read in five plain steps. Step one: the acceptance literature says that fitting a technology to the user's acceptance criteria produces intention and use, and the gamification literature says game mechanics amplify this for older adults — together they yield the null hypothesis H0 of §2.3.5, that a well-made gamified FRA will be accepted and used, and that failure will not drive abandonment. Step two: the data reject H0 — retrospectively in Stage 1 (Chapter 4) and prospectively in Stage 2 (Chapter 5), where seventy per cent of participants disengaged early and none returned, despite an AI-assisted build that satisfied the stack's design criteria. Step three: self-efficacy explains the dropout but not its permanence, and not the improvement/non-return paradox. Step four: the behavioural-economics account structured in Table 2.1 — loss aversion, identity-relevant endowment, mental accounting, stereotype threat — explains precisely the observations H0 cannot, and is named FIAS. Step five: the account implies a design response whose centre is adaptive learning — challenge calibrated to the individual and failure reframed as information about a personal trajectory (§2.6.2A–B) — the behavioural-change driver this programme regards as its principal design discovery. Two components support it: participant-facing decoupling, for which Stage 3 (Chapter 6) provides between-cohort field evidence, and zero-failure presentation, the observation-driven inversion of Octalysis D8 (§2.6.2C). LODF (Chapter 7) is the engineering formalisation of the adaptive-learning proposition, and it awaits prospective testing.</w:t>
+        <w:t>The argument of this chapter can now be read in five plain steps. Step one: the acceptance literature says that fitting a technology to the user's acceptance criteria produces intention and use, and the gamification literature says game mechanics amplify this for older adults — together they yield the null hypothesis H0 of §2.3.5, that a well-made gamified FRA will be accepted and used, and that failure will not drive abandonment. Step two: the data reject H0 — retrospectively in Stage 1 (Chapter 4) and prospectively in Stage 2 (Chapter 5), where seventy per cent of participants disengaged early and none returned, despite an AI-assisted build that satisfied the stack's design criteria. Step three: self-efficacy explains the dropout but not its permanence, and not the improvement/non-return paradox. Step four: the behavioural-economics account structured in Table 2.1 — loss aversion, identity-relevant endowment, mental accounting, stereotype threat — explains precisely the observations H0 cannot, and is named FIAS. Step five: the account implies a design response whose centre is adaptive learning — challenge calibrated to the individual and failure reframed as information about a personal trajectory (§2.6.2A–B) — the behavioural-change driver this programme regards as its principal design discovery. Two components support it: participant-facing decoupling, for which Stage 3 (Chapter 6) provides between-cohort field evidence, and zero-failure presentation, the observation-driven inversion of Octalysis D8 (§2.6.2C). The adaptive-learning framework (Chapter 7) is the engineering formalisation of the adaptive-learning proposition, and it awaits prospective testing.</w:t>
       </w:r>
     </w:p>
     <w:p>
@@ -6901,6 +7031,7 @@
     <w:p>
       <w:pPr>
         <w:pStyle w:val="Heading1"/>
+        <w:pageBreakBefore/>
       </w:pPr>
       <w:r>
         <w:lastRenderedPageBreak/>
@@ -6923,7 +7054,7 @@
         <w:jc w:val="both"/>
       </w:pPr>
       <w:r>
-        <w:t>The programme adopts action research (Lewin, 1946; Stringer, 2014; Reason &amp; Bradbury, 2008) and treats cycles of action, observation, reflection and design revision as part of the inquiry. Two things make this the right frame for the present study, and they should be stated plainly. First, the programme is hypothesis-testing and discovery-generating at the same time. A falsifiable null hypothesis, H0, is built from the literature (§2.3.5) and tested prospectively; but the programme's most important outputs — the FIAS construct, the coupling boundary condition and the adaptive-learning proposition — were not presupposed. They were discovered through the cycles, and action research is the methodology that makes such discovery legitimate rather than accidental: each cycle plans an action, executes it in the field, observes what the plan did not predict, and revises the working theory before the next cycle. Second, the frame mirrors the programme topic. Action research is continuous improvement applied to inquiry itself — plan, act, observe, reflect is the researcher's form of the same iterative loop that the thesis ultimately proposes for the individual user (adaptive learning, §6.8) and practised in the artefact's construction (the AI-assisted build, §5.3.9). The documented revisions are: from FIDS toward the provisional FIAS construct after Stages 1 and 2; from a dispositional account toward the coupling account and its boundary condition after Stage 3; and from decoupling alone toward adaptive learning, formalised as LODF, as the design programme. These revisions are changes in working explanation; they are not independent confirmation of the underlying psychological mechanisms.</w:t>
+        <w:t>The programme adopts action research (Lewin, 1946; Stringer, 2014; Reason &amp; Bradbury, 2008) and treats cycles of action, observation, reflection and design revision as part of the inquiry. Two things make this the right frame for the present study, and they should be stated plainly. First, the programme is hypothesis-testing and discovery-generating at the same time. A falsifiable null hypothesis, H0, is built from the literature (§2.3.5) and tested prospectively; but the programme's most important outputs — the FIAS construct, the coupling boundary condition and the adaptive-learning proposition — were not presupposed. They were discovered through the cycles, and action research is the methodology that makes such discovery legitimate rather than accidental: each cycle plans an action, executes it in the field, observes what the plan did not predict, and revises the working theory before the next cycle. Second, the frame mirrors the programme topic. Action research is continuous improvement applied to inquiry itself — plan, act, observe, reflect is the researcher's form of the same iterative loop that the thesis ultimately proposes for the individual user (adaptive learning, §6.8) and practised in the artefact's construction (the AI-assisted build, §5.3.9). The documented revisions are: from FIDS toward the provisional FIAS construct after Stages 1 and 2; from a dispositional account toward the coupling account and its boundary condition after Stage 3; and from decoupling alone toward adaptive learning, formalised as the adaptive-learning framework, as the design programme. These revisions are changes in working explanation; they are not independent confirmation of the underlying psychological mechanisms.</w:t>
       </w:r>
     </w:p>
     <w:p>
@@ -6990,10 +7121,15 @@
             <w:tcW w:type="dxa" w:w="1701"/>
           </w:tcPr>
           <w:p>
-            <w:r/>
+            <w:r>
+              <w:rPr>
+                <w:sz w:val="20"/>
+              </w:rPr>
+            </w:r>
             <w:r>
               <w:rPr>
                 <w:b/>
+                <w:sz w:val="20"/>
               </w:rPr>
               <w:t>Claim</w:t>
             </w:r>
@@ -7004,10 +7140,15 @@
             <w:tcW w:type="dxa" w:w="1701"/>
           </w:tcPr>
           <w:p>
-            <w:r/>
+            <w:r>
+              <w:rPr>
+                <w:sz w:val="20"/>
+              </w:rPr>
+            </w:r>
             <w:r>
               <w:rPr>
                 <w:b/>
+                <w:sz w:val="20"/>
               </w:rPr>
               <w:t>Origin</w:t>
             </w:r>
@@ -7018,10 +7159,15 @@
             <w:tcW w:type="dxa" w:w="1701"/>
           </w:tcPr>
           <w:p>
-            <w:r/>
+            <w:r>
+              <w:rPr>
+                <w:sz w:val="20"/>
+              </w:rPr>
+            </w:r>
             <w:r>
               <w:rPr>
                 <w:b/>
+                <w:sz w:val="20"/>
               </w:rPr>
               <w:t>Stated</w:t>
             </w:r>
@@ -7032,10 +7178,15 @@
             <w:tcW w:type="dxa" w:w="1701"/>
           </w:tcPr>
           <w:p>
-            <w:r/>
+            <w:r>
+              <w:rPr>
+                <w:sz w:val="20"/>
+              </w:rPr>
+            </w:r>
             <w:r>
               <w:rPr>
                 <w:b/>
+                <w:sz w:val="20"/>
               </w:rPr>
               <w:t>Tested / examined</w:t>
             </w:r>
@@ -7046,10 +7197,15 @@
             <w:tcW w:type="dxa" w:w="1701"/>
           </w:tcPr>
           <w:p>
-            <w:r/>
+            <w:r>
+              <w:rPr>
+                <w:sz w:val="20"/>
+              </w:rPr>
+            </w:r>
             <w:r>
               <w:rPr>
                 <w:b/>
+                <w:sz w:val="20"/>
               </w:rPr>
               <w:t>Status in this thesis</w:t>
             </w:r>
@@ -7062,8 +7218,15 @@
             <w:tcW w:type="dxa" w:w="1701"/>
           </w:tcPr>
           <w:p>
-            <w:r/>
-            <w:r>
+            <w:r>
+              <w:rPr>
+                <w:sz w:val="20"/>
+              </w:rPr>
+            </w:r>
+            <w:r>
+              <w:rPr>
+                <w:sz w:val="20"/>
+              </w:rPr>
               <w:t>H0 — gamified FRA satisfying TAM/STAM + Octalysis sustains elderly acceptance; failure does not produce abandonment</w:t>
             </w:r>
           </w:p>
@@ -7073,8 +7236,15 @@
             <w:tcW w:type="dxa" w:w="1701"/>
           </w:tcPr>
           <w:p>
-            <w:r/>
-            <w:r>
+            <w:r>
+              <w:rPr>
+                <w:sz w:val="20"/>
+              </w:rPr>
+            </w:r>
+            <w:r>
+              <w:rPr>
+                <w:sz w:val="20"/>
+              </w:rPr>
               <w:t>Literature (acceptance + gamification)</w:t>
             </w:r>
           </w:p>
@@ -7084,8 +7254,15 @@
             <w:tcW w:type="dxa" w:w="1701"/>
           </w:tcPr>
           <w:p>
-            <w:r/>
-            <w:r>
+            <w:r>
+              <w:rPr>
+                <w:sz w:val="20"/>
+              </w:rPr>
+            </w:r>
+            <w:r>
+              <w:rPr>
+                <w:sz w:val="20"/>
+              </w:rPr>
               <w:t>§2.3.5; §5.1</w:t>
             </w:r>
           </w:p>
@@ -7095,8 +7272,15 @@
             <w:tcW w:type="dxa" w:w="1701"/>
           </w:tcPr>
           <w:p>
-            <w:r/>
-            <w:r>
+            <w:r>
+              <w:rPr>
+                <w:sz w:val="20"/>
+              </w:rPr>
+            </w:r>
+            <w:r>
+              <w:rPr>
+                <w:sz w:val="20"/>
+              </w:rPr>
               <w:t>Stage 1 retrospectively (Ch 4); Stage 2 prospectively (Ch 5)</w:t>
             </w:r>
           </w:p>
@@ -7106,8 +7290,15 @@
             <w:tcW w:type="dxa" w:w="1701"/>
           </w:tcPr>
           <w:p>
-            <w:r/>
-            <w:r>
+            <w:r>
+              <w:rPr>
+                <w:sz w:val="20"/>
+              </w:rPr>
+            </w:r>
+            <w:r>
+              <w:rPr>
+                <w:sz w:val="20"/>
+              </w:rPr>
               <w:t>Rejected</w:t>
             </w:r>
           </w:p>
@@ -7119,8 +7310,15 @@
             <w:tcW w:type="dxa" w:w="1701"/>
           </w:tcPr>
           <w:p>
-            <w:r/>
-            <w:r>
+            <w:r>
+              <w:rPr>
+                <w:sz w:val="20"/>
+              </w:rPr>
+            </w:r>
+            <w:r>
+              <w:rPr>
+                <w:sz w:val="20"/>
+              </w:rPr>
               <w:t>H1–H4 — directional hypotheses on first failure, re-engagement, social comparison, and the improvement/non-return paradox</w:t>
             </w:r>
           </w:p>
@@ -7130,8 +7328,15 @@
             <w:tcW w:type="dxa" w:w="1701"/>
           </w:tcPr>
           <w:p>
-            <w:r/>
-            <w:r>
+            <w:r>
+              <w:rPr>
+                <w:sz w:val="20"/>
+              </w:rPr>
+            </w:r>
+            <w:r>
+              <w:rPr>
+                <w:sz w:val="20"/>
+              </w:rPr>
               <w:t>Stage-1 observations</w:t>
             </w:r>
           </w:p>
@@ -7141,8 +7346,15 @@
             <w:tcW w:type="dxa" w:w="1701"/>
           </w:tcPr>
           <w:p>
-            <w:r/>
-            <w:r>
+            <w:r>
+              <w:rPr>
+                <w:sz w:val="20"/>
+              </w:rPr>
+            </w:r>
+            <w:r>
+              <w:rPr>
+                <w:sz w:val="20"/>
+              </w:rPr>
               <w:t>§5.1</w:t>
             </w:r>
           </w:p>
@@ -7152,8 +7364,15 @@
             <w:tcW w:type="dxa" w:w="1701"/>
           </w:tcPr>
           <w:p>
-            <w:r/>
-            <w:r>
+            <w:r>
+              <w:rPr>
+                <w:sz w:val="20"/>
+              </w:rPr>
+            </w:r>
+            <w:r>
+              <w:rPr>
+                <w:sz w:val="20"/>
+              </w:rPr>
               <w:t>Stage 2 (Ch 5)</w:t>
             </w:r>
           </w:p>
@@ -7163,8 +7382,15 @@
             <w:tcW w:type="dxa" w:w="1701"/>
           </w:tcPr>
           <w:p>
-            <w:r/>
-            <w:r>
+            <w:r>
+              <w:rPr>
+                <w:sz w:val="20"/>
+              </w:rPr>
+            </w:r>
+            <w:r>
+              <w:rPr>
+                <w:sz w:val="20"/>
+              </w:rPr>
               <w:t>Directionally supported within a small single-site sample</w:t>
             </w:r>
           </w:p>
@@ -7176,8 +7402,15 @@
             <w:tcW w:type="dxa" w:w="1701"/>
           </w:tcPr>
           <w:p>
-            <w:r/>
-            <w:r>
+            <w:r>
+              <w:rPr>
+                <w:sz w:val="20"/>
+              </w:rPr>
+            </w:r>
+            <w:r>
+              <w:rPr>
+                <w:sz w:val="20"/>
+              </w:rPr>
               <w:t>H5 and the Stage-3 predictions — decoupling is associated with lower non-return and post-failure return</w:t>
             </w:r>
           </w:p>
@@ -7187,8 +7420,15 @@
             <w:tcW w:type="dxa" w:w="1701"/>
           </w:tcPr>
           <w:p>
-            <w:r/>
-            <w:r>
+            <w:r>
+              <w:rPr>
+                <w:sz w:val="20"/>
+              </w:rPr>
+            </w:r>
+            <w:r>
+              <w:rPr>
+                <w:sz w:val="20"/>
+              </w:rPr>
               <w:t>Stage-2 findings (mental-accounting row of Table 2.1)</w:t>
             </w:r>
           </w:p>
@@ -7198,8 +7438,15 @@
             <w:tcW w:type="dxa" w:w="1701"/>
           </w:tcPr>
           <w:p>
-            <w:r/>
-            <w:r>
+            <w:r>
+              <w:rPr>
+                <w:sz w:val="20"/>
+              </w:rPr>
+            </w:r>
+            <w:r>
+              <w:rPr>
+                <w:sz w:val="20"/>
+              </w:rPr>
               <w:t>§5.1; §6.2</w:t>
             </w:r>
           </w:p>
@@ -7209,8 +7456,15 @@
             <w:tcW w:type="dxa" w:w="1701"/>
           </w:tcPr>
           <w:p>
-            <w:r/>
-            <w:r>
+            <w:r>
+              <w:rPr>
+                <w:sz w:val="20"/>
+              </w:rPr>
+            </w:r>
+            <w:r>
+              <w:rPr>
+                <w:sz w:val="20"/>
+              </w:rPr>
               <w:t>Stage 3 (Ch 6)</w:t>
             </w:r>
           </w:p>
@@ -7220,8 +7474,15 @@
             <w:tcW w:type="dxa" w:w="1701"/>
           </w:tcPr>
           <w:p>
-            <w:r/>
-            <w:r>
+            <w:r>
+              <w:rPr>
+                <w:sz w:val="20"/>
+              </w:rPr>
+            </w:r>
+            <w:r>
+              <w:rPr>
+                <w:sz w:val="20"/>
+              </w:rPr>
               <w:t>Supported as association; attribution bounded by the between-cohort design</w:t>
             </w:r>
           </w:p>
@@ -7233,8 +7494,15 @@
             <w:tcW w:type="dxa" w:w="1701"/>
           </w:tcPr>
           <w:p>
-            <w:r/>
-            <w:r>
+            <w:r>
+              <w:rPr>
+                <w:sz w:val="20"/>
+              </w:rPr>
+            </w:r>
+            <w:r>
+              <w:rPr>
+                <w:sz w:val="20"/>
+              </w:rPr>
               <w:t>Adaptive-learning proposition — individual-level continuous improvement as the behavioural-change driver that can re-attach clinical purpose</w:t>
             </w:r>
           </w:p>
@@ -7244,8 +7512,15 @@
             <w:tcW w:type="dxa" w:w="1701"/>
           </w:tcPr>
           <w:p>
-            <w:r/>
-            <w:r>
+            <w:r>
+              <w:rPr>
+                <w:sz w:val="20"/>
+              </w:rPr>
+            </w:r>
+            <w:r>
+              <w:rPr>
+                <w:sz w:val="20"/>
+              </w:rPr>
               <w:t>Discovery: forced by the H0 rejection and the Stage-3 commitment gap</w:t>
             </w:r>
           </w:p>
@@ -7255,9 +7530,16 @@
             <w:tcW w:type="dxa" w:w="1701"/>
           </w:tcPr>
           <w:p>
-            <w:r/>
-            <w:r>
-              <w:t>§6.8; Ch 7 (LODF)</w:t>
+            <w:r>
+              <w:rPr>
+                <w:sz w:val="20"/>
+              </w:rPr>
+            </w:r>
+            <w:r>
+              <w:rPr>
+                <w:sz w:val="20"/>
+              </w:rPr>
+              <w:t>§6.8; Ch 7 (the adaptive-learning framework)</w:t>
             </w:r>
           </w:p>
         </w:tc>
@@ -7266,8 +7548,15 @@
             <w:tcW w:type="dxa" w:w="1701"/>
           </w:tcPr>
           <w:p>
-            <w:r/>
-            <w:r>
+            <w:r>
+              <w:rPr>
+                <w:sz w:val="20"/>
+              </w:rPr>
+            </w:r>
+            <w:r>
+              <w:rPr>
+                <w:sz w:val="20"/>
+              </w:rPr>
               <w:t>Not yet tested in isolation</w:t>
             </w:r>
           </w:p>
@@ -7277,8 +7566,15 @@
             <w:tcW w:type="dxa" w:w="1701"/>
           </w:tcPr>
           <w:p>
-            <w:r/>
-            <w:r>
+            <w:r>
+              <w:rPr>
+                <w:sz w:val="20"/>
+              </w:rPr>
+            </w:r>
+            <w:r>
+              <w:rPr>
+                <w:sz w:val="20"/>
+              </w:rPr>
               <w:t>Proposed; isolated evaluation pre-specified in §8.8 and instrumented in §3.6</w:t>
             </w:r>
           </w:p>
@@ -7307,7 +7603,6 @@
           <w:b/>
           <w:highlight w:val="yellow"/>
         </w:rPr>
-        <w:t>[AUTHOR: optionally regenerate Figure 3.1 so its stage labels carry the same terms — 'field signal', 'H0 test', 'attribution experiment', 'formalisation' — used in Table 3.1.]</w:t>
       </w:r>
     </w:p>
     <w:p>
@@ -7317,66 +7612,37 @@
         <w:jc w:val="center"/>
       </w:pPr>
       <w:r>
-        <w:rPr>
-          <w:noProof/>
-        </w:rPr>
         <w:drawing>
-          <wp:anchor distT="0" distB="0" distL="114300" distR="114300" simplePos="0" relativeHeight="251658240" behindDoc="0" locked="0" layoutInCell="1" allowOverlap="1" wp14:anchorId="7754B632" wp14:editId="6ED53378">
-            <wp:simplePos x="0" y="0"/>
-            <wp:positionH relativeFrom="column">
-              <wp:posOffset>-687705</wp:posOffset>
-            </wp:positionH>
-            <wp:positionV relativeFrom="paragraph">
-              <wp:posOffset>22860</wp:posOffset>
-            </wp:positionV>
-            <wp:extent cx="6443345" cy="3281045"/>
-            <wp:effectExtent l="0" t="0" r="0" b="0"/>
-            <wp:wrapTopAndBottom/>
-            <wp:docPr id="1" name="Picture 1"/>
+          <wp:inline xmlns:a="http://schemas.openxmlformats.org/drawingml/2006/main" xmlns:pic="http://schemas.openxmlformats.org/drawingml/2006/picture">
+            <wp:extent cx="5669280" cy="2430156"/>
+            <wp:docPr id="18" name="Picture 18"/>
             <wp:cNvGraphicFramePr>
-              <a:graphicFrameLocks xmlns:a="http://schemas.openxmlformats.org/drawingml/2006/main" noChangeAspect="1"/>
+              <a:graphicFrameLocks noChangeAspect="1"/>
             </wp:cNvGraphicFramePr>
-            <a:graphic xmlns:a="http://schemas.openxmlformats.org/drawingml/2006/main">
+            <a:graphic>
               <a:graphicData uri="http://schemas.openxmlformats.org/drawingml/2006/picture">
-                <pic:pic xmlns:pic="http://schemas.openxmlformats.org/drawingml/2006/picture">
+                <pic:pic>
                   <pic:nvPicPr>
                     <pic:cNvPr id="0" name="fig_3_1.png"/>
                     <pic:cNvPicPr/>
                   </pic:nvPicPr>
-                  <pic:blipFill rotWithShape="1">
-                    <a:blip r:embed="rId9"/>
-                    <a:srcRect b="12216"/>
+                  <pic:blipFill>
+                    <a:blip r:embed="rId27"/>
                     <a:stretch>
                       <a:fillRect/>
                     </a:stretch>
                   </pic:blipFill>
-                  <pic:spPr bwMode="auto">
+                  <pic:spPr>
                     <a:xfrm>
                       <a:off x="0" y="0"/>
-                      <a:ext cx="6443345" cy="3281045"/>
+                      <a:ext cx="5669280" cy="2430156"/>
                     </a:xfrm>
-                    <a:prstGeom prst="rect">
-                      <a:avLst/>
-                    </a:prstGeom>
-                    <a:ln>
-                      <a:noFill/>
-                    </a:ln>
-                    <a:extLst>
-                      <a:ext uri="{53640926-AAD7-44D8-BBD7-CCE9431645EC}">
-                        <a14:shadowObscured xmlns:a14="http://schemas.microsoft.com/office/drawing/2010/main"/>
-                      </a:ext>
-                    </a:extLst>
+                    <a:prstGeom prst="rect"/>
                   </pic:spPr>
                 </pic:pic>
               </a:graphicData>
             </a:graphic>
-            <wp14:sizeRelH relativeFrom="page">
-              <wp14:pctWidth>0</wp14:pctWidth>
-            </wp14:sizeRelH>
-            <wp14:sizeRelV relativeFrom="page">
-              <wp14:pctHeight>0</wp14:pctHeight>
-            </wp14:sizeRelV>
-          </wp:anchor>
+          </wp:inline>
         </w:drawing>
       </w:r>
     </w:p>
@@ -7386,7 +7652,7 @@
         <w:jc w:val="center"/>
       </w:pPr>
       <w:r>
-        <w:t>Figure 3.1. Three-stage action research programme. Each stage produces an empirical output and a theoretical revision; the three stages converge on the proposed LODF design framework and the future-work programme. The labels in the diagram are programme-logic shorthand: 'clinical benefit paradox' denotes the observed score-improvement/non-return pattern, while 'adaptive learning' denotes a proposed design response rather than a directly measured mechanism.</w:t>
+        <w:t>Figure 3.1. Three-stage action research programme as an action-research logic model: Stage 1 supplies the field signal, Stage 2 the prospective H0 test, Stage 3 the attribution experiment; the stages converge on the adaptive-learning formalisation of Chapter 7 and the confirmatory programme of §8.8. Each stage produces an empirical output and a theoretical revision.</w:t>
       </w:r>
     </w:p>
     <w:p>
@@ -7464,7 +7730,7 @@
         <w:jc w:val="both"/>
       </w:pPr>
       <w:r>
-        <w:t>This section converts the programme's discovery into a confirmable claim. The adaptive-learning proposition of §6.8 and Chapter 7 rests on the hypothesis that learning-trajectory appraisal can reduce the dominance of an endowment-protective interpretation of failure. The present stages support this indirectly through behavioural patterns; they do not measure the proposed mechanism or test the complete LODF. Methodological honesty therefore requires an instrumentation roadmap that converts each inferred operator into a measured variable and pre-specifies what evidence would disconfirm the account.</w:t>
+        <w:t>This section converts the programme's discovery into a confirmable claim. The adaptive-learning proposition of §6.8 and Chapter 7 rests on the hypothesis that learning-trajectory appraisal can reduce the dominance of an endowment-protective interpretation of failure. The present stages support this indirectly through behavioural patterns; they do not measure the proposed mechanism or test the complete adaptive-learning framework. Methodological honesty therefore requires an instrumentation roadmap that converts each inferred operator into a measured variable and pre-specifies what evidence would disconfirm the account.</w:t>
       </w:r>
     </w:p>
     <w:p>
@@ -7496,12 +7762,13 @@
         </w:rPr>
       </w:pPr>
       <w:r>
-        <w:t>Interpretive rule for the remainder of the thesis: observed results are reported as observations; mental accounting, endowment, stereotype threat and entropy are candidate explanations; LODF and environment-grounded adaptation are proposed engineering responses. This hierarchy is maintained so that the thesis's originality does not depend on overstating causal certainty.</w:t>
+        <w:t>Interpretive rule for the remainder of the thesis: observed results are reported as observations; mental accounting, endowment, stereotype threat and entropy are candidate explanations; the adaptive-learning framework and environment-grounded adaptation are proposed engineering responses. This hierarchy is maintained so that the thesis's originality does not depend on overstating causal certainty.</w:t>
       </w:r>
     </w:p>
     <w:p>
       <w:pPr>
         <w:pStyle w:val="Heading1"/>
+        <w:pageBreakBefore/>
       </w:pPr>
       <w:r>
         <w:t>Chapter 4 Stage 1 — From FIDS to FIAS</w:t>
@@ -7576,26 +7843,22 @@
         <w:jc w:val="center"/>
       </w:pPr>
       <w:r>
-        <w:rPr>
-          <w:noProof/>
-        </w:rPr>
         <w:drawing>
-          <wp:inline distT="0" distB="0" distL="0" distR="0" wp14:anchorId="034C8673" wp14:editId="0B3636CC">
-            <wp:extent cx="5611493" cy="3255948"/>
-            <wp:effectExtent l="0" t="0" r="2540" b="0"/>
-            <wp:docPr id="2" name="Picture 2"/>
+          <wp:inline xmlns:a="http://schemas.openxmlformats.org/drawingml/2006/main" xmlns:pic="http://schemas.openxmlformats.org/drawingml/2006/picture">
+            <wp:extent cx="5669280" cy="2631586"/>
+            <wp:docPr id="19" name="Picture 19"/>
             <wp:cNvGraphicFramePr>
-              <a:graphicFrameLocks xmlns:a="http://schemas.openxmlformats.org/drawingml/2006/main" noChangeAspect="1"/>
+              <a:graphicFrameLocks noChangeAspect="1"/>
             </wp:cNvGraphicFramePr>
-            <a:graphic xmlns:a="http://schemas.openxmlformats.org/drawingml/2006/main">
+            <a:graphic>
               <a:graphicData uri="http://schemas.openxmlformats.org/drawingml/2006/picture">
-                <pic:pic xmlns:pic="http://schemas.openxmlformats.org/drawingml/2006/picture">
+                <pic:pic>
                   <pic:nvPicPr>
-                    <pic:cNvPr id="0" name="fig_4_1A.png"/>
+                    <pic:cNvPr id="0" name="fig_4_1a.png"/>
                     <pic:cNvPicPr/>
                   </pic:nvPicPr>
                   <pic:blipFill>
-                    <a:blip r:embed="rId10"/>
+                    <a:blip r:embed="rId28"/>
                     <a:stretch>
                       <a:fillRect/>
                     </a:stretch>
@@ -7603,11 +7866,9 @@
                   <pic:spPr>
                     <a:xfrm>
                       <a:off x="0" y="0"/>
-                      <a:ext cx="5636431" cy="3270418"/>
+                      <a:ext cx="5669280" cy="2631586"/>
                     </a:xfrm>
-                    <a:prstGeom prst="rect">
-                      <a:avLst/>
-                    </a:prstGeom>
+                    <a:prstGeom prst="rect"/>
                   </pic:spPr>
                 </pic:pic>
               </a:graphicData>
@@ -8492,6 +8753,7 @@
     <w:p>
       <w:pPr>
         <w:pStyle w:val="Heading1"/>
+        <w:pageBreakBefore/>
       </w:pPr>
       <w:r>
         <w:lastRenderedPageBreak/>
@@ -8607,26 +8869,22 @@
         <w:jc w:val="center"/>
       </w:pPr>
       <w:r>
-        <w:rPr>
-          <w:noProof/>
-        </w:rPr>
         <w:drawing>
-          <wp:inline distT="0" distB="0" distL="0" distR="0" wp14:anchorId="7670B86A" wp14:editId="5D5FAF05">
-            <wp:extent cx="5120640" cy="3021650"/>
-            <wp:effectExtent l="0" t="0" r="0" b="0"/>
-            <wp:docPr id="3" name="Picture 3"/>
+          <wp:inline xmlns:a="http://schemas.openxmlformats.org/drawingml/2006/main" xmlns:pic="http://schemas.openxmlformats.org/drawingml/2006/picture">
+            <wp:extent cx="5669280" cy="3229378"/>
+            <wp:docPr id="20" name="Picture 20"/>
             <wp:cNvGraphicFramePr>
-              <a:graphicFrameLocks xmlns:a="http://schemas.openxmlformats.org/drawingml/2006/main" noChangeAspect="1"/>
+              <a:graphicFrameLocks noChangeAspect="1"/>
             </wp:cNvGraphicFramePr>
-            <a:graphic xmlns:a="http://schemas.openxmlformats.org/drawingml/2006/main">
+            <a:graphic>
               <a:graphicData uri="http://schemas.openxmlformats.org/drawingml/2006/picture">
-                <pic:pic xmlns:pic="http://schemas.openxmlformats.org/drawingml/2006/picture">
+                <pic:pic>
                   <pic:nvPicPr>
                     <pic:cNvPr id="0" name="fig_5_0.png"/>
                     <pic:cNvPicPr/>
                   </pic:nvPicPr>
                   <pic:blipFill>
-                    <a:blip r:embed="rId11"/>
+                    <a:blip r:embed="rId29"/>
                     <a:stretch>
                       <a:fillRect/>
                     </a:stretch>
@@ -8634,11 +8892,9 @@
                   <pic:spPr>
                     <a:xfrm>
                       <a:off x="0" y="0"/>
-                      <a:ext cx="5120640" cy="3021650"/>
+                      <a:ext cx="5669280" cy="3229378"/>
                     </a:xfrm>
-                    <a:prstGeom prst="rect">
-                      <a:avLst/>
-                    </a:prstGeom>
+                    <a:prstGeom prst="rect"/>
                   </pic:spPr>
                 </pic:pic>
               </a:graphicData>
@@ -9175,11 +9431,7 @@
         <w:jc w:val="both"/>
       </w:pPr>
       <w:r>
-        <w:t xml:space="preserve">Three properties of the integration matter for the rest of the chapter. First, the COP stream that the skiing game consumes at 60 Hz is the same stream that FRA Step 1 consumes; nothing about the integration prevents the FRA510S pipeline from running silently from the same data. The pre/post FRA index reported in §5.5 is computed from this silent pipeline; the comprehensive score and risk-factor profile are stored on the clinician-side terminal and are never displayed on the play screen. Second, the Assessment state is the only point at which the participant is asked, in language they can read, what kind of player they are; that input drives the difficulty multiplier table and is how the system makes itself </w:t>
-      </w:r>
-      <w:r>
-        <w:lastRenderedPageBreak/>
-        <w:t>appropriate for an elderly cohort without rendering a fail-state in the first run. Third, the Game Over state is retained in the Stage-2 build for behavioural-economic measurement: the construct that the thesis names — FIAS — is most cleanly observed in the presence of a verdict-shaped fail-state, which is precisely what the Stage-2 build provides. The loss-free, non-terminal repertoire introduced at §5.3.10 is the design response that the Stage-3 result and the Chapter 7 LODF prescription motivate; it is the natural successor build, and Figure 5.0 shows where it would be installed in the integration map (the L5–L6 block on the player-facing column).</w:t>
+        <w:t>Three properties of the integration matter for the rest of the chapter. First, the COP stream that the skiing game consumes at 60 Hz is the same stream that FRA Step 1 consumes; nothing about the integration prevents the FRA510S pipeline from running silently from the same data. The pre/post FRA index reported in §5.5 is computed from this silent pipeline; the comprehensive score and risk-factor profile are stored on the clinician-side terminal and are never displayed on the play screen. Second, the Assessment state is the only point at which the participant is asked, in language they can read, what kind of player they are; that input drives the difficulty multiplier table and is how the system makes itself appropriate for an elderly cohort without rendering a fail-state in the first run. Third, the Game Over state is retained in the Stage-2 build for behavioural-economic measurement: the construct that the thesis names — FIAS — is most cleanly observed in the presence of a verdict-shaped fail-state, which is precisely what the Stage-2 build provides. The loss-free, non-terminal repertoire introduced at §5.3.10 is the design response that the Stage-3 result and the Chapter 7 adaptive-learning prescription motivate; it is the natural successor build, and Figure 5.0 shows where it would be installed in the integration map (the L5–L6 block on the player-facing column).</w:t>
       </w:r>
     </w:p>
     <w:p>
@@ -9392,48 +9644,32 @@
         <w:jc w:val="center"/>
       </w:pPr>
       <w:r>
-        <w:rPr>
-          <w:noProof/>
-        </w:rPr>
-        <w:lastRenderedPageBreak/>
         <w:drawing>
-          <wp:inline distT="0" distB="0" distL="0" distR="0" wp14:anchorId="4AB19B6A" wp14:editId="47C9D2D5">
-            <wp:extent cx="4921878" cy="3142440"/>
-            <wp:effectExtent l="0" t="0" r="0" b="0"/>
-            <wp:docPr id="5" name="Picture 5"/>
+          <wp:inline xmlns:a="http://schemas.openxmlformats.org/drawingml/2006/main" xmlns:pic="http://schemas.openxmlformats.org/drawingml/2006/picture">
+            <wp:extent cx="5120640" cy="3220933"/>
+            <wp:docPr id="21" name="Picture 21"/>
             <wp:cNvGraphicFramePr>
-              <a:graphicFrameLocks xmlns:a="http://schemas.openxmlformats.org/drawingml/2006/main" noChangeAspect="1"/>
+              <a:graphicFrameLocks noChangeAspect="1"/>
             </wp:cNvGraphicFramePr>
-            <a:graphic xmlns:a="http://schemas.openxmlformats.org/drawingml/2006/main">
+            <a:graphic>
               <a:graphicData uri="http://schemas.openxmlformats.org/drawingml/2006/picture">
-                <pic:pic xmlns:pic="http://schemas.openxmlformats.org/drawingml/2006/picture">
+                <pic:pic>
                   <pic:nvPicPr>
                     <pic:cNvPr id="0" name="fig_5_2.png"/>
                     <pic:cNvPicPr/>
                   </pic:nvPicPr>
-                  <pic:blipFill rotWithShape="1">
-                    <a:blip r:embed="rId13"/>
-                    <a:srcRect l="13797" r="2204" b="19356"/>
+                  <pic:blipFill>
+                    <a:blip r:embed="rId30"/>
                     <a:stretch>
                       <a:fillRect/>
                     </a:stretch>
                   </pic:blipFill>
-                  <pic:spPr bwMode="auto">
+                  <pic:spPr>
                     <a:xfrm>
                       <a:off x="0" y="0"/>
-                      <a:ext cx="4967173" cy="3171359"/>
+                      <a:ext cx="5120640" cy="3220933"/>
                     </a:xfrm>
-                    <a:prstGeom prst="rect">
-                      <a:avLst/>
-                    </a:prstGeom>
-                    <a:ln>
-                      <a:noFill/>
-                    </a:ln>
-                    <a:extLst>
-                      <a:ext uri="{53640926-AAD7-44D8-BBD7-CCE9431645EC}">
-                        <a14:shadowObscured xmlns:a14="http://schemas.microsoft.com/office/drawing/2010/main"/>
-                      </a:ext>
-                    </a:extLst>
+                    <a:prstGeom prst="rect"/>
                   </pic:spPr>
                 </pic:pic>
               </a:graphicData>
@@ -9798,47 +10034,32 @@
         <w:jc w:val="center"/>
       </w:pPr>
       <w:r>
-        <w:rPr>
-          <w:noProof/>
-        </w:rPr>
         <w:drawing>
-          <wp:inline distT="0" distB="0" distL="0" distR="0" wp14:anchorId="22206955" wp14:editId="6CE23062">
-            <wp:extent cx="5629521" cy="2578486"/>
-            <wp:effectExtent l="0" t="0" r="0" b="0"/>
-            <wp:docPr id="6" name="Picture 6"/>
+          <wp:inline xmlns:a="http://schemas.openxmlformats.org/drawingml/2006/main" xmlns:pic="http://schemas.openxmlformats.org/drawingml/2006/picture">
+            <wp:extent cx="5669280" cy="2829767"/>
+            <wp:docPr id="22" name="Picture 22"/>
             <wp:cNvGraphicFramePr>
-              <a:graphicFrameLocks xmlns:a="http://schemas.openxmlformats.org/drawingml/2006/main" noChangeAspect="1"/>
+              <a:graphicFrameLocks noChangeAspect="1"/>
             </wp:cNvGraphicFramePr>
-            <a:graphic xmlns:a="http://schemas.openxmlformats.org/drawingml/2006/main">
+            <a:graphic>
               <a:graphicData uri="http://schemas.openxmlformats.org/drawingml/2006/picture">
-                <pic:pic xmlns:pic="http://schemas.openxmlformats.org/drawingml/2006/picture">
+                <pic:pic>
                   <pic:nvPicPr>
                     <pic:cNvPr id="0" name="fig_5_3.png"/>
                     <pic:cNvPicPr/>
                   </pic:nvPicPr>
-                  <pic:blipFill rotWithShape="1">
-                    <a:blip r:embed="rId14"/>
-                    <a:srcRect l="3546" t="7540" r="4573" b="22177"/>
+                  <pic:blipFill>
+                    <a:blip r:embed="rId31"/>
                     <a:stretch>
                       <a:fillRect/>
                     </a:stretch>
                   </pic:blipFill>
-                  <pic:spPr bwMode="auto">
+                  <pic:spPr>
                     <a:xfrm>
                       <a:off x="0" y="0"/>
-                      <a:ext cx="5695568" cy="2608738"/>
+                      <a:ext cx="5669280" cy="2829767"/>
                     </a:xfrm>
-                    <a:prstGeom prst="rect">
-                      <a:avLst/>
-                    </a:prstGeom>
-                    <a:ln>
-                      <a:noFill/>
-                    </a:ln>
-                    <a:extLst>
-                      <a:ext uri="{53640926-AAD7-44D8-BBD7-CCE9431645EC}">
-                        <a14:shadowObscured xmlns:a14="http://schemas.microsoft.com/office/drawing/2010/main"/>
-                      </a:ext>
-                    </a:extLst>
+                    <a:prstGeom prst="rect"/>
                   </pic:spPr>
                 </pic:pic>
               </a:graphicData>
@@ -10300,10 +10521,15 @@
             <w:tcW w:type="dxa" w:w="1215"/>
           </w:tcPr>
           <w:p>
-            <w:r/>
+            <w:r>
+              <w:rPr>
+                <w:sz w:val="20"/>
+              </w:rPr>
+            </w:r>
             <w:r>
               <w:rPr>
                 <w:b/>
+                <w:sz w:val="20"/>
               </w:rPr>
               <w:t>User need (voice of the user)</w:t>
             </w:r>
@@ -10314,10 +10540,15 @@
             <w:tcW w:type="dxa" w:w="1215"/>
           </w:tcPr>
           <w:p>
-            <w:r/>
+            <w:r>
+              <w:rPr>
+                <w:sz w:val="20"/>
+              </w:rPr>
+            </w:r>
             <w:r>
               <w:rPr>
                 <w:b/>
+                <w:sz w:val="20"/>
               </w:rPr>
               <w:t>Evidence from the data</w:t>
             </w:r>
@@ -10328,10 +10559,15 @@
             <w:tcW w:type="dxa" w:w="1215"/>
           </w:tcPr>
           <w:p>
-            <w:r/>
+            <w:r>
+              <w:rPr>
+                <w:sz w:val="20"/>
+              </w:rPr>
+            </w:r>
             <w:r>
               <w:rPr>
                 <w:b/>
+                <w:sz w:val="20"/>
               </w:rPr>
               <w:t>Construct</w:t>
             </w:r>
@@ -10342,10 +10578,15 @@
             <w:tcW w:type="dxa" w:w="1215"/>
           </w:tcPr>
           <w:p>
-            <w:r/>
+            <w:r>
+              <w:rPr>
+                <w:sz w:val="20"/>
+              </w:rPr>
+            </w:r>
             <w:r>
               <w:rPr>
                 <w:b/>
+                <w:sz w:val="20"/>
               </w:rPr>
               <w:t>Adaptive difficulty (L2)</w:t>
             </w:r>
@@ -10356,10 +10597,15 @@
             <w:tcW w:type="dxa" w:w="1215"/>
           </w:tcPr>
           <w:p>
-            <w:r/>
+            <w:r>
+              <w:rPr>
+                <w:sz w:val="20"/>
+              </w:rPr>
+            </w:r>
             <w:r>
               <w:rPr>
                 <w:b/>
+                <w:sz w:val="20"/>
               </w:rPr>
               <w:t>Loss-free states</w:t>
             </w:r>
@@ -10370,10 +10616,15 @@
             <w:tcW w:type="dxa" w:w="1215"/>
           </w:tcPr>
           <w:p>
-            <w:r/>
+            <w:r>
+              <w:rPr>
+                <w:sz w:val="20"/>
+              </w:rPr>
+            </w:r>
             <w:r>
               <w:rPr>
                 <w:b/>
+                <w:sz w:val="20"/>
               </w:rPr>
               <w:t>Trajectory display (L5)</w:t>
             </w:r>
@@ -10384,10 +10635,15 @@
             <w:tcW w:type="dxa" w:w="1215"/>
           </w:tcPr>
           <w:p>
-            <w:r/>
+            <w:r>
+              <w:rPr>
+                <w:sz w:val="20"/>
+              </w:rPr>
+            </w:r>
             <w:r>
               <w:rPr>
                 <w:b/>
+                <w:sz w:val="20"/>
               </w:rPr>
               <w:t>Coaching (L6)</w:t>
             </w:r>
@@ -10400,8 +10656,15 @@
             <w:tcW w:type="dxa" w:w="1215"/>
           </w:tcPr>
           <w:p>
-            <w:r/>
-            <w:r>
+            <w:r>
+              <w:rPr>
+                <w:sz w:val="20"/>
+              </w:rPr>
+            </w:r>
+            <w:r>
+              <w:rPr>
+                <w:sz w:val="20"/>
+              </w:rPr>
               <w:t>Challenge that matches my ability</w:t>
             </w:r>
           </w:p>
@@ -10411,8 +10674,15 @@
             <w:tcW w:type="dxa" w:w="1215"/>
           </w:tcPr>
           <w:p>
-            <w:r/>
-            <w:r>
+            <w:r>
+              <w:rPr>
+                <w:sz w:val="20"/>
+              </w:rPr>
+            </w:r>
+            <w:r>
+              <w:rPr>
+                <w:sz w:val="20"/>
+              </w:rPr>
               <w:t>70.0% disengaged at ≤3 cycles; satisfaction 9/9 among sustained vs 11/21 (p = .013)</w:t>
             </w:r>
           </w:p>
@@ -10422,8 +10692,15 @@
             <w:tcW w:type="dxa" w:w="1215"/>
           </w:tcPr>
           <w:p>
-            <w:r/>
-            <w:r>
+            <w:r>
+              <w:rPr>
+                <w:sz w:val="20"/>
+              </w:rPr>
+            </w:r>
+            <w:r>
+              <w:rPr>
+                <w:sz w:val="20"/>
+              </w:rPr>
               <w:t>Flow / PEOU (TAM)</w:t>
             </w:r>
           </w:p>
@@ -10433,8 +10710,15 @@
             <w:tcW w:type="dxa" w:w="1215"/>
           </w:tcPr>
           <w:p>
-            <w:r/>
-            <w:r>
+            <w:r>
+              <w:rPr>
+                <w:sz w:val="20"/>
+              </w:rPr>
+            </w:r>
+            <w:r>
+              <w:rPr>
+                <w:sz w:val="20"/>
+              </w:rPr>
               <w:t>●</w:t>
             </w:r>
           </w:p>
@@ -10444,8 +10728,15 @@
             <w:tcW w:type="dxa" w:w="1215"/>
           </w:tcPr>
           <w:p>
-            <w:r/>
-            <w:r>
+            <w:r>
+              <w:rPr>
+                <w:sz w:val="20"/>
+              </w:rPr>
+            </w:r>
+            <w:r>
+              <w:rPr>
+                <w:sz w:val="20"/>
+              </w:rPr>
               <w:t>◐</w:t>
             </w:r>
           </w:p>
@@ -10455,8 +10746,16 @@
             <w:tcW w:type="dxa" w:w="1215"/>
           </w:tcPr>
           <w:p>
-            <w:r/>
-            <w:r/>
+            <w:r>
+              <w:rPr>
+                <w:sz w:val="20"/>
+              </w:rPr>
+            </w:r>
+            <w:r>
+              <w:rPr>
+                <w:sz w:val="20"/>
+              </w:rPr>
+            </w:r>
           </w:p>
         </w:tc>
         <w:tc>
@@ -10464,8 +10763,15 @@
             <w:tcW w:type="dxa" w:w="1215"/>
           </w:tcPr>
           <w:p>
-            <w:r/>
-            <w:r>
+            <w:r>
+              <w:rPr>
+                <w:sz w:val="20"/>
+              </w:rPr>
+            </w:r>
+            <w:r>
+              <w:rPr>
+                <w:sz w:val="20"/>
+              </w:rPr>
               <w:t>◐</w:t>
             </w:r>
           </w:p>
@@ -10477,8 +10783,15 @@
             <w:tcW w:type="dxa" w:w="1215"/>
           </w:tcPr>
           <w:p>
-            <w:r/>
-            <w:r>
+            <w:r>
+              <w:rPr>
+                <w:sz w:val="20"/>
+              </w:rPr>
+            </w:r>
+            <w:r>
+              <w:rPr>
+                <w:sz w:val="20"/>
+              </w:rPr>
               <w:t>Failure must not feel like a verdict about me</w:t>
             </w:r>
           </w:p>
@@ -10488,8 +10801,15 @@
             <w:tcW w:type="dxa" w:w="1215"/>
           </w:tcPr>
           <w:p>
-            <w:r/>
-            <w:r>
+            <w:r>
+              <w:rPr>
+                <w:sz w:val="20"/>
+              </w:rPr>
+            </w:r>
+            <w:r>
+              <w:rPr>
+                <w:sz w:val="20"/>
+              </w:rPr>
               <w:t>0/21 re-engagement after disengagement; Stage-1: ~74% adverse first experience among prior users</w:t>
             </w:r>
           </w:p>
@@ -10499,8 +10819,15 @@
             <w:tcW w:type="dxa" w:w="1215"/>
           </w:tcPr>
           <w:p>
-            <w:r/>
-            <w:r>
+            <w:r>
+              <w:rPr>
+                <w:sz w:val="20"/>
+              </w:rPr>
+            </w:r>
+            <w:r>
+              <w:rPr>
+                <w:sz w:val="20"/>
+              </w:rPr>
               <w:t>Loss aversion / D8 (Octalysis)</w:t>
             </w:r>
           </w:p>
@@ -10510,8 +10837,15 @@
             <w:tcW w:type="dxa" w:w="1215"/>
           </w:tcPr>
           <w:p>
-            <w:r/>
-            <w:r>
+            <w:r>
+              <w:rPr>
+                <w:sz w:val="20"/>
+              </w:rPr>
+            </w:r>
+            <w:r>
+              <w:rPr>
+                <w:sz w:val="20"/>
+              </w:rPr>
               <w:t>◐</w:t>
             </w:r>
           </w:p>
@@ -10521,8 +10855,15 @@
             <w:tcW w:type="dxa" w:w="1215"/>
           </w:tcPr>
           <w:p>
-            <w:r/>
-            <w:r>
+            <w:r>
+              <w:rPr>
+                <w:sz w:val="20"/>
+              </w:rPr>
+            </w:r>
+            <w:r>
+              <w:rPr>
+                <w:sz w:val="20"/>
+              </w:rPr>
               <w:t>●</w:t>
             </w:r>
           </w:p>
@@ -10532,8 +10873,15 @@
             <w:tcW w:type="dxa" w:w="1215"/>
           </w:tcPr>
           <w:p>
-            <w:r/>
-            <w:r>
+            <w:r>
+              <w:rPr>
+                <w:sz w:val="20"/>
+              </w:rPr>
+            </w:r>
+            <w:r>
+              <w:rPr>
+                <w:sz w:val="20"/>
+              </w:rPr>
               <w:t>◐</w:t>
             </w:r>
           </w:p>
@@ -10543,8 +10891,15 @@
             <w:tcW w:type="dxa" w:w="1215"/>
           </w:tcPr>
           <w:p>
-            <w:r/>
-            <w:r>
+            <w:r>
+              <w:rPr>
+                <w:sz w:val="20"/>
+              </w:rPr>
+            </w:r>
+            <w:r>
+              <w:rPr>
+                <w:sz w:val="20"/>
+              </w:rPr>
               <w:t>●</w:t>
             </w:r>
           </w:p>
@@ -10556,8 +10911,15 @@
             <w:tcW w:type="dxa" w:w="1215"/>
           </w:tcPr>
           <w:p>
-            <w:r/>
-            <w:r>
+            <w:r>
+              <w:rPr>
+                <w:sz w:val="20"/>
+              </w:rPr>
+            </w:r>
+            <w:r>
+              <w:rPr>
+                <w:sz w:val="20"/>
+              </w:rPr>
               <w:t>Visible personal progress</w:t>
             </w:r>
           </w:p>
@@ -10567,8 +10929,15 @@
             <w:tcW w:type="dxa" w:w="1215"/>
           </w:tcPr>
           <w:p>
-            <w:r/>
-            <w:r>
+            <w:r>
+              <w:rPr>
+                <w:sz w:val="20"/>
+              </w:rPr>
+            </w:r>
+            <w:r>
+              <w:rPr>
+                <w:sz w:val="20"/>
+              </w:rPr>
               <w:t>Recorded index and self-report diverge (5/8 single-session positive change, 2/8 felt improvement)</w:t>
             </w:r>
           </w:p>
@@ -10578,8 +10947,15 @@
             <w:tcW w:type="dxa" w:w="1215"/>
           </w:tcPr>
           <w:p>
-            <w:r/>
-            <w:r>
+            <w:r>
+              <w:rPr>
+                <w:sz w:val="20"/>
+              </w:rPr>
+            </w:r>
+            <w:r>
+              <w:rPr>
+                <w:sz w:val="20"/>
+              </w:rPr>
               <w:t>Competence (SDT) / D2</w:t>
             </w:r>
           </w:p>
@@ -10589,8 +10965,16 @@
             <w:tcW w:type="dxa" w:w="1215"/>
           </w:tcPr>
           <w:p>
-            <w:r/>
-            <w:r/>
+            <w:r>
+              <w:rPr>
+                <w:sz w:val="20"/>
+              </w:rPr>
+            </w:r>
+            <w:r>
+              <w:rPr>
+                <w:sz w:val="20"/>
+              </w:rPr>
+            </w:r>
           </w:p>
         </w:tc>
         <w:tc>
@@ -10598,8 +10982,15 @@
             <w:tcW w:type="dxa" w:w="1215"/>
           </w:tcPr>
           <w:p>
-            <w:r/>
-            <w:r>
+            <w:r>
+              <w:rPr>
+                <w:sz w:val="20"/>
+              </w:rPr>
+            </w:r>
+            <w:r>
+              <w:rPr>
+                <w:sz w:val="20"/>
+              </w:rPr>
               <w:t>◐</w:t>
             </w:r>
           </w:p>
@@ -10609,8 +11000,15 @@
             <w:tcW w:type="dxa" w:w="1215"/>
           </w:tcPr>
           <w:p>
-            <w:r/>
-            <w:r>
+            <w:r>
+              <w:rPr>
+                <w:sz w:val="20"/>
+              </w:rPr>
+            </w:r>
+            <w:r>
+              <w:rPr>
+                <w:sz w:val="20"/>
+              </w:rPr>
               <w:t>●</w:t>
             </w:r>
           </w:p>
@@ -10620,8 +11018,15 @@
             <w:tcW w:type="dxa" w:w="1215"/>
           </w:tcPr>
           <w:p>
-            <w:r/>
-            <w:r>
+            <w:r>
+              <w:rPr>
+                <w:sz w:val="20"/>
+              </w:rPr>
+            </w:r>
+            <w:r>
+              <w:rPr>
+                <w:sz w:val="20"/>
+              </w:rPr>
               <w:t>◐</w:t>
             </w:r>
           </w:p>
@@ -10633,8 +11038,15 @@
             <w:tcW w:type="dxa" w:w="1215"/>
           </w:tcPr>
           <w:p>
-            <w:r/>
-            <w:r>
+            <w:r>
+              <w:rPr>
+                <w:sz w:val="20"/>
+              </w:rPr>
+            </w:r>
+            <w:r>
+              <w:rPr>
+                <w:sz w:val="20"/>
+              </w:rPr>
               <w:t>Understandable, non-clinical feedback</w:t>
             </w:r>
           </w:p>
@@ -10644,8 +11056,15 @@
             <w:tcW w:type="dxa" w:w="1215"/>
           </w:tcPr>
           <w:p>
-            <w:r/>
-            <w:r>
+            <w:r>
+              <w:rPr>
+                <w:sz w:val="20"/>
+              </w:rPr>
+            </w:r>
+            <w:r>
+              <w:rPr>
+                <w:sz w:val="20"/>
+              </w:rPr>
               <w:t>60.0% self-reported improvement; satisfaction associated with staying</w:t>
             </w:r>
           </w:p>
@@ -10655,8 +11074,15 @@
             <w:tcW w:type="dxa" w:w="1215"/>
           </w:tcPr>
           <w:p>
-            <w:r/>
-            <w:r>
+            <w:r>
+              <w:rPr>
+                <w:sz w:val="20"/>
+              </w:rPr>
+            </w:r>
+            <w:r>
+              <w:rPr>
+                <w:sz w:val="20"/>
+              </w:rPr>
               <w:t>Gerontechnology anxiety (STAM)</w:t>
             </w:r>
           </w:p>
@@ -10666,8 +11092,16 @@
             <w:tcW w:type="dxa" w:w="1215"/>
           </w:tcPr>
           <w:p>
-            <w:r/>
-            <w:r/>
+            <w:r>
+              <w:rPr>
+                <w:sz w:val="20"/>
+              </w:rPr>
+            </w:r>
+            <w:r>
+              <w:rPr>
+                <w:sz w:val="20"/>
+              </w:rPr>
+            </w:r>
           </w:p>
         </w:tc>
         <w:tc>
@@ -10675,8 +11109,15 @@
             <w:tcW w:type="dxa" w:w="1215"/>
           </w:tcPr>
           <w:p>
-            <w:r/>
-            <w:r>
+            <w:r>
+              <w:rPr>
+                <w:sz w:val="20"/>
+              </w:rPr>
+            </w:r>
+            <w:r>
+              <w:rPr>
+                <w:sz w:val="20"/>
+              </w:rPr>
               <w:t>◐</w:t>
             </w:r>
           </w:p>
@@ -10686,8 +11127,15 @@
             <w:tcW w:type="dxa" w:w="1215"/>
           </w:tcPr>
           <w:p>
-            <w:r/>
-            <w:r>
+            <w:r>
+              <w:rPr>
+                <w:sz w:val="20"/>
+              </w:rPr>
+            </w:r>
+            <w:r>
+              <w:rPr>
+                <w:sz w:val="20"/>
+              </w:rPr>
               <w:t>●</w:t>
             </w:r>
           </w:p>
@@ -10697,8 +11145,15 @@
             <w:tcW w:type="dxa" w:w="1215"/>
           </w:tcPr>
           <w:p>
-            <w:r/>
-            <w:r>
+            <w:r>
+              <w:rPr>
+                <w:sz w:val="20"/>
+              </w:rPr>
+            </w:r>
+            <w:r>
+              <w:rPr>
+                <w:sz w:val="20"/>
+              </w:rPr>
               <w:t>●</w:t>
             </w:r>
           </w:p>
@@ -10710,8 +11165,15 @@
             <w:tcW w:type="dxa" w:w="1215"/>
           </w:tcPr>
           <w:p>
-            <w:r/>
-            <w:r>
+            <w:r>
+              <w:rPr>
+                <w:sz w:val="20"/>
+              </w:rPr>
+            </w:r>
+            <w:r>
+              <w:rPr>
+                <w:sz w:val="20"/>
+              </w:rPr>
               <w:t>Reward for effort, not only outcome</w:t>
             </w:r>
           </w:p>
@@ -10721,8 +11183,15 @@
             <w:tcW w:type="dxa" w:w="1215"/>
           </w:tcPr>
           <w:p>
-            <w:r/>
-            <w:r>
+            <w:r>
+              <w:rPr>
+                <w:sz w:val="20"/>
+              </w:rPr>
+            </w:r>
+            <w:r>
+              <w:rPr>
+                <w:sz w:val="20"/>
+              </w:rPr>
               <w:t>Coin loop sustained play in completers (≥4 cycles: 9/30)</w:t>
             </w:r>
           </w:p>
@@ -10732,8 +11201,15 @@
             <w:tcW w:type="dxa" w:w="1215"/>
           </w:tcPr>
           <w:p>
-            <w:r/>
-            <w:r>
+            <w:r>
+              <w:rPr>
+                <w:sz w:val="20"/>
+              </w:rPr>
+            </w:r>
+            <w:r>
+              <w:rPr>
+                <w:sz w:val="20"/>
+              </w:rPr>
               <w:t>Learn-to-earn / D4</w:t>
             </w:r>
           </w:p>
@@ -10743,8 +11219,15 @@
             <w:tcW w:type="dxa" w:w="1215"/>
           </w:tcPr>
           <w:p>
-            <w:r/>
-            <w:r>
+            <w:r>
+              <w:rPr>
+                <w:sz w:val="20"/>
+              </w:rPr>
+            </w:r>
+            <w:r>
+              <w:rPr>
+                <w:sz w:val="20"/>
+              </w:rPr>
               <w:t>◐</w:t>
             </w:r>
           </w:p>
@@ -10754,8 +11237,16 @@
             <w:tcW w:type="dxa" w:w="1215"/>
           </w:tcPr>
           <w:p>
-            <w:r/>
-            <w:r/>
+            <w:r>
+              <w:rPr>
+                <w:sz w:val="20"/>
+              </w:rPr>
+            </w:r>
+            <w:r>
+              <w:rPr>
+                <w:sz w:val="20"/>
+              </w:rPr>
+            </w:r>
           </w:p>
         </w:tc>
         <w:tc>
@@ -10763,8 +11254,15 @@
             <w:tcW w:type="dxa" w:w="1215"/>
           </w:tcPr>
           <w:p>
-            <w:r/>
-            <w:r>
+            <w:r>
+              <w:rPr>
+                <w:sz w:val="20"/>
+              </w:rPr>
+            </w:r>
+            <w:r>
+              <w:rPr>
+                <w:sz w:val="20"/>
+              </w:rPr>
               <w:t>◐</w:t>
             </w:r>
           </w:p>
@@ -10774,8 +11272,16 @@
             <w:tcW w:type="dxa" w:w="1215"/>
           </w:tcPr>
           <w:p>
-            <w:r/>
-            <w:r/>
+            <w:r>
+              <w:rPr>
+                <w:sz w:val="20"/>
+              </w:rPr>
+            </w:r>
+            <w:r>
+              <w:rPr>
+                <w:sz w:val="20"/>
+              </w:rPr>
+            </w:r>
           </w:p>
         </w:tc>
       </w:tr>
@@ -10785,8 +11291,15 @@
             <w:tcW w:type="dxa" w:w="1215"/>
           </w:tcPr>
           <w:p>
-            <w:r/>
-            <w:r>
+            <w:r>
+              <w:rPr>
+                <w:sz w:val="20"/>
+              </w:rPr>
+            </w:r>
+            <w:r>
+              <w:rPr>
+                <w:sz w:val="20"/>
+              </w:rPr>
               <w:t>A reason to come back</w:t>
             </w:r>
           </w:p>
@@ -10796,8 +11309,15 @@
             <w:tcW w:type="dxa" w:w="1215"/>
           </w:tcPr>
           <w:p>
-            <w:r/>
-            <w:r>
+            <w:r>
+              <w:rPr>
+                <w:sz w:val="20"/>
+              </w:rPr>
+            </w:r>
+            <w:r>
+              <w:rPr>
+                <w:sz w:val="20"/>
+              </w:rPr>
               <w:t>No observed return in Stage 2; Stage-3 decoupled cohort returned 15/23</w:t>
             </w:r>
           </w:p>
@@ -10807,8 +11327,15 @@
             <w:tcW w:type="dxa" w:w="1215"/>
           </w:tcPr>
           <w:p>
-            <w:r/>
-            <w:r>
+            <w:r>
+              <w:rPr>
+                <w:sz w:val="20"/>
+              </w:rPr>
+            </w:r>
+            <w:r>
+              <w:rPr>
+                <w:sz w:val="20"/>
+              </w:rPr>
               <w:t>Behavioural intention (TAM/STAM)</w:t>
             </w:r>
           </w:p>
@@ -10818,8 +11345,15 @@
             <w:tcW w:type="dxa" w:w="1215"/>
           </w:tcPr>
           <w:p>
-            <w:r/>
-            <w:r>
+            <w:r>
+              <w:rPr>
+                <w:sz w:val="20"/>
+              </w:rPr>
+            </w:r>
+            <w:r>
+              <w:rPr>
+                <w:sz w:val="20"/>
+              </w:rPr>
               <w:t>◐</w:t>
             </w:r>
           </w:p>
@@ -10829,8 +11363,15 @@
             <w:tcW w:type="dxa" w:w="1215"/>
           </w:tcPr>
           <w:p>
-            <w:r/>
-            <w:r>
+            <w:r>
+              <w:rPr>
+                <w:sz w:val="20"/>
+              </w:rPr>
+            </w:r>
+            <w:r>
+              <w:rPr>
+                <w:sz w:val="20"/>
+              </w:rPr>
               <w:t>●</w:t>
             </w:r>
           </w:p>
@@ -10840,8 +11381,15 @@
             <w:tcW w:type="dxa" w:w="1215"/>
           </w:tcPr>
           <w:p>
-            <w:r/>
-            <w:r>
+            <w:r>
+              <w:rPr>
+                <w:sz w:val="20"/>
+              </w:rPr>
+            </w:r>
+            <w:r>
+              <w:rPr>
+                <w:sz w:val="20"/>
+              </w:rPr>
               <w:t>●</w:t>
             </w:r>
           </w:p>
@@ -10851,8 +11399,15 @@
             <w:tcW w:type="dxa" w:w="1215"/>
           </w:tcPr>
           <w:p>
-            <w:r/>
-            <w:r>
+            <w:r>
+              <w:rPr>
+                <w:sz w:val="20"/>
+              </w:rPr>
+            </w:r>
+            <w:r>
+              <w:rPr>
+                <w:sz w:val="20"/>
+              </w:rPr>
               <w:t>●</w:t>
             </w:r>
           </w:p>
@@ -10972,47 +11527,32 @@
         <w:jc w:val="center"/>
       </w:pPr>
       <w:r>
-        <w:rPr>
-          <w:noProof/>
-        </w:rPr>
         <w:drawing>
-          <wp:inline distT="0" distB="0" distL="0" distR="0" wp14:anchorId="62135693" wp14:editId="0D3BE731">
-            <wp:extent cx="5745172" cy="2683380"/>
-            <wp:effectExtent l="0" t="0" r="0" b="0"/>
-            <wp:docPr id="10" name="Picture 10"/>
+          <wp:inline xmlns:a="http://schemas.openxmlformats.org/drawingml/2006/main" xmlns:pic="http://schemas.openxmlformats.org/drawingml/2006/picture">
+            <wp:extent cx="5669280" cy="2729052"/>
+            <wp:docPr id="23" name="Picture 23"/>
             <wp:cNvGraphicFramePr>
-              <a:graphicFrameLocks xmlns:a="http://schemas.openxmlformats.org/drawingml/2006/main" noChangeAspect="1"/>
+              <a:graphicFrameLocks noChangeAspect="1"/>
             </wp:cNvGraphicFramePr>
-            <a:graphic xmlns:a="http://schemas.openxmlformats.org/drawingml/2006/main">
+            <a:graphic>
               <a:graphicData uri="http://schemas.openxmlformats.org/drawingml/2006/picture">
-                <pic:pic xmlns:pic="http://schemas.openxmlformats.org/drawingml/2006/picture">
+                <pic:pic>
                   <pic:nvPicPr>
                     <pic:cNvPr id="0" name="fig_5_7.png"/>
                     <pic:cNvPicPr/>
                   </pic:nvPicPr>
-                  <pic:blipFill rotWithShape="1">
-                    <a:blip r:embed="rId17"/>
-                    <a:srcRect l="5195" r="5120" b="24471"/>
+                  <pic:blipFill>
+                    <a:blip r:embed="rId32"/>
                     <a:stretch>
                       <a:fillRect/>
                     </a:stretch>
                   </pic:blipFill>
-                  <pic:spPr bwMode="auto">
+                  <pic:spPr>
                     <a:xfrm>
                       <a:off x="0" y="0"/>
-                      <a:ext cx="5790435" cy="2704521"/>
+                      <a:ext cx="5669280" cy="2729052"/>
                     </a:xfrm>
-                    <a:prstGeom prst="rect">
-                      <a:avLst/>
-                    </a:prstGeom>
-                    <a:ln>
-                      <a:noFill/>
-                    </a:ln>
-                    <a:extLst>
-                      <a:ext uri="{53640926-AAD7-44D8-BBD7-CCE9431645EC}">
-                        <a14:shadowObscured xmlns:a14="http://schemas.microsoft.com/office/drawing/2010/main"/>
-                      </a:ext>
-                    </a:extLst>
+                    <a:prstGeom prst="rect"/>
                   </pic:spPr>
                 </pic:pic>
               </a:graphicData>
@@ -11093,6 +11633,7 @@
     <w:p>
       <w:pPr>
         <w:pStyle w:val="Heading1"/>
+        <w:pageBreakBefore/>
       </w:pPr>
       <w:r>
         <w:lastRenderedPageBreak/>
@@ -12428,7 +12969,7 @@
         <w:jc w:val="both"/>
       </w:pPr>
       <w:r>
-        <w:t>The answer this programme proposes is adaptive learning (§2.6.2A–B): a regime in which the activity visibly improves the person session by session, so that a rising personal trajectory — continuous improvement at the level of the individual user — becomes the reason to return, and eventually becomes the frame within which clinical purpose can be safely re-attached, because a user who reads performance as a curve can tolerate what the curve measures. This is where the discovery is born in the data; it is formalised as LODF in Chapter 7 and claimed, with its evidential limits, in Chapters 8 and 9. The claim discipline matters: several rival explanations for the gap are plausible — anticipated fatigue, access barriers, scheduling burden, insufficient relevance, motor difficulty, limited enjoyment of repeated play — and a missing trajectory frame is one theoretically grounded possibility among them. The near-term study must therefore combine longitudinal behavioural follow-up with interviews or validated measures of fatigue, perceived competence, autonomy, burden, enjoyment and identity relevance before the design lever is selected.</w:t>
+        <w:t>The answer this programme proposes is adaptive learning (§2.6.2A–B): a regime in which the activity visibly improves the person session by session, so that a rising personal trajectory — continuous improvement at the level of the individual user — becomes the reason to return, and eventually becomes the frame within which clinical purpose can be safely re-attached, because a user who reads performance as a curve can tolerate what the curve measures. This is where the discovery is born in the data; it is formalised as the adaptive-learning framework in Chapter 7 and claimed, with its evidential limits, in Chapters 8 and 9. The claim discipline matters: several rival explanations for the gap are plausible — anticipated fatigue, access barriers, scheduling burden, insufficient relevance, motor difficulty, limited enjoyment of repeated play — and a missing trajectory frame is one theoretically grounded possibility among them. The near-term study must therefore combine longitudinal behavioural follow-up with interviews or validated measures of fatigue, perceived competence, autonomy, burden, enjoyment and identity relevance before the design lever is selected.</w:t>
       </w:r>
     </w:p>
     <w:p>
@@ -12504,7 +13045,7 @@
         <w:jc w:val="both"/>
       </w:pPr>
       <w:r>
-        <w:t>Stage 3 has material limitations. It is a between-cycle, between-cohort comparison; the decoupling intervention contains several coordinated changes; mental accounting, loss aversion, identity protection and stereotype threat were not measured directly; volunteers may differ from non-volunteers; follow-up is short; and cultural specificity limits generalisation. In addition, the Stage-3 framing item measures frame recognition only, and the complete LODF was not deployed. These limitations do not erase the large post-failure return signal, but they bound its causal and mechanistic interpretation.</w:t>
+        <w:t>Stage 3 has material limitations. It is a between-cycle, between-cohort comparison; the decoupling intervention contains several coordinated changes; mental accounting, loss aversion, identity protection and stereotype threat were not measured directly; volunteers may differ from non-volunteers; follow-up is short; and cultural specificity limits generalisation. In addition, the Stage-3 framing item measures frame recognition only, and the complete adaptive-learning framework was not deployed. These limitations do not erase the large post-failure return signal, but they bound its causal and mechanistic interpretation.</w:t>
       </w:r>
     </w:p>
     <w:p>
@@ -13695,19 +14236,19 @@
     <w:p>
       <w:pPr>
         <w:pStyle w:val="Heading1"/>
-      </w:pPr>
-      <w:r>
-        <w:lastRenderedPageBreak/>
-        <w:t>Chapter 7 Discussion: Adaptive Learning and the Learning-Oriented Design Framework</w:t>
-      </w:r>
+        <w:pageBreakBefore/>
+      </w:pPr>
       <w:bookmarkEnd w:id="111"/>
+      <w:r>
+        <w:t>Chapter 7 Discussion: Adaptive Learning as the Behavioural-Change Driver</w:t>
+      </w:r>
     </w:p>
     <w:p>
       <w:pPr>
         <w:pStyle w:val="Heading2"/>
       </w:pPr>
       <w:r>
-        <w:t>7.1 Why the Empirical Programme Motivates Adaptive Learning</w:t>
+        <w:t>7.1 Why the Empirical Programme Forces Adaptive Learning</w:t>
       </w:r>
     </w:p>
     <w:p>
@@ -13723,7 +14264,7 @@
         <w:jc w:val="both"/>
       </w:pPr>
       <w:r>
-        <w:t>The proposed relationship among framing, identity-relevant appraisal and adaptive learning has three steps. First, clinical cues may increase the likelihood that performance is interpreted through a health or decline-related frame. Second, an adverse event under that frame may be experienced as more self-relevant than the same event in a coordination game. Third, a visible learning trajectory may offer a competing interpretation in which the event informs the next action. Mental accounting and endowment remain candidate mechanisms, and the complete sequence requires direct measurement. LODF is therefore an engineering hypothesis built from convergent evidence, not a verified psychological model.</w:t>
+        <w:t>The proposed relationship among framing, identity-relevant appraisal and adaptive learning has three steps. First, clinical cues may increase the likelihood that performance is interpreted through a health or decline-related frame. Second, an adverse event under that frame may be experienced as more self-relevant than the same event in a coordination game. Third, a visible learning trajectory may offer a competing interpretation in which the event informs the next action. Mental accounting and endowment remain candidate mechanisms, and the complete sequence requires direct measurement. The adaptive-learning framework is therefore an engineering hypothesis built from convergent evidence, not a verified psychological model.</w:t>
       </w:r>
     </w:p>
     <w:p>
@@ -13749,7 +14290,7 @@
         <w:jc w:val="both"/>
       </w:pPr>
       <w:r>
-        <w:t>The Stage-2 system's Layer 2 already contains a partial implementation of adaptive calibration. The 80%/40% threshold rule keeps challenge in the flow band, and the LangChain prompt template grounds the recommendations in flow theory and challenge–skill balance. What Stage 2 did not have was a user-facing trajectory representation; the user could not see the curve. Layer 5 of the LODF reference stack (§7.5.2) closes that gap.</w:t>
+        <w:t>The Stage-2 system's Layer 2 already contains a partial implementation of adaptive calibration. The 80%/40% threshold rule keeps challenge in the flow band, and the LangChain prompt template grounds the recommendations in flow theory and challenge–skill balance. What Stage 2 did not have was a user-facing trajectory representation; the user could not see the curve. Layer 5 of the adaptive-learning reference stack (§7.5.2) closes that gap.</w:t>
       </w:r>
     </w:p>
     <w:p>
@@ -13765,7 +14306,7 @@
         <w:jc w:val="both"/>
       </w:pPr>
       <w:r>
-        <w:t>The thesis proposes that a relatively fixed, identity-protective appraisal and a learning-trajectory appraisal place different meanings on the same event. The former can make an unfavourable result feel like a loss of valued self-description; the latter makes it information about current position and next action. These appraisals are not assumed to be mutually exclusive or to eliminate identity. The design objective is to make the trajectory appraisal credible and salient while preserving truthful information, meaningful challenge and user autonomy. Whether this reduces non-return is an empirical question for the controlled LODF trial.</w:t>
+        <w:t>The thesis proposes that a relatively fixed, identity-protective appraisal and a learning-trajectory appraisal place different meanings on the same event. The former can make an unfavourable result feel like a loss of valued self-description; the latter makes it information about current position and next action. These appraisals are not assumed to be mutually exclusive or to eliminate identity. The design objective is to make the trajectory appraisal credible and salient while preserving truthful information, meaningful challenge and user autonomy. Whether this reduces non-return is an empirical question for the controlled the adaptive-learning framework trial.</w:t>
       </w:r>
     </w:p>
     <w:p>
@@ -13781,17 +14322,17 @@
         <w:pStyle w:val="Heading2"/>
       </w:pPr>
       <w:bookmarkStart w:id="113" w:name="_Toc232024604"/>
-      <w:r>
-        <w:t>7.4 The Learning-Oriented Design Framework (LODF)</w:t>
-      </w:r>
       <w:bookmarkEnd w:id="113"/>
-    </w:p>
-    <w:p>
-      <w:pPr>
-        <w:jc w:val="both"/>
-      </w:pPr>
-      <w:r>
-        <w:t>LODF is the engineering formalisation of the adaptive-learning discovery for the gamified FRA domain — the packaging, not the finding. It organises three proposed principles in the discovery's service. P1, Identity Disentanglement, reduces participant-facing clinical-verdict cues; its empirical motivation is the higher post-failure return observed in the separate Stage-3 decoupled cohort. P2, Trajectory Installation, makes change over time and the next achievable step visible; its motivation is the practical difference between session retention and stated regular-use intention, not proof that trajectory absence caused that difference. P3, Adaptive Calibration, adjusts challenge, feedback and pacing to observed capability; Stage 2 contained a partial difficulty-adjustment implementation, but the complete principle and its effect on return were not tested. The framework therefore combines one empirically supported design direction with two prospectively testable extensions. The zero-failure state repertoire (§5.3.10; §2.6.2C) is the supporting element that P1 and P3 share: it removes verdict presentation at the moment of difficulty so that the trajectory interpretation of P2 has room to form.</w:t>
+      <w:r>
+        <w:t>7.4 Formalising the Discovery: The Adaptive-Learning Framework (LODF)</w:t>
+      </w:r>
+    </w:p>
+    <w:p>
+      <w:pPr>
+        <w:jc w:val="both"/>
+      </w:pPr>
+      <w:r>
+        <w:t>The adaptive-learning framework is the engineering formalisation of the adaptive-learning discovery for the gamified FRA domain — the packaging, not the finding. It organises three proposed principles in the discovery's service. P1, Identity Disentanglement, reduces participant-facing clinical-verdict cues; its empirical motivation is the higher post-failure return observed in the separate Stage-3 decoupled cohort. P2, Trajectory Installation, makes change over time and the next achievable step visible; its motivation is the practical difference between session retention and stated regular-use intention, not proof that trajectory absence caused that difference. P3, Adaptive Calibration, adjusts challenge, feedback and pacing to observed capability; Stage 2 contained a partial difficulty-adjustment implementation, but the complete principle and its effect on return were not tested. The framework therefore combines one empirically supported design direction with two prospectively testable extensions. The zero-failure state repertoire (§5.3.10; §2.6.2C) is the supporting element that P1 and P3 share: it removes verdict presentation at the moment of difficulty so that the trajectory interpretation of P2 has room to form.</w:t>
       </w:r>
     </w:p>
     <w:p>
@@ -13800,10 +14341,10 @@
         <w:jc w:val="center"/>
       </w:pPr>
       <w:bookmarkStart w:id="114" w:name="_Toc232024705"/>
-      <w:r>
-        <w:t>Table 7.1. LODF principles, function and empirical anchor.</w:t>
-      </w:r>
       <w:bookmarkEnd w:id="114"/>
+      <w:r>
+        <w:t>Table 7.1. adaptive-learning principles, function and empirical anchor.</w:t>
+      </w:r>
     </w:p>
     <w:tbl>
       <w:tblPr>
@@ -13993,7 +14534,7 @@
         <w:spacing w:after="40"/>
       </w:pPr>
       <w:r>
-        <w:t>Status of the framework: LODF is an engineering specification derived from the empirical programme and relevant learning theory. It should be evaluated as a package and by component in a preregistered, within-cohort trial with common follow-up, process measures and implementation-fidelity checks.</w:t>
+        <w:t>Status of the framework: The adaptive-learning framework is an engineering specification derived from the empirical programme and relevant learning theory. It should be evaluated as a package and by component in a preregistered, within-cohort trial with common follow-up, process measures and implementation-fidelity checks.</w:t>
       </w:r>
     </w:p>
     <w:p>
@@ -14001,17 +14542,17 @@
         <w:pStyle w:val="Heading2"/>
       </w:pPr>
       <w:bookmarkStart w:id="115" w:name="_Toc232024605"/>
-      <w:r>
-        <w:t>7.5 Prototype Stack: Engineering-Actionable LODF Implementation</w:t>
-      </w:r>
       <w:bookmarkEnd w:id="115"/>
-    </w:p>
-    <w:p>
-      <w:pPr>
-        <w:jc w:val="both"/>
-      </w:pPr>
-      <w:r>
-        <w:t>This section specifies the technical and protocol stack required to deploy LODF on existing FRA infrastructure. The stack extends the Stage-2 five-layer architecture with two additional protocol layers (User-Facing Trajectory Layer and Staff Coaching Protocol Layer) and one new instrumentation layer (LODF Telemetry Layer).</w:t>
+      <w:r>
+        <w:t>7.5 Prototype Stack: Engineering-Actionable Implementation</w:t>
+      </w:r>
+    </w:p>
+    <w:p>
+      <w:pPr>
+        <w:jc w:val="both"/>
+      </w:pPr>
+      <w:r>
+        <w:t>This section specifies the technical and protocol stack required to deploy the adaptive-learning framework on existing FRA infrastructure. The stack extends the Stage-2 five-layer architecture with two additional protocol layers (User-Facing Trajectory Layer and Staff Coaching Protocol Layer) and one new instrumentation layer (Adaptive-Learning Telemetry Layer).</w:t>
       </w:r>
     </w:p>
     <w:p>
@@ -14030,10 +14571,10 @@
         <w:jc w:val="center"/>
       </w:pPr>
       <w:bookmarkStart w:id="117" w:name="_Toc232024706"/>
-      <w:r>
-        <w:t>Table 7.2. LODF reference stack (L0–L7) mapped to LODF principles.</w:t>
-      </w:r>
       <w:bookmarkEnd w:id="117"/>
+      <w:r>
+        <w:t>Table 7.2. adaptive-learning reference stack (L0–L7) mapped to adaptive-learning principles.</w:t>
+      </w:r>
     </w:p>
     <w:tbl>
       <w:tblPr>
@@ -14091,7 +14632,7 @@
                 <w:b/>
                 <w:sz w:val="20"/>
               </w:rPr>
-              <w:t>LODF principle served</w:t>
+              <w:t>The adaptive-learning framework principle served</w:t>
             </w:r>
           </w:p>
         </w:tc>
@@ -14522,7 +15063,7 @@
               <w:rPr>
                 <w:sz w:val="20"/>
               </w:rPr>
-              <w:t>L7 LODF Telemetry</w:t>
+              <w:t>L7 Adaptive-Learning Telemetry</w:t>
             </w:r>
           </w:p>
         </w:tc>
@@ -14579,27 +15120,22 @@
         <w:jc w:val="center"/>
       </w:pPr>
       <w:r>
-        <w:rPr>
-          <w:noProof/>
-        </w:rPr>
-        <w:lastRenderedPageBreak/>
         <w:drawing>
-          <wp:inline distT="0" distB="0" distL="0" distR="0" wp14:anchorId="32D3F330" wp14:editId="664C0D16">
-            <wp:extent cx="4836170" cy="3113405"/>
-            <wp:effectExtent l="0" t="0" r="2540" b="0"/>
-            <wp:docPr id="14" name="Picture 14"/>
+          <wp:inline xmlns:a="http://schemas.openxmlformats.org/drawingml/2006/main" xmlns:pic="http://schemas.openxmlformats.org/drawingml/2006/picture">
+            <wp:extent cx="4937760" cy="3347357"/>
+            <wp:docPr id="24" name="Picture 24"/>
             <wp:cNvGraphicFramePr>
-              <a:graphicFrameLocks xmlns:a="http://schemas.openxmlformats.org/drawingml/2006/main" noChangeAspect="1"/>
+              <a:graphicFrameLocks noChangeAspect="1"/>
             </wp:cNvGraphicFramePr>
-            <a:graphic xmlns:a="http://schemas.openxmlformats.org/drawingml/2006/main">
+            <a:graphic>
               <a:graphicData uri="http://schemas.openxmlformats.org/drawingml/2006/picture">
-                <pic:pic xmlns:pic="http://schemas.openxmlformats.org/drawingml/2006/picture">
+                <pic:pic>
                   <pic:nvPicPr>
                     <pic:cNvPr id="0" name="fig_7_1.png"/>
                     <pic:cNvPicPr/>
                   </pic:nvPicPr>
                   <pic:blipFill>
-                    <a:blip r:embed="rId20"/>
+                    <a:blip r:embed="rId33"/>
                     <a:stretch>
                       <a:fillRect/>
                     </a:stretch>
@@ -14607,11 +15143,9 @@
                   <pic:spPr>
                     <a:xfrm>
                       <a:off x="0" y="0"/>
-                      <a:ext cx="4839706" cy="3115681"/>
+                      <a:ext cx="4937760" cy="3347357"/>
                     </a:xfrm>
-                    <a:prstGeom prst="rect">
-                      <a:avLst/>
-                    </a:prstGeom>
+                    <a:prstGeom prst="rect"/>
                   </pic:spPr>
                 </pic:pic>
               </a:graphicData>
@@ -14626,10 +15160,10 @@
         <w:jc w:val="center"/>
       </w:pPr>
       <w:bookmarkStart w:id="118" w:name="_Toc232024692"/>
-      <w:r>
-        <w:t>Figure 7.1. LODF reference stack: existing five-layer FRA architecture (L0–L4) extended with three additional layers (L5 User-Facing Trajectory; L6 Staff Coaching Protocol; L7 LODF Telemetry).</w:t>
-      </w:r>
       <w:bookmarkEnd w:id="118"/>
+      <w:r>
+        <w:t>Figure 7.1. adaptive-learning reference stack: existing five-layer FRA architecture (L0–L4) extended with three additional layers (L5 User-Facing Trajectory; L6 Staff Coaching Protocol; L7 Adaptive-Learning Telemetry).</w:t>
+      </w:r>
     </w:p>
     <w:p>
       <w:pPr>
@@ -14837,7 +15371,7 @@
         <w:jc w:val="both"/>
       </w:pPr>
       <w:r>
-        <w:t>The three LODF principles are intended to operate in sequence but are not yet known to be jointly sufficient. Principle 1 reduces participant-facing coupling cues. Principle 2 adds a credible learning trajectory. Principle 3 adapts challenge, feedback and pacing over time. Future evaluation should use a factorial or staged design where feasible, because a package-only trial may show effectiveness without identifying which component is necessary, sufficient or potentially harmful. In the terms of the discovery, P1 is the precondition — it clears the frame, and it is the only principle with field evidence behind it (Stage 3). P2 and P3 together are the adaptive-learning core: the visible curve and the calibration that keeps the user on it. The factorial design matters precisely because the core has not yet been tested with the precondition in place.</w:t>
+        <w:t>The three adaptive-learning principles are intended to operate in sequence but are not yet known to be jointly sufficient. Principle 1 reduces participant-facing coupling cues. Principle 2 adds a credible learning trajectory. Principle 3 adapts challenge, feedback and pacing over time. Future evaluation should use a factorial or staged design where feasible, because a package-only trial may show effectiveness without identifying which component is necessary, sufficient or potentially harmful. In the terms of the discovery, P1 is the precondition — it clears the frame, and it is the only principle with field evidence behind it (Stage 3). P2 and P3 together are the adaptive-learning core: the visible curve and the calibration that keeps the user on it. The factorial design matters precisely because the core has not yet been tested with the precondition in place.</w:t>
       </w:r>
     </w:p>
     <w:p>
@@ -14855,7 +15389,7 @@
         <w:jc w:val="both"/>
       </w:pPr>
       <w:r>
-        <w:t>The EngD programme topic is gamification as a proactive approach for continuous improvement and innovation enhancement, and the adaptive-learning discovery is where the thesis and its topic become the same thing: adaptive learning is continuous improvement operating at the level of the individual user. Each session updates the challenge; each failure is information for the next iteration; the user's capability is the process being improved, with the user's own trajectory as the control chart. The same loop appears at two other levels of the programme — the researcher's action-research cycles (§3.1) and the artefact's AI-assisted build iterations (§5.3.9) — so the thesis practises at every level the principle it proposes for its users. LODF connects the topic to the empirical programme by treating engagement as a dynamic process rather than a one-time adoption decision. In engineering terms, the user interaction becomes an instrumented loop: observe performance and experience, provide calibrated challenge and feedback, measure subsequent behaviour, and revise the design. The analogy to industrial control is useful, but the user is not a process variable to be optimised without consent. Autonomy, dignity, truthful disclosure and the right not to engage are constraints on the loop, not disturbances to be removed.</w:t>
+        <w:t>The EngD programme topic is gamification as a proactive approach for continuous improvement and innovation enhancement, and the adaptive-learning discovery is where the thesis and its topic become the same thing: adaptive learning is continuous improvement operating at the level of the individual user. Each session updates the challenge; each failure is information for the next iteration; the user's capability is the process being improved, with the user's own trajectory as the control chart. The same loop appears at two other levels of the programme — the researcher's action-research cycles (§3.1) and the artefact's AI-assisted build iterations (§5.3.9) — so the thesis practises at every level the principle it proposes for its users. The adaptive-learning framework connects the topic to the empirical programme by treating engagement as a dynamic process rather than a one-time adoption decision. In engineering terms, the user interaction becomes an instrumented loop: observe performance and experience, provide calibrated challenge and feedback, measure subsequent behaviour, and revise the design. The analogy to industrial control is useful, but the user is not a process variable to be optimised without consent. Autonomy, dignity, truthful disclosure and the right not to engage are constraints on the loop, not disturbances to be removed.</w:t>
       </w:r>
     </w:p>
     <w:p>
@@ -14898,6 +15432,7 @@
     <w:p>
       <w:pPr>
         <w:pStyle w:val="Heading1"/>
+        <w:pageBreakBefore/>
       </w:pPr>
       <w:r>
         <w:lastRenderedPageBreak/>
@@ -14920,7 +15455,7 @@
         <w:jc w:val="both"/>
       </w:pPr>
       <w:r>
-        <w:t>The thesis makes four principal theoretical contributions, stated in the hierarchy the evidence supports. First — the problem finding — it identifies failure-associated non-return (FIAS) as a post-contact behaviour that standard acceptance and gamification models do not represent, and supplies the behavioural pieces those models are missing: loss aversion, identity-relevant endowment, mental accounting and stereotype threat, integrated as a candidate frame-sensitive account with testable predictions (Table 2.1). Second — the scope finding — it establishes a boundary condition for gamification theory: the theory holds for older adults, as Stage 3 confirms at literature-predicted acceptance levels, until the gamified activity is attached to a purpose-based technology whose purpose touches the identity-level value propositions of the user; at that boundary the theory fails, and FIAS names the mechanism (§6.7). Third — the design discovery — it advances adaptive learning as the behavioural-change driver for this population: continuous improvement at the level of the individual user, forced as a discovery by the rejection of H0 and by the Stage-3 commitment gap (§6.8), and the only design element on the table that can re-attach clinical purpose safely. Fourth, it formulates endowment-protective and learning-trajectory appraisals as competing interpretive regimes and translates the design discovery into a falsifiable engineering framework, LODF, which is the packaging of the discovery rather than a finding in its own right. The thesis does not claim to have verified mental accounting, established an entropy collapse, dissolved the score-improvement/non-return paradox, or tested adaptive learning in isolation.</w:t>
+        <w:t>The thesis makes four principal theoretical contributions, stated in the hierarchy the evidence supports. First — the problem finding — it identifies failure-associated non-return (FIAS) as a post-contact behaviour that standard acceptance and gamification models do not represent, and supplies the behavioural pieces those models are missing: loss aversion, identity-relevant endowment, mental accounting and stereotype threat, integrated as a candidate frame-sensitive account with testable predictions (Table 2.1). Second — the scope finding — it establishes a boundary condition for gamification theory: the theory holds for older adults, as Stage 3 confirms at literature-predicted acceptance levels, until the gamified activity is attached to a purpose-based technology whose purpose touches the identity-level value propositions of the user; at that boundary the theory fails, and FIAS names the mechanism (§6.7). Third — the design discovery — it advances adaptive learning as the behavioural-change driver for this population: continuous improvement at the level of the individual user, forced as a discovery by the rejection of H0 and by the Stage-3 commitment gap (§6.8), and the only design element on the table that can re-attach clinical purpose safely. Fourth, it formulates endowment-protective and learning-trajectory appraisals as competing interpretive regimes and translates the design discovery into a falsifiable engineering framework, the adaptive-learning framework, which is the packaging of the discovery rather than a finding in its own right. The thesis does not claim to have verified mental accounting, established an entropy collapse, dissolved the score-improvement/non-return paradox, or tested adaptive learning in isolation.</w:t>
       </w:r>
     </w:p>
     <w:p>
@@ -14974,7 +15509,7 @@
         <w:jc w:val="both"/>
       </w:pPr>
       <w:r>
-        <w:t>The practical contribution, in order of importance, is the adaptive-learning proposition and then its packaging. Adaptive learning gives practitioners a deployable principle: build health-technology engagement around the visible, calibrated improvement of the individual user, and let the clinical purpose ride on the trajectory rather than on verdicts. LODF makes that principle engineering-actionable — its components can be specified on existing infrastructure, the reference stack and prototype specification translate principles into components, and the applied case studies illustrate hypotheses for other domains. Its empirical status is that of a proposed framework informed by field evidence and learning theory. Before industrial deployment, the framework requires controlled effectiveness testing, implementation-fidelity assessment, safety and disclosure review, usability testing, longitudinal follow-up and cost analysis.</w:t>
+        <w:t>The practical contribution, in order of importance, is the adaptive-learning proposition and then its packaging. Adaptive learning gives practitioners a deployable principle: build health-technology engagement around the visible, calibrated improvement of the individual user, and let the clinical purpose ride on the trajectory rather than on verdicts. The adaptive-learning framework makes that principle engineering-actionable — its components can be specified on existing infrastructure, the reference stack and prototype specification translate principles into components, and the applied case studies illustrate hypotheses for other domains. Its empirical status is that of a proposed framework informed by field evidence and learning theory. Before industrial deployment, the framework requires controlled effectiveness testing, implementation-fidelity assessment, safety and disclosure review, usability testing, longitudinal follow-up and cost analysis.</w:t>
       </w:r>
     </w:p>
     <w:p>
@@ -15275,7 +15810,7 @@
         <w:jc w:val="both"/>
       </w:pPr>
       <w:r>
-        <w:t>The intervention is targeted at the gap between the user's stated intent and the user's subsequent behaviour, not at users who have decided that the technology is not for them. Staff training in any LODF deployment must include explicit guidance not to use coaching to override a clearly stated preference for non-engagement.</w:t>
+        <w:t>The intervention is targeted at the gap between the user's stated intent and the user's subsequent behaviour, not at users who have decided that the technology is not for them. Staff training in any the adaptive-learning framework deployment must include explicit guidance not to use coaching to override a clearly stated preference for non-engagement.</w:t>
       </w:r>
     </w:p>
     <w:p>
@@ -15293,7 +15828,7 @@
         <w:jc w:val="both"/>
       </w:pPr>
       <w:r>
-        <w:t>Three risks are flagged: equity (LODF requires staff training that may not be available in lower-resource settings); paternalism (a system that adapts and reframes can shade into a system that decides for the user what their experience means); surveillance (the dual-purpose mechanic records continuous clinical telemetry). PIPL governance and a participant-accessible data policy are the operational answers; Phase-3 cost-effectiveness work will specify minimum staff-training intensity.</w:t>
+        <w:t>Three risks are flagged: equity (the adaptive-learning framework requires staff training that may not be available in lower-resource settings); paternalism (a system that adapts and reframes can shade into a system that decides for the user what their experience means); surveillance (the dual-purpose mechanic records continuous clinical telemetry). PIPL governance and a participant-accessible data policy are the operational answers; Phase-3 cost-effectiveness work will specify minimum staff-training intensity.</w:t>
       </w:r>
     </w:p>
     <w:p>
@@ -15416,6 +15951,7 @@
     <w:p>
       <w:pPr>
         <w:pStyle w:val="Heading1"/>
+        <w:pageBreakBefore/>
       </w:pPr>
       <w:r>
         <w:lastRenderedPageBreak/>
@@ -15584,7 +16120,7 @@
         <w:jc w:val="both"/>
       </w:pPr>
       <w:r>
-        <w:t>Adaptive learning is advanced as the programme's principal design discovery (§6.8; Chapter 7): a regime in which the activity visibly improves the person, session by session, so that a rising personal trajectory — continuous improvement at the level of the individual user — becomes the reason to return, and eventually the frame within which the clinical purpose can be safely re-attached. It can present performance as a trajectory, specify the next achievable step and calibrate challenge, feedback and pacing. LODF formalises the discovery into three components: identity disentanglement, trajectory installation and adaptive calibration. The framework is not yet empirically validated as a package, the Stage-3 result should not be treated as a test of adaptive learning, and its incremental effect must be evaluated prospectively against decoupling alone and against alternative supports.</w:t>
+        <w:t>Adaptive learning is advanced as the programme's principal design discovery (§6.8; Chapter 7): a regime in which the activity visibly improves the person, session by session, so that a rising personal trajectory — continuous improvement at the level of the individual user — becomes the reason to return, and eventually the frame within which the clinical purpose can be safely re-attached. It can present performance as a trajectory, specify the next achievable step and calibrate challenge, feedback and pacing. The adaptive-learning framework formalises the discovery into three components: identity disentanglement, trajectory installation and adaptive calibration. The framework is not yet empirically validated as a package, the Stage-3 result should not be treated as a test of adaptive learning, and its incremental effect must be evaluated prospectively against decoupling alone and against alternative supports.</w:t>
       </w:r>
     </w:p>
     <w:p>
@@ -15624,7 +16160,7 @@
         <w:jc w:val="both"/>
       </w:pPr>
       <w:r>
-        <w:t>The thesis consequently reformulates its strongest structural claim: endowment-protective and learning-trajectory appraisals are competing interpretive regimes. LODF is designed to increase the salience of the latter. WTA-WTP asymmetry, identity appraisal and changes in self-efficacy are future measurement targets, not established mediators in the current dataset.</w:t>
+        <w:t>The thesis consequently reformulates its strongest structural claim: endowment-protective and learning-trajectory appraisals are competing interpretive regimes. The adaptive-learning framework is designed to increase the salience of the latter. WTA-WTP asymmetry, identity appraisal and changes in self-efficacy are future measurement targets, not established mediators in the current dataset.</w:t>
       </w:r>
     </w:p>
     <w:p>
@@ -15642,7 +16178,7 @@
         <w:jc w:val="both"/>
       </w:pPr>
       <w:r>
-        <w:t>The thesis offers four theoretical contributions, in the hierarchy of §8.1. First, FIAS: a provisional, non-diagnostic construct naming the post-contact problem the acceptance models miss, with the behavioural-economics account that structures it (Table 2.1). Second, the coupling boundary condition of gamification theory: where the theory holds for older adults, where it fails, and why. Third, adaptive learning as the design discovery — the behavioural-change driver that converts the boundary's lesson into a buildable response. Fourth, the competing-appraisal formulation (endowment protection versus learning trajectory) and its translation into the falsifiable LODF packaging. The thesis does not claim empirical verification of mental accounting, irreversible account closure, mutual exclusion between the appraisals, or an isolated adaptive-learning effect.</w:t>
+        <w:t>The thesis offers four theoretical contributions, in the hierarchy of §8.1. First, FIAS: a provisional, non-diagnostic construct naming the post-contact problem the acceptance models miss, with the behavioural-economics account that structures it (Table 2.1). Second, the coupling boundary condition of gamification theory: where the theory holds for older adults, where it fails, and why. Third, adaptive learning as the design discovery — the behavioural-change driver that converts the boundary's lesson into a buildable response. Fourth, the competing-appraisal formulation (endowment protection versus learning trajectory) and its translation into the falsifiable the adaptive-learning framework packaging. The thesis does not claim empirical verification of mental accounting, irreversible account closure, mutual exclusion between the appraisals, or an isolated adaptive-learning effect.</w:t>
       </w:r>
     </w:p>
     <w:p>
@@ -15660,7 +16196,7 @@
         <w:jc w:val="both"/>
       </w:pPr>
       <w:r>
-        <w:t>The practical contribution is, first, a deployable principle — build elderly health-technology engagement around adaptive learning, the visible continuous improvement of the individual user — and second, its specification. LODF can be implemented on existing FRA infrastructure through participant-facing framing, trajectory visualisation, coaching protocols, adaptive challenge and additional telemetry. Existing hardware reduces capital requirements, but implementation still requires software validation, staff training, ethics and disclosure review, accessibility testing, data governance and longitudinal evaluation.</w:t>
+        <w:t>The practical contribution is, first, a deployable principle — build elderly health-technology engagement around adaptive learning, the visible continuous improvement of the individual user — and second, its specification. The adaptive-learning framework can be implemented on existing FRA infrastructure through participant-facing framing, trajectory visualisation, coaching protocols, adaptive challenge and additional telemetry. Existing hardware reduces capital requirements, but implementation still requires software validation, staff training, ethics and disclosure review, accessibility testing, data governance and longitudinal evaluation.</w:t>
       </w:r>
     </w:p>
     <w:p>
@@ -15758,7 +16294,7 @@
         <w:jc w:val="both"/>
       </w:pPr>
       <w:r>
-        <w:t>This extension also clarifies LODF Principle 3. Adaptive calibration can operate at two levels: adjustment of the game to observed performance and updating of a person-specific model from ethically collected signals. The Stage-2 implementation addressed the first only partially. The proposed second loop is a future system requirement to be tested against simpler baselines; it is not necessary to accept the main frame-sensitive result of the thesis.</w:t>
+        <w:t>This extension also clarifies the adaptive-learning framework Principle 3. Adaptive calibration can operate at two levels: adjustment of the game to observed performance and updating of a person-specific model from ethically collected signals. The Stage-2 implementation addressed the first only partially. The proposed second loop is a future system requirement to be tested against simpler baselines; it is not necessary to accept the main frame-sensitive result of the thesis.</w:t>
       </w:r>
     </w:p>
     <w:p>
@@ -16276,26 +16812,22 @@
         <w:jc w:val="center"/>
       </w:pPr>
       <w:r>
-        <w:rPr>
-          <w:noProof/>
-        </w:rPr>
         <w:drawing>
-          <wp:inline distT="0" distB="0" distL="0" distR="0" wp14:anchorId="1BFD3204" wp14:editId="5B74963F">
-            <wp:extent cx="5120640" cy="3136050"/>
-            <wp:effectExtent l="0" t="0" r="0" b="0"/>
-            <wp:docPr id="15" name="Picture 15"/>
+          <wp:inline xmlns:a="http://schemas.openxmlformats.org/drawingml/2006/main" xmlns:pic="http://schemas.openxmlformats.org/drawingml/2006/picture">
+            <wp:extent cx="5303520" cy="3010557"/>
+            <wp:docPr id="25" name="Picture 25"/>
             <wp:cNvGraphicFramePr>
-              <a:graphicFrameLocks xmlns:a="http://schemas.openxmlformats.org/drawingml/2006/main" noChangeAspect="1"/>
+              <a:graphicFrameLocks noChangeAspect="1"/>
             </wp:cNvGraphicFramePr>
-            <a:graphic xmlns:a="http://schemas.openxmlformats.org/drawingml/2006/main">
+            <a:graphic>
               <a:graphicData uri="http://schemas.openxmlformats.org/drawingml/2006/picture">
-                <pic:pic xmlns:pic="http://schemas.openxmlformats.org/drawingml/2006/picture">
+                <pic:pic>
                   <pic:nvPicPr>
                     <pic:cNvPr id="0" name="fig_9_2.png"/>
                     <pic:cNvPicPr/>
                   </pic:nvPicPr>
                   <pic:blipFill>
-                    <a:blip r:embed="rId21"/>
+                    <a:blip r:embed="rId34"/>
                     <a:stretch>
                       <a:fillRect/>
                     </a:stretch>
@@ -16303,11 +16835,9 @@
                   <pic:spPr>
                     <a:xfrm>
                       <a:off x="0" y="0"/>
-                      <a:ext cx="5120640" cy="3136050"/>
+                      <a:ext cx="5303520" cy="3010557"/>
                     </a:xfrm>
-                    <a:prstGeom prst="rect">
-                      <a:avLst/>
-                    </a:prstGeom>
+                    <a:prstGeom prst="rect"/>
                   </pic:spPr>
                 </pic:pic>
               </a:graphicData>
@@ -16398,7 +16928,7 @@
         <w:jc w:val="both"/>
       </w:pPr>
       <w:r>
-        <w:t>The limits are substantial and define the next programme. The empirical claims are restricted to a Southern Chinese residential cohort and a Hong Kong community cohort. The Stage-2-versus-Stage-3 comparison is not randomised and does not isolate framing from every concurrent difference. The proposed psychological mechanisms were not measured directly. FIAS requires a complete non-circular codebook, reliability testing and construct validation. The clinical significance of short-term FRA-index change is unknown. The complete LODF, dynamic-state architecture and person-conditioned AI extension have not been tested. Cross-cultural, cross-domain and long-term generalisation therefore remain open.</w:t>
+        <w:t>The limits are substantial and define the next programme. The empirical claims are restricted to a Southern Chinese residential cohort and a Hong Kong community cohort. The Stage-2-versus-Stage-3 comparison is not randomised and does not isolate framing from every concurrent difference. The proposed psychological mechanisms were not measured directly. FIAS requires a complete non-circular codebook, reliability testing and construct validation. The clinical significance of short-term FRA-index change is unknown. The complete adaptive-learning framework, dynamic-state architecture and person-conditioned AI extension have not been tested. Cross-cultural, cross-domain and long-term generalisation therefore remain open.</w:t>
       </w:r>
     </w:p>
     <w:p>
@@ -16416,7 +16946,7 @@
         <w:jc w:val="both"/>
       </w:pPr>
       <w:r>
-        <w:t>The highest-priority extension is a within-cohort randomised comparison of coupled and participant-facing decoupled conditions with harmonised recruitment, measures, staff scripts and follow-up. The second is longitudinal evaluation of repeated voluntary use. The third is direct measurement and validation of the proposed FIAS operators, including self-efficacy, identity relevance, appraisal and affect. The fourth is controlled testing of LODF components and the dynamic-state extension against simpler baselines. Cross-cultural replication, cross-domain application, community-narrative research and person-conditioned adaptive sensing should follow from a stronger causal and construct foundation.</w:t>
+        <w:t>The highest-priority extension is a within-cohort randomised comparison of coupled and participant-facing decoupled conditions with harmonised recruitment, measures, staff scripts and follow-up. The second is longitudinal evaluation of repeated voluntary use. The third is direct measurement and validation of the proposed FIAS operators, including self-efficacy, identity relevance, appraisal and affect. The fourth is controlled testing of the adaptive-learning framework components and the dynamic-state extension against simpler baselines. Cross-cultural replication, cross-domain application, community-narrative research and person-conditioned adaptive sensing should follow from a stronger causal and construct foundation.</w:t>
       </w:r>
     </w:p>
     <w:p>
@@ -16480,7 +17010,7 @@
         <w:jc w:val="both"/>
       </w:pPr>
       <w:r>
-        <w:t>The contribution is therefore a calibrated chain rather than one mechanism demonstrated at four scales, and the chain practises what it proposes: continuous improvement at the researcher's level (the action-research cycles), at the artefact's level (the AI-assisted build) and — as the design discovery for its users — at the level of the individual person. The survey identified a problem signature; Stage 2 characterised failure-associated non-return and the divergence between score change and return; Stage 3 provided convergent quasi-experimental evidence for a frame-sensitive account; LODF translated the evidence into an engineering framework; and the proposed adaptive-sensing extension identified the next system experiment. The thesis claims that the engagement problem is important, measurable and potentially modifiable on existing infrastructure. It does not claim that mental accounting has been verified, that decoupling alone is causal, or that the FRA programme resolves the limits of language-based intelligence.</w:t>
+        <w:t>The contribution is therefore a calibrated chain rather than one mechanism demonstrated at four scales, and the chain practises what it proposes: continuous improvement at the researcher's level (the action-research cycles), at the artefact's level (the AI-assisted build) and — as the design discovery for its users — at the level of the individual person. The survey identified a problem signature; Stage 2 characterised failure-associated non-return and the divergence between score change and return; Stage 3 provided convergent quasi-experimental evidence for a frame-sensitive account; the adaptive-learning framework translated the evidence into an engineering framework; and the proposed adaptive-sensing extension identified the next system experiment. The thesis claims that the engagement problem is important, measurable and potentially modifiable on existing infrastructure. It does not claim that mental accounting has been verified, that decoupling alone is causal, or that the FRA programme resolves the limits of language-based intelligence.</w:t>
       </w:r>
     </w:p>
     <w:p>
@@ -16503,6 +17033,7 @@
     <w:p>
       <w:pPr>
         <w:pStyle w:val="Heading1"/>
+        <w:pageBreakBefore/>
       </w:pPr>
       <w:r>
         <w:lastRenderedPageBreak/>
@@ -17312,6 +17843,7 @@
     <w:p>
       <w:pPr>
         <w:pStyle w:val="Heading1"/>
+        <w:pageBreakBefore/>
       </w:pPr>
       <w:bookmarkStart w:id="167" w:name="_Toc232024664"/>
       <w:r>
@@ -17749,18 +18281,17 @@
       <w:pPr>
         <w:pStyle w:val="Heading2"/>
       </w:pPr>
-      <w:r>
-        <w:lastRenderedPageBreak/>
-        <w:t>Appendix E · Five-Layer Architecture and LODF Reference Stack</w:t>
-      </w:r>
       <w:bookmarkEnd w:id="176"/>
-    </w:p>
-    <w:p>
-      <w:pPr>
-        <w:jc w:val="both"/>
-      </w:pPr>
-      <w:r>
-        <w:t>The Stage-2 deployment ran on a five-layer architecture that has been the operational platform for both the in-frame skiing game and the decoupled Stage-3 condition. The full LODF reference stack adds three further layers (L5 User-Facing Trajectory, L6 Staff Coaching Protocol, L7 LODF Telemetry) without altering the underlying signal path.</w:t>
+      <w:r>
+        <w:t>Appendix E · Five-Layer Architecture and Adaptive-Learning Reference Stack</w:t>
+      </w:r>
+    </w:p>
+    <w:p>
+      <w:pPr>
+        <w:jc w:val="both"/>
+      </w:pPr>
+      <w:r>
+        <w:t>The Stage-2 deployment ran on a five-layer architecture that has been the operational platform for both the in-frame skiing game and the decoupled Stage-3 condition. The full adaptive-learning reference stack adds three further layers (L5 User-Facing Trajectory, L6 Staff Coaching Protocol, L7 Adaptive-Learning Telemetry) without altering the underlying signal path.</w:t>
       </w:r>
     </w:p>
     <w:p>
@@ -17818,10 +18349,10 @@
         <w:pStyle w:val="Heading3"/>
       </w:pPr>
       <w:bookmarkStart w:id="178" w:name="_Toc232024675"/>
-      <w:r>
-        <w:t>E.2 · Layers L5–L7 (LODF Reference Stack)</w:t>
-      </w:r>
       <w:bookmarkEnd w:id="178"/>
+      <w:r>
+        <w:t>E.2 · Layers L5–L7 (Adaptive-Learning Reference Stack)</w:t>
+      </w:r>
     </w:p>
     <w:p>
       <w:pPr>
@@ -17844,7 +18375,7 @@
         <w:jc w:val="both"/>
       </w:pPr>
       <w:r>
-        <w:t>L7 · LODF Telemetry: Real-time monitoring of risk indicators (consecutive failures, abrupt session abandonment, post-failure latency to next attempt); fires coaching triggers and updates trajectory parameters.</w:t>
+        <w:t>L7 · Adaptive-Learning Telemetry: Real-time monitoring of risk indicators (consecutive failures, abrupt session abandonment, post-failure latency to next attempt); fires coaching triggers and updates trajectory parameters.</w:t>
       </w:r>
     </w:p>
     <w:p>
@@ -18148,10 +18679,8 @@
             <w:tcW w:w="2552" w:type="dxa"/>
           </w:tcPr>
           <w:p>
-            <w:r>
-              <w:rPr>
-                <w:sz w:val="20"/>
-              </w:rPr>
+            <w:r/>
+            <w:r>
               <w:t>LODF</w:t>
             </w:r>
           </w:p>

</xml_diff>

<commit_message>
Abstract rewritten: 776 -> 397 words, LODF removed
- Three tight paragraphs: problem + null hypothesis; the three-stage
  test with headline numbers; the three contributions (FIAS, boundary
  condition, adaptive learning) with the honesty clause
- LODF no longer in the Abstract - the framework appears only as 'an
  engineering design framework'; the acronym is now introduced in
  Chapter 1 and defined at 7.4 (4 total mentions document-wide)
- Keywords trimmed to eight

Co-Authored-By: Claude Fable 5 <noreply@anthropic.com>
Claude-Session: https://claude.ai/code/session_01KoT3i8geZspYBMMKVYJUTG
</commit_message>
<xml_diff>
--- a/docs/thesis/Tam_V10_EngD_Thesis_Final_Revision_Draft.docx
+++ b/docs/thesis/Tam_V10_EngD_Thesis_Final_Revision_Draft.docx
@@ -196,31 +196,31 @@
         <w:jc w:val="both"/>
       </w:pPr>
       <w:r>
-        <w:t>This thesis sits within the EngD programme topic Gamification as a Proactive Approach for Continuous Improvement and Innovation Enhancement. It asks why older adults abandon clinically valuable health technology, using Fall Risk Assessment (FRA) as the working case, and it is organised around a null hypothesis built honestly from the literature: that a gamified FRA satisfying the acceptance models (TAM, STAM) and the Octalysis motivational framework will be accepted and used, and that adverse first experiences will not produce lasting abandonment (H0, §2.3.5). The programme tests that hypothesis in the field, follows its rejection to a boundary condition for gamification theory, and arrives at a design discovery — adaptive learning — that connects the findings back to the programme topic: continuous improvement operating at the level of the individual user. The behavioural-economic mechanisms proposed along the way — mental accounting of health outcomes, identity-relevant endowment, loss aversion and stereotype threat — are treated as theoretically grounded inferences rather than as directly measured causal mechanisms.</w:t>
-      </w:r>
-    </w:p>
-    <w:p>
-      <w:pPr>
-        <w:jc w:val="both"/>
-      </w:pPr>
-      <w:r>
-        <w:t>Stage 1 used a face-to-face survey with 200 residents, interviewed from a resident population of 280 at a large elderly housing facility in Guangzhou. Thirty-nine per cent reported prior FRA use; among prior users, approximately 74% reported an adverse, unacceptable or unsuccessful first experience as operationalised in the study records, and approximately 82% reported no subsequent return. Because the reproduced six-item instrument does not by itself resolve every meaning of "failure", the Stage-1 result is interpreted as a descriptive association between an adverse first experience and self-reported non-return. Stage 2 prospectively examined the pattern in an eight-week action-research study with thirty residents using a dual-purpose AI-assisted skiing game on the InBody pressure panel. Within the archived Stage-2 dataset, twenty-one of thirty participants (70.0%) disengaged at or before three game cycles, eight after a single session, and no re-engagement was observed within the study window. Among the nine sustained participants the recorded FRA index changed by +6.9 points on average (paired dz = 2.22, 95% CI 0.95–3.46); across all thirty participants the paired change was +4.0 points (dz = 0.42, 95% CI 0.05–0.79). Because the archived dataset contains no session timestamps, no time-to-event model is fitted; earlier survival-analysis framings have been withdrawn. A Quality Function Deployment (QFD) pipeline translates the empirical findings into prioritised game-design requirements. Three of six F4-cluster participants showed positive change in the recorded FRA index during their single session and did not return, producing an objective-score-improvement/non-return paradox. Stage 3 used a separate Hong Kong community cohort of 120 adults aged 25-80 and implemented a participant-facing decoupling package: clinical terminology, pre-session clinical procedures and participant-facing clinical outputs were removed while the same broad hardware, skiing mechanic, five-attempt rule and session length were retained. Observed non-return was 6.7% overall and 13.3% in the 65-80 band. Among 23 initial dropouts, 15 (65.2%) returned voluntarily; in the age-matched 65-80 band, 10 of 16 (62.5%) returned. Coordination-challenge endorsement reached 71.7% and is interpreted primarily as a manipulation check, while regular-use intention reached 63.3% overall.</w:t>
-      </w:r>
-    </w:p>
-    <w:p>
-      <w:pPr>
-        <w:jc w:val="both"/>
-      </w:pPr>
-      <w:r>
-        <w:t>Taken together, the three stages support a scope law for gamification theory: the theory holds for older adults — the decoupled Stage-3 game was accepted at the levels the literature predicts, vindicating the acceptance and gamification stack for this population — until the gamified activity is attached to a purpose-based technology whose purpose, such as health assessment, strikes the identity-level value propositions of the user; at that boundary the theory fails, and FIAS names the mechanism of the failure. The between-cohort design supports rather than proves this account, and the 35.6-percentage-point gap between in-session retention (86.7%) and regular-use intention (51.1%) in the 65-80 band shows that decoupling alone is not sufficient: it removes what poisons engagement but supplies no reason to return, and the clinical purpose must eventually return to the experience. The programme's principal design discovery answers that residual problem: adaptive learning — challenge calibrated to the individual and failure reframed as information about a rising personal trajectory — as the behavioural-change driver that can re-attach clinical purpose safely. The Learning-Oriented Design Framework (LODF) is the engineering formalisation of that discovery, comprising identity disentanglement, trajectory installation and adaptive calibration; zero-failure presentation, an observation-driven inversion of Octalysis D8 made practical by AI-assisted development, supports it. The contributions are, in order: FIAS as the problem finding; the coupling boundary condition as the scope finding; adaptive learning as the design discovery, proposed for pre-specified prospective validation; and the methodological architecture (null hypothesis plus attribution stage, dual-purpose mechanic, QFD pipeline, AI-assisted action research) that produced them.</w:t>
-      </w:r>
-    </w:p>
-    <w:p>
-      <w:pPr>
-        <w:jc w:val="both"/>
-      </w:pPr>
-      <w:r>
-        <w:t>Keywords: Gamification; continuous improvement; innovation enhancement; Fall Risk Assessment; elderly technology adoption; failure-induced abandonment; loss aversion; endowment effect; mental accounting; information entropy; adaptive learning; Learning-Oriented Design Framework.</w:t>
+        <w:t>Older adults abandon clinically valuable health technology at high rates, and the established models do not explain why. This thesis investigates the problem through Fall Risk Assessment (FRA), within the EngD topic Gamification as a Proactive Approach for Continuous Improvement and Innovation Enhancement. From the technology-acceptance and gamification literatures (TAM, STAM, Octalysis) it builds a null hypothesis: a well-designed gamified FRA will be accepted by older users, and adverse first experiences will not produce lasting abandonment. Three field stages test that hypothesis and follow its rejection to the thesis's findings.</w:t>
+      </w:r>
+    </w:p>
+    <w:p>
+      <w:pPr>
+        <w:jc w:val="both"/>
+      </w:pPr>
+      <w:r>
+        <w:t>Stage 1, a survey of 200 residents interviewed from a population of 280 at a Guangzhou care facility, found the retrospective signal: most prior FRA users reported an adverse first experience and never returned. Stage 2 tested the hypothesis prospectively with thirty residents using an AI-assisted skiing game whose weight-shift control doubles as the clinical measurement. Despite a design satisfying every acceptance and gamification criterion, seventy per cent of participants disengaged at or before three game cycles, none re-engaged, and abandonment persisted even where recorded balance scores improved. Stage 3, the attribution experiment, offered the same game to a separate cohort of 120 Hong Kong adults with the clinical attachment removed: the decoupled game was accepted at the levels the gamification literature predicts — 93.3% retention, and 65.2% of initial dropouts returning voluntarily — acquitting the theory and the population, and convicting the coupling.</w:t>
+      </w:r>
+    </w:p>
+    <w:p>
+      <w:pPr>
+        <w:jc w:val="both"/>
+      </w:pPr>
+      <w:r>
+        <w:t>Three contributions follow. The problem finding is Failure-Induced Abandonment Syndrome (FIAS): a provisional, frame-sensitive behavioural construct structured by loss aversion, identity-relevant endowment, mental accounting and stereotype threat, proposed as candidate mechanisms rather than measured ones. The scope finding is a boundary condition for gamification theory: it holds for older adults until the gamified activity is attached to a purpose-based technology whose verdicts touch the user's identity-level concerns. The design discovery is adaptive learning — challenge calibrated to the individual, and failure reframed as information about a rising personal trajectory — continuous improvement operating at the level of the individual user, advanced as the behavioural-change driver that can safely re-attach clinical purpose and formalised as an engineering design framework for pre-specified prospective validation. The between-cohort evidence supports rather than proves this account, and nothing discovered in the data is presented as having been predicted in advance.</w:t>
+      </w:r>
+    </w:p>
+    <w:p>
+      <w:pPr>
+        <w:jc w:val="both"/>
+      </w:pPr>
+      <w:r>
+        <w:t>Keywords: gamification; continuous improvement; elderly technology adoption; Fall Risk Assessment; failure-induced abandonment; adaptive learning; behavioural economics; technology acceptance.</w:t>
       </w:r>
     </w:p>
     <w:p>

</xml_diff>